<commit_message>
refactor(HMS_Timer_Ngo_Thai_Binh): rename tick to pulse and apply P_ and PL_ naming conventions to parameters
</commit_message>
<xml_diff>
--- a/HMS_Timer_Ngo_Thai_Binh/docs/SPECIFICATION.docx
+++ b/HMS_Timer_Ngo_Thai_Binh/docs/SPECIFICATION.docx
@@ -466,7 +466,7 @@
         <w:t xml:space="preserve"> </w:t>
       </w:r>
       <w:r>
-        <w:t xml:space="preserve">(Multi-Stage Cascaded Prescaler 1MHz -&gt; 1kHz -&gt; 1Hz Tick Generator)</w:t>
+        <w:t xml:space="preserve">(Multi-Stage Cascaded Prescaler 1MHz -&gt; 1kHz -&gt; 1Hz Pulse Generator)</w:t>
       </w:r>
     </w:p>
     <w:p>
@@ -1119,7 +1119,7 @@
               <w:rPr>
                 <w:rStyle w:val="VerbatimChar"/>
               </w:rPr>
-              <w:t xml:space="preserve">tick_1khz</w:t>
+              <w:t xml:space="preserve">pulse_1khz</w:t>
             </w:r>
             <w:r>
               <w:t xml:space="preserve">,</w:t>
@@ -1131,7 +1131,7 @@
               <w:rPr>
                 <w:rStyle w:val="VerbatimChar"/>
               </w:rPr>
-              <w:t xml:space="preserve">sec_tick</w:t>
+              <w:t xml:space="preserve">sec_pulse</w:t>
             </w:r>
             <w:r>
               <w:t xml:space="preserve">,</w:t>
@@ -1963,7 +1963,7 @@
               <w:rPr>
                 <w:rStyle w:val="VerbatimChar"/>
               </w:rPr>
-              <w:t xml:space="preserve">tick_1khz</w:t>
+              <w:t xml:space="preserve">pulse_1khz</w:t>
             </w:r>
             <w:r>
               <w:t xml:space="preserve">, bộ đếm 5-bit (0 .. 17), cắt giảm 85% năng lượng.</w:t>
@@ -2117,7 +2117,7 @@
               <w:rPr>
                 <w:rStyle w:val="VerbatimChar"/>
               </w:rPr>
-              <w:t xml:space="preserve">sec_tick</w:t>
+              <w:t xml:space="preserve">sec_pulse</w:t>
             </w:r>
             <w:r>
               <w:t xml:space="preserve">.</w:t>
@@ -2464,7 +2464,7 @@
         <w:rPr>
           <w:rStyle w:val="VerbatimChar"/>
         </w:rPr>
-        <w:t xml:space="preserve">tick_1khz</w:t>
+        <w:t xml:space="preserve">pulse_1khz</w:t>
       </w:r>
       <w:r>
         <w:t xml:space="preserve">,</w:t>
@@ -2476,7 +2476,7 @@
         <w:rPr>
           <w:rStyle w:val="VerbatimChar"/>
         </w:rPr>
-        <w:t xml:space="preserve">sec_tick</w:t>
+        <w:t xml:space="preserve">sec_pulse</w:t>
       </w:r>
       <w:r>
         <w:t xml:space="preserve">,</w:t>
@@ -3139,7 +3139,7 @@
                 <w:b/>
                 <w:bCs/>
               </w:rPr>
-              <w:t xml:space="preserve">1 Hz (Kích hoạt theo sec_tick)</w:t>
+              <w:t xml:space="preserve">1 Hz (Kích hoạt theo sec_pulse)</w:t>
             </w:r>
           </w:p>
         </w:tc>
@@ -3688,7 +3688,7 @@
               <w:rPr>
                 <w:rStyle w:val="VerbatimChar"/>
               </w:rPr>
-              <w:t xml:space="preserve">CLK_FREQ_HZ</w:t>
+              <w:t xml:space="preserve">P_CLK_FREQ_HZ</w:t>
             </w:r>
           </w:p>
         </w:tc>
@@ -3804,7 +3804,7 @@
               <w:rPr>
                 <w:rStyle w:val="VerbatimChar"/>
               </w:rPr>
-              <w:t xml:space="preserve">TICK_1KHZ_FREQ_HZ</w:t>
+              <w:t xml:space="preserve">P_PULSE_1KHZ_FREQ_HZ</w:t>
             </w:r>
           </w:p>
         </w:tc>
@@ -3926,7 +3926,7 @@
               <w:rPr>
                 <w:rStyle w:val="VerbatimChar"/>
               </w:rPr>
-              <w:t xml:space="preserve">TICK_1HZ_FREQ_HZ</w:t>
+              <w:t xml:space="preserve">P_PULSE_1HZ_FREQ_HZ</w:t>
             </w:r>
           </w:p>
         </w:tc>
@@ -4042,7 +4042,7 @@
               <w:rPr>
                 <w:rStyle w:val="VerbatimChar"/>
               </w:rPr>
-              <w:t xml:space="preserve">DIV_1KHZ_MAX</w:t>
+              <w:t xml:space="preserve">P_DIV_1KHZ_MAX</w:t>
             </w:r>
           </w:p>
         </w:tc>
@@ -4146,7 +4146,7 @@
               <w:rPr>
                 <w:rStyle w:val="VerbatimChar"/>
               </w:rPr>
-              <w:t xml:space="preserve">DIV_1HZ_MAX</w:t>
+              <w:t xml:space="preserve">P_DIV_1HZ_MAX</w:t>
             </w:r>
           </w:p>
         </w:tc>
@@ -4250,7 +4250,7 @@
               <w:rPr>
                 <w:rStyle w:val="VerbatimChar"/>
               </w:rPr>
-              <w:t xml:space="preserve">DEBOUNCE_TICKS</w:t>
+              <w:t xml:space="preserve">P_DEBOUNCE_PULSES</w:t>
             </w:r>
           </w:p>
         </w:tc>
@@ -4378,7 +4378,7 @@
               <w:rPr>
                 <w:rStyle w:val="VerbatimChar"/>
               </w:rPr>
-              <w:t xml:space="preserve">DEBOUNCE_TOL_PCT</w:t>
+              <w:t xml:space="preserve">P_DEBOUNCE_TOL_PCT</w:t>
             </w:r>
           </w:p>
         </w:tc>
@@ -4506,7 +4506,7 @@
               <w:rPr>
                 <w:rStyle w:val="VerbatimChar"/>
               </w:rPr>
-              <w:t xml:space="preserve">TIMEOUT_SEC</w:t>
+              <w:t xml:space="preserve">P_TIMEOUT_SEC</w:t>
             </w:r>
           </w:p>
         </w:tc>
@@ -4622,7 +4622,7 @@
               <w:rPr>
                 <w:rStyle w:val="VerbatimChar"/>
               </w:rPr>
-              <w:t xml:space="preserve">SEC_WIDTH</w:t>
+              <w:t xml:space="preserve">P_SEC_WIDTH</w:t>
             </w:r>
           </w:p>
         </w:tc>
@@ -4762,7 +4762,7 @@
               <w:rPr>
                 <w:rStyle w:val="VerbatimChar"/>
               </w:rPr>
-              <w:t xml:space="preserve">MIN_WIDTH</w:t>
+              <w:t xml:space="preserve">P_MIN_WIDTH</w:t>
             </w:r>
           </w:p>
         </w:tc>
@@ -4902,7 +4902,7 @@
               <w:rPr>
                 <w:rStyle w:val="VerbatimChar"/>
               </w:rPr>
-              <w:t xml:space="preserve">HOUR_WIDTH</w:t>
+              <w:t xml:space="preserve">P_HOUR_WIDTH</w:t>
             </w:r>
           </w:p>
         </w:tc>
@@ -5040,7 +5040,7 @@
           <w:i/>
           <w:iCs/>
         </w:rPr>
-        <w:t xml:space="preserve">Ghi chú: Các giá trị tham số cấu hình cho phép linh hoạt điều chỉnh quy mô kiểm chứng mô phỏng mà không làm thay đổi bản chất hoạt động của mạch.</w:t>
+        <w:t xml:space="preserve">Ghi chú: Toàn bộ tham số module bắt buộc tuân thủ tiền tố P_ và hằng số nội bộ tuân thủ tiền tố PL_ theo chuẩn rtl_spec_architect.</w:t>
       </w:r>
     </w:p>
     <w:p>
@@ -6386,7 +6386,7 @@
         <w:rPr>
           <w:rStyle w:val="VerbatimChar"/>
         </w:rPr>
-        <w:t xml:space="preserve">tick_1khz</w:t>
+        <w:t xml:space="preserve">pulse_1khz</w:t>
       </w:r>
       <w:r>
         <w:t xml:space="preserve"> </w:t>
@@ -6434,7 +6434,7 @@
         <w:rPr>
           <w:rStyle w:val="VerbatimChar"/>
         </w:rPr>
-        <w:t xml:space="preserve">sec_tick</w:t>
+        <w:t xml:space="preserve">sec_pulse</w:t>
       </w:r>
       <w:r>
         <w:t xml:space="preserve"> </w:t>
@@ -7475,7 +7475,7 @@
               <w:rPr>
                 <w:rStyle w:val="VerbatimChar"/>
               </w:rPr>
-              <w:t xml:space="preserve">tick_1khz</w:t>
+              <w:t xml:space="preserve">pulse_1khz</w:t>
             </w:r>
           </w:p>
         </w:tc>
@@ -7546,7 +7546,7 @@
               <w:rPr>
                 <w:rStyle w:val="VerbatimChar"/>
               </w:rPr>
-              <w:t xml:space="preserve">sec_tick</w:t>
+              <w:t xml:space="preserve">sec_pulse</w:t>
             </w:r>
           </w:p>
         </w:tc>
@@ -8569,7 +8569,7 @@
               <w:rPr>
                 <w:rStyle w:val="VerbatimChar"/>
               </w:rPr>
-              <w:t xml:space="preserve">s_cnt == 59 &amp; sec_tick &amp; ~load_en</w:t>
+              <w:t xml:space="preserve">s_cnt == 59 &amp; sec_pulse &amp; ~load_en</w:t>
             </w:r>
           </w:p>
         </w:tc>
@@ -8771,7 +8771,7 @@
         <w:pStyle w:val="FirstParagraph"/>
       </w:pPr>
       <w:r>
-        <w:t xml:space="preserve">Giản đồ thời gian minh họa bộ lọc nhiễu rung phím 20 ms ±10% (18 ticks @ 1 kHz) và cơ chế tự động phát xung lặp lại (Auto-Repeat) khi giữ phím:</w:t>
+        <w:t xml:space="preserve">Giản đồ thời gian minh họa bộ lọc nhiễu rung phím 20 ms ±10% (18 pulses @ 1 kHz) và cơ chế tự động phát xung lặp lại (Auto-Repeat) khi giữ phím:</w:t>
       </w:r>
     </w:p>
     <w:p>
@@ -9871,7 +9871,7 @@
         <w:rPr>
           <w:rStyle w:val="VerbatimChar"/>
         </w:rPr>
-        <w:t xml:space="preserve">tick_1khz</w:t>
+        <w:t xml:space="preserve">pulse_1khz</w:t>
       </w:r>
       <w:r>
         <w:t xml:space="preserve">) và xung chuẩn thời gian thực 1 Hz (</w:t>
@@ -9880,7 +9880,7 @@
         <w:rPr>
           <w:rStyle w:val="VerbatimChar"/>
         </w:rPr>
-        <w:t xml:space="preserve">sec_tick</w:t>
+        <w:t xml:space="preserve">sec_pulse</w:t>
       </w:r>
       <w:r>
         <w:t xml:space="preserve">). Toàn bộ các ngõ ra là các xung đơn chu kỳ 1 MHz (1 µs) đóng vai trò Clock Enable cho toàn hệ thống.</w:t>
@@ -10336,7 +10336,7 @@
               <w:rPr>
                 <w:rStyle w:val="VerbatimChar"/>
               </w:rPr>
-              <w:t xml:space="preserve">tick_1khz</w:t>
+              <w:t xml:space="preserve">pulse_1khz</w:t>
             </w:r>
           </w:p>
         </w:tc>
@@ -10423,7 +10423,7 @@
               <w:jc w:val="left"/>
             </w:pPr>
             <w:r>
-              <w:t xml:space="preserve">Tầng 1 đạt 999</w:t>
+              <w:t xml:space="preserve">Tầng 1 đạt P_DIV_1KHZ_MAX</w:t>
             </w:r>
           </w:p>
         </w:tc>
@@ -10455,7 +10455,7 @@
               <w:rPr>
                 <w:rStyle w:val="VerbatimChar"/>
               </w:rPr>
-              <w:t xml:space="preserve">sec_tick</w:t>
+              <w:t xml:space="preserve">sec_pulse</w:t>
             </w:r>
           </w:p>
         </w:tc>
@@ -10542,7 +10542,7 @@
               <w:jc w:val="left"/>
             </w:pPr>
             <w:r>
-              <w:t xml:space="preserve">Tầng 2 đạt 999 &amp; tick_1khz</w:t>
+              <w:t xml:space="preserve">Tầng 2 đạt P_DIV_1HZ_MAX &amp; pulse_1khz</w:t>
             </w:r>
           </w:p>
         </w:tc>
@@ -10572,7 +10572,7 @@
           <w:i/>
           <w:iCs/>
         </w:rPr>
-        <w:t xml:space="preserve">Ghi chú: Tín hiệu tick_1khz và sec_tick là các xung active-high có độ rộng đúng 1 chu kỳ clock 1 MHz, hoàn toàn đồng bộ với miền clock gốc.</w:t>
+        <w:t xml:space="preserve">Ghi chú: Tín hiệu pulse_1khz và sec_pulse là các xung active-high có độ rộng đúng 1 chu kỳ clock 1 MHz, hoàn toàn đồng bộ với miền clock gốc.</w:t>
       </w:r>
     </w:p>
     <w:bookmarkEnd w:id="57"/>
@@ -10598,22 +10598,19 @@
           <w:b/>
           <w:bCs/>
         </w:rPr>
-        <w:t xml:space="preserve">Tầng 1 (1 MHz -&gt; 1 kHz):</w:t>
-      </w:r>
-      <w:r>
-        <w:t xml:space="preserve"> </w:t>
-      </w:r>
-      <w:r>
-        <w:t xml:space="preserve">Sử dụng bộ đếm 10-bit (</w:t>
+        <w:t xml:space="preserve">Tham số cấu hình:</w:t>
+      </w:r>
+      <w:r>
+        <w:t xml:space="preserve"> </w:t>
       </w:r>
       <w:r>
         <w:rPr>
           <w:rStyle w:val="VerbatimChar"/>
         </w:rPr>
-        <w:t xml:space="preserve">r_cnt_1khz</w:t>
-      </w:r>
-      <w:r>
-        <w:t xml:space="preserve">) đếm tuần hoàn từ 0 đến 999 theo từng sườn dương của</w:t>
+        <w:t xml:space="preserve">P_CLK_FREQ_HZ = 1_000_000</w:t>
+      </w:r>
+      <w:r>
+        <w:t xml:space="preserve">,</w:t>
       </w:r>
       <w:r>
         <w:t xml:space="preserve"> </w:t>
@@ -10622,13 +10619,10 @@
         <w:rPr>
           <w:rStyle w:val="VerbatimChar"/>
         </w:rPr>
-        <w:t xml:space="preserve">clk</w:t>
-      </w:r>
-      <w:r>
-        <w:t xml:space="preserve"> </w:t>
-      </w:r>
-      <w:r>
-        <w:t xml:space="preserve">(1 MHz). Khi</w:t>
+        <w:t xml:space="preserve">P_PULSE_1KHZ_FREQ_HZ = 1_000</w:t>
+      </w:r>
+      <w:r>
+        <w:t xml:space="preserve">,</w:t>
       </w:r>
       <w:r>
         <w:t xml:space="preserve"> </w:t>
@@ -10637,10 +10631,10 @@
         <w:rPr>
           <w:rStyle w:val="VerbatimChar"/>
         </w:rPr>
-        <w:t xml:space="preserve">r_cnt_1khz == 999</w:t>
-      </w:r>
-      <w:r>
-        <w:t xml:space="preserve">, mạch tạo xung</w:t>
+        <w:t xml:space="preserve">P_PULSE_1HZ_FREQ_HZ = 1</w:t>
+      </w:r>
+      <w:r>
+        <w:t xml:space="preserve">,</w:t>
       </w:r>
       <w:r>
         <w:t xml:space="preserve"> </w:t>
@@ -10649,13 +10643,46 @@
         <w:rPr>
           <w:rStyle w:val="VerbatimChar"/>
         </w:rPr>
-        <w:t xml:space="preserve">tick_1khz = 1</w:t>
-      </w:r>
-      <w:r>
-        <w:t xml:space="preserve"> </w:t>
-      </w:r>
-      <w:r>
-        <w:t xml:space="preserve">trong đúng 1 chu kỳ clock.</w:t>
+        <w:t xml:space="preserve">P_DIV_1KHZ_MAX = 999</w:t>
+      </w:r>
+      <w:r>
+        <w:t xml:space="preserve">,</w:t>
+      </w:r>
+      <w:r>
+        <w:t xml:space="preserve"> </w:t>
+      </w:r>
+      <w:r>
+        <w:rPr>
+          <w:rStyle w:val="VerbatimChar"/>
+        </w:rPr>
+        <w:t xml:space="preserve">P_DIV_1HZ_MAX = 999</w:t>
+      </w:r>
+      <w:r>
+        <w:t xml:space="preserve">,</w:t>
+      </w:r>
+      <w:r>
+        <w:t xml:space="preserve"> </w:t>
+      </w:r>
+      <w:r>
+        <w:rPr>
+          <w:rStyle w:val="VerbatimChar"/>
+        </w:rPr>
+        <w:t xml:space="preserve">P_CNT_1KHZ_WIDTH = 10</w:t>
+      </w:r>
+      <w:r>
+        <w:t xml:space="preserve">,</w:t>
+      </w:r>
+      <w:r>
+        <w:t xml:space="preserve"> </w:t>
+      </w:r>
+      <w:r>
+        <w:rPr>
+          <w:rStyle w:val="VerbatimChar"/>
+        </w:rPr>
+        <w:t xml:space="preserve">P_CNT_1HZ_WIDTH = 10</w:t>
+      </w:r>
+      <w:r>
+        <w:t xml:space="preserve">.</w:t>
       </w:r>
     </w:p>
     <w:p>
@@ -10671,7 +10698,7 @@
           <w:b/>
           <w:bCs/>
         </w:rPr>
-        <w:t xml:space="preserve">Tầng 2 (1 kHz -&gt; 1 Hz):</w:t>
+        <w:t xml:space="preserve">Tầng 1 (1 MHz -&gt; 1 kHz):</w:t>
       </w:r>
       <w:r>
         <w:t xml:space="preserve"> </w:t>
@@ -10683,10 +10710,10 @@
         <w:rPr>
           <w:rStyle w:val="VerbatimChar"/>
         </w:rPr>
-        <w:t xml:space="preserve">r_cnt_1hz</w:t>
-      </w:r>
-      <w:r>
-        <w:t xml:space="preserve">) chạy trên</w:t>
+        <w:t xml:space="preserve">r_cnt_1khz</w:t>
+      </w:r>
+      <w:r>
+        <w:t xml:space="preserve">) đếm tuần hoàn từ 0 đến</w:t>
       </w:r>
       <w:r>
         <w:t xml:space="preserve"> </w:t>
@@ -10695,13 +10722,28 @@
         <w:rPr>
           <w:rStyle w:val="VerbatimChar"/>
         </w:rPr>
+        <w:t xml:space="preserve">P_DIV_1KHZ_MAX</w:t>
+      </w:r>
+      <w:r>
+        <w:t xml:space="preserve"> </w:t>
+      </w:r>
+      <w:r>
+        <w:t xml:space="preserve">(999) theo từng sườn dương của</w:t>
+      </w:r>
+      <w:r>
+        <w:t xml:space="preserve"> </w:t>
+      </w:r>
+      <w:r>
+        <w:rPr>
+          <w:rStyle w:val="VerbatimChar"/>
+        </w:rPr>
         <w:t xml:space="preserve">clk</w:t>
       </w:r>
       <w:r>
         <w:t xml:space="preserve"> </w:t>
       </w:r>
       <w:r>
-        <w:t xml:space="preserve">nhưng chỉ tăng giá trị khi có</w:t>
+        <w:t xml:space="preserve">(1 MHz). Khi</w:t>
       </w:r>
       <w:r>
         <w:t xml:space="preserve"> </w:t>
@@ -10710,10 +10752,10 @@
         <w:rPr>
           <w:rStyle w:val="VerbatimChar"/>
         </w:rPr>
-        <w:t xml:space="preserve">tick_1khz == 1</w:t>
-      </w:r>
-      <w:r>
-        <w:t xml:space="preserve">. Khi</w:t>
+        <w:t xml:space="preserve">r_cnt_1khz == 999</w:t>
+      </w:r>
+      <w:r>
+        <w:t xml:space="preserve">, mạch tạo xung</w:t>
       </w:r>
       <w:r>
         <w:t xml:space="preserve"> </w:t>
@@ -10722,40 +10764,13 @@
         <w:rPr>
           <w:rStyle w:val="VerbatimChar"/>
         </w:rPr>
-        <w:t xml:space="preserve">r_cnt_1hz == 999</w:t>
-      </w:r>
-      <w:r>
-        <w:t xml:space="preserve"> </w:t>
-      </w:r>
-      <w:r>
-        <w:t xml:space="preserve">đồng thời có</w:t>
-      </w:r>
-      <w:r>
-        <w:t xml:space="preserve"> </w:t>
-      </w:r>
-      <w:r>
-        <w:rPr>
-          <w:rStyle w:val="VerbatimChar"/>
-        </w:rPr>
-        <w:t xml:space="preserve">tick_1khz == 1</w:t>
-      </w:r>
-      <w:r>
-        <w:t xml:space="preserve">, mạch phát xung chuẩn thời gian thực</w:t>
-      </w:r>
-      <w:r>
-        <w:t xml:space="preserve"> </w:t>
-      </w:r>
-      <w:r>
-        <w:rPr>
-          <w:rStyle w:val="VerbatimChar"/>
-        </w:rPr>
-        <w:t xml:space="preserve">sec_tick = 1</w:t>
-      </w:r>
-      <w:r>
-        <w:t xml:space="preserve"> </w:t>
-      </w:r>
-      <w:r>
-        <w:t xml:space="preserve">độ rộng đúng 1 chu kỳ clock 1 MHz.</w:t>
+        <w:t xml:space="preserve">pulse_1khz = 1</w:t>
+      </w:r>
+      <w:r>
+        <w:t xml:space="preserve"> </w:t>
+      </w:r>
+      <w:r>
+        <w:t xml:space="preserve">trong đúng 1 chu kỳ clock.</w:t>
       </w:r>
     </w:p>
     <w:p>
@@ -10771,6 +10786,106 @@
           <w:b/>
           <w:bCs/>
         </w:rPr>
+        <w:t xml:space="preserve">Tầng 2 (1 kHz -&gt; 1 Hz):</w:t>
+      </w:r>
+      <w:r>
+        <w:t xml:space="preserve"> </w:t>
+      </w:r>
+      <w:r>
+        <w:t xml:space="preserve">Sử dụng bộ đếm 10-bit (</w:t>
+      </w:r>
+      <w:r>
+        <w:rPr>
+          <w:rStyle w:val="VerbatimChar"/>
+        </w:rPr>
+        <w:t xml:space="preserve">r_cnt_1hz</w:t>
+      </w:r>
+      <w:r>
+        <w:t xml:space="preserve">) chạy trên</w:t>
+      </w:r>
+      <w:r>
+        <w:t xml:space="preserve"> </w:t>
+      </w:r>
+      <w:r>
+        <w:rPr>
+          <w:rStyle w:val="VerbatimChar"/>
+        </w:rPr>
+        <w:t xml:space="preserve">clk</w:t>
+      </w:r>
+      <w:r>
+        <w:t xml:space="preserve"> </w:t>
+      </w:r>
+      <w:r>
+        <w:t xml:space="preserve">nhưng chỉ tăng giá trị khi có</w:t>
+      </w:r>
+      <w:r>
+        <w:t xml:space="preserve"> </w:t>
+      </w:r>
+      <w:r>
+        <w:rPr>
+          <w:rStyle w:val="VerbatimChar"/>
+        </w:rPr>
+        <w:t xml:space="preserve">pulse_1khz == 1</w:t>
+      </w:r>
+      <w:r>
+        <w:t xml:space="preserve">. Khi</w:t>
+      </w:r>
+      <w:r>
+        <w:t xml:space="preserve"> </w:t>
+      </w:r>
+      <w:r>
+        <w:rPr>
+          <w:rStyle w:val="VerbatimChar"/>
+        </w:rPr>
+        <w:t xml:space="preserve">r_cnt_1hz == 999</w:t>
+      </w:r>
+      <w:r>
+        <w:t xml:space="preserve"> </w:t>
+      </w:r>
+      <w:r>
+        <w:t xml:space="preserve">đồng thời có</w:t>
+      </w:r>
+      <w:r>
+        <w:t xml:space="preserve"> </w:t>
+      </w:r>
+      <w:r>
+        <w:rPr>
+          <w:rStyle w:val="VerbatimChar"/>
+        </w:rPr>
+        <w:t xml:space="preserve">pulse_1khz == 1</w:t>
+      </w:r>
+      <w:r>
+        <w:t xml:space="preserve">, mạch phát xung chuẩn thời gian thực</w:t>
+      </w:r>
+      <w:r>
+        <w:t xml:space="preserve"> </w:t>
+      </w:r>
+      <w:r>
+        <w:rPr>
+          <w:rStyle w:val="VerbatimChar"/>
+        </w:rPr>
+        <w:t xml:space="preserve">sec_pulse = 1</w:t>
+      </w:r>
+      <w:r>
+        <w:t xml:space="preserve"> </w:t>
+      </w:r>
+      <w:r>
+        <w:t xml:space="preserve">độ rộng đúng 1 chu kỳ clock 1 MHz.</w:t>
+      </w:r>
+    </w:p>
+    <w:p>
+      <w:pPr>
+        <w:pStyle w:val="Compact"/>
+        <w:numPr>
+          <w:ilvl w:val="0"/>
+          <w:numId w:val="1021"/>
+        </w:numPr>
+      </w:pPr>
+      <w:r>
+        <w:rPr>
+          <w:b/>
+          <w:bCs/>
+        </w:rPr>
         <w:t xml:space="preserve">Tối ưu PPA:</w:t>
       </w:r>
       <w:r>
@@ -10804,7 +10919,7 @@
         <w:rPr>
           <w:rStyle w:val="VerbatimChar"/>
         </w:rPr>
-        <w:t xml:space="preserve">tick_1khz</w:t>
+        <w:t xml:space="preserve">pulse_1khz</w:t>
       </w:r>
       <w:r>
         <w:t xml:space="preserve"> </w:t>
@@ -10819,7 +10934,7 @@
         <w:rPr>
           <w:rStyle w:val="VerbatimChar"/>
         </w:rPr>
-        <w:t xml:space="preserve">sec_tick</w:t>
+        <w:t xml:space="preserve">sec_pulse</w:t>
       </w:r>
       <w:r>
         <w:t xml:space="preserve">:</w:t>
@@ -10834,7 +10949,7 @@
           <wp:inline>
             <wp:extent cx="5334000" cy="1338942"/>
             <wp:effectExtent b="0" l="0" r="0" t="0"/>
-            <wp:docPr descr="Hình 3.2.4: Giản đồ xung phân tần 1MHz ra 1kHz sample_tick và 1Hz sec_tick (WaveDrom)" title="" id="60" name="Picture"/>
+            <wp:docPr descr="Hình 3.2.4: Giản đồ xung phân tần 1MHz ra 1kHz pulse_1khz và 1Hz sec_pulse (WaveDrom)" title="" id="60" name="Picture"/>
             <a:graphic>
               <a:graphicData uri="http://schemas.openxmlformats.org/drawingml/2006/picture">
                 <pic:pic>
@@ -10877,7 +10992,7 @@
         <w:pStyle w:val="ImageCaption"/>
       </w:pPr>
       <w:r>
-        <w:t xml:space="preserve">Hình 3.2.4: Giản đồ xung phân tần 1MHz ra 1kHz sample_tick và 1Hz sec_tick (WaveDrom)</w:t>
+        <w:t xml:space="preserve">Hình 3.2.4: Giản đồ xung phân tần 1MHz ra 1kHz pulse_1khz và 1Hz sec_pulse (WaveDrom)</w:t>
       </w:r>
     </w:p>
     <w:p>
@@ -10943,7 +11058,7 @@
         <w:rPr>
           <w:rStyle w:val="VerbatimChar"/>
         </w:rPr>
-        <w:t xml:space="preserve">tick_1khz</w:t>
+        <w:t xml:space="preserve">pulse_1khz</w:t>
       </w:r>
       <w:r>
         <w:t xml:space="preserve">), áp dụng dải dung sai thời gian danh định 20 ms ±10% (18 ms .. 22 ms) và tự động phát xung tuần hoàn khi giữ phím (Auto-Repeat).</w:t>
@@ -11465,7 +11580,7 @@
               <w:rPr>
                 <w:rStyle w:val="VerbatimChar"/>
               </w:rPr>
-              <w:t xml:space="preserve">tick_1khz</w:t>
+              <w:t xml:space="preserve">pulse_1khz</w:t>
             </w:r>
             <w:r>
               <w:t xml:space="preserve">) từ prescaler</w:t>
@@ -11759,13 +11874,13 @@
           <w:b/>
           <w:bCs/>
         </w:rPr>
-        <w:t xml:space="preserve">Đồng bộ hóa 2 tầng:</w:t>
-      </w:r>
-      <w:r>
-        <w:t xml:space="preserve"> </w:t>
-      </w:r>
-      <w:r>
-        <w:t xml:space="preserve">Tín hiệu nút bấm bất đồng bộ</w:t>
+        <w:t xml:space="preserve">Tham số &amp; Hằng số:</w:t>
+      </w:r>
+      <w:r>
+        <w:t xml:space="preserve"> </w:t>
+      </w:r>
+      <w:r>
+        <w:t xml:space="preserve">Tham số cấu hình</w:t>
       </w:r>
       <w:r>
         <w:t xml:space="preserve"> </w:t>
@@ -11774,13 +11889,10 @@
         <w:rPr>
           <w:rStyle w:val="VerbatimChar"/>
         </w:rPr>
-        <w:t xml:space="preserve">btn_in</w:t>
-      </w:r>
-      <w:r>
-        <w:t xml:space="preserve"> </w:t>
-      </w:r>
-      <w:r>
-        <w:t xml:space="preserve">đi qua 2 tầng Flip-Flop được lấy mẫu ở mỗi xung</w:t>
+        <w:t xml:space="preserve">P_DEBOUNCE_PULSES = 20</w:t>
+      </w:r>
+      <w:r>
+        <w:t xml:space="preserve">,</w:t>
       </w:r>
       <w:r>
         <w:t xml:space="preserve"> </w:t>
@@ -11789,13 +11901,46 @@
         <w:rPr>
           <w:rStyle w:val="VerbatimChar"/>
         </w:rPr>
-        <w:t xml:space="preserve">clk_en</w:t>
-      </w:r>
-      <w:r>
-        <w:t xml:space="preserve"> </w:t>
-      </w:r>
-      <w:r>
-        <w:t xml:space="preserve">để chống hiện tượng bất ổn định (Metastability).</w:t>
+        <w:t xml:space="preserve">P_DEBOUNCE_TOL_PCT = 10</w:t>
+      </w:r>
+      <w:r>
+        <w:t xml:space="preserve">. Hằng số cục bộ</w:t>
+      </w:r>
+      <w:r>
+        <w:t xml:space="preserve"> </w:t>
+      </w:r>
+      <w:r>
+        <w:rPr>
+          <w:rStyle w:val="VerbatimChar"/>
+        </w:rPr>
+        <w:t xml:space="preserve">PL_DEBOUNCE_MIN_PULSES = 18</w:t>
+      </w:r>
+      <w:r>
+        <w:t xml:space="preserve">,</w:t>
+      </w:r>
+      <w:r>
+        <w:t xml:space="preserve"> </w:t>
+      </w:r>
+      <w:r>
+        <w:rPr>
+          <w:rStyle w:val="VerbatimChar"/>
+        </w:rPr>
+        <w:t xml:space="preserve">PL_EFFECTIVE_PULSES = 18</w:t>
+      </w:r>
+      <w:r>
+        <w:t xml:space="preserve">,</w:t>
+      </w:r>
+      <w:r>
+        <w:t xml:space="preserve"> </w:t>
+      </w:r>
+      <w:r>
+        <w:rPr>
+          <w:rStyle w:val="VerbatimChar"/>
+        </w:rPr>
+        <w:t xml:space="preserve">PL_CNT_WIDTH = 5</w:t>
+      </w:r>
+      <w:r>
+        <w:t xml:space="preserve">.</w:t>
       </w:r>
     </w:p>
     <w:p>
@@ -11811,13 +11956,13 @@
           <w:b/>
           <w:bCs/>
         </w:rPr>
-        <w:t xml:space="preserve">Ngưỡng dung sai ±10%:</w:t>
-      </w:r>
-      <w:r>
-        <w:t xml:space="preserve"> </w:t>
-      </w:r>
-      <w:r>
-        <w:t xml:space="preserve">Với chu kỳ 20 ms tại tần số lấy mẫu 1 kHz, số tick danh định là 20 ticks. Dải dung sai ±10% cho phép nhận diện phím hợp lệ từ 18 ticks:</w:t>
+        <w:t xml:space="preserve">Đồng bộ hóa 2 tầng:</w:t>
+      </w:r>
+      <w:r>
+        <w:t xml:space="preserve"> </w:t>
+      </w:r>
+      <w:r>
+        <w:t xml:space="preserve">Tín hiệu nút bấm bất đồng bộ</w:t>
       </w:r>
       <w:r>
         <w:t xml:space="preserve"> </w:t>
@@ -11826,7 +11971,28 @@
         <w:rPr>
           <w:rStyle w:val="VerbatimChar"/>
         </w:rPr>
-        <w:t xml:space="preserve">EFFECTIVE_TICKS = 20 - floor(20 * 0.10) = 18 ticks (18 ms)</w:t>
+        <w:t xml:space="preserve">btn_in</w:t>
+      </w:r>
+      <w:r>
+        <w:t xml:space="preserve"> </w:t>
+      </w:r>
+      <w:r>
+        <w:t xml:space="preserve">đi qua 2 tầng Flip-Flop được lấy mẫu ở mỗi xung</w:t>
+      </w:r>
+      <w:r>
+        <w:t xml:space="preserve"> </w:t>
+      </w:r>
+      <w:r>
+        <w:rPr>
+          <w:rStyle w:val="VerbatimChar"/>
+        </w:rPr>
+        <w:t xml:space="preserve">clk_en</w:t>
+      </w:r>
+      <w:r>
+        <w:t xml:space="preserve"> </w:t>
+      </w:r>
+      <w:r>
+        <w:t xml:space="preserve">để chống hiện tượng bất ổn định (Metastability).</w:t>
       </w:r>
     </w:p>
     <w:p>
@@ -11842,13 +12008,22 @@
           <w:b/>
           <w:bCs/>
         </w:rPr>
-        <w:t xml:space="preserve">Loại bỏ nhiễu rung (&lt; 18 ms):</w:t>
-      </w:r>
-      <w:r>
-        <w:t xml:space="preserve"> </w:t>
-      </w:r>
-      <w:r>
-        <w:t xml:space="preserve">Nếu phím bị nhả trước khi bộ đếm 5-bit đạt 17 (đếm từ 0 .. 17 là 18 ticks), bộ đếm lập tức bị xóa về 0, không phát xung.</w:t>
+        <w:t xml:space="preserve">Ngưỡng dung sai ±10%:</w:t>
+      </w:r>
+      <w:r>
+        <w:t xml:space="preserve"> </w:t>
+      </w:r>
+      <w:r>
+        <w:t xml:space="preserve">Với chu kỳ 20 ms tại tần số lấy mẫu 1 kHz, số chu kỳ danh định là 20 pulses. Dải dung sai ±10% cho phép nhận diện phím hợp lệ từ 18 pulses:</w:t>
+      </w:r>
+      <w:r>
+        <w:t xml:space="preserve"> </w:t>
+      </w:r>
+      <w:r>
+        <w:rPr>
+          <w:rStyle w:val="VerbatimChar"/>
+        </w:rPr>
+        <w:t xml:space="preserve">PL_EFFECTIVE_PULSES = P_DEBOUNCE_PULSES - floor(P_DEBOUNCE_PULSES * P_DEBOUNCE_TOL_PCT / 100) = 18 pulses (18 ms)</w:t>
       </w:r>
     </w:p>
     <w:p>
@@ -11864,6 +12039,28 @@
           <w:b/>
           <w:bCs/>
         </w:rPr>
+        <w:t xml:space="preserve">Loại bỏ nhiễu rung (&lt; 18 ms):</w:t>
+      </w:r>
+      <w:r>
+        <w:t xml:space="preserve"> </w:t>
+      </w:r>
+      <w:r>
+        <w:t xml:space="preserve">Nếu phím bị nhả trước khi bộ đếm 5-bit đạt 17 (đếm từ 0 .. 17 là 18 pulses), bộ đếm lập tức bị xóa về 0, không phát xung.</w:t>
+      </w:r>
+    </w:p>
+    <w:p>
+      <w:pPr>
+        <w:pStyle w:val="Compact"/>
+        <w:numPr>
+          <w:ilvl w:val="0"/>
+          <w:numId w:val="1022"/>
+        </w:numPr>
+      </w:pPr>
+      <w:r>
+        <w:rPr>
+          <w:b/>
+          <w:bCs/>
+        </w:rPr>
         <w:t xml:space="preserve">Auto-Repeat (&gt;= 18 ms):</w:t>
       </w:r>
       <w:r>
@@ -11885,7 +12082,7 @@
         <w:t xml:space="preserve"> </w:t>
       </w:r>
       <w:r>
-        <w:t xml:space="preserve">độ rộng đúng 1 chu kỳ clock 1 MHz. Nếu người dùng tiếp tục giữ phím, bộ đếm tự động reset về 0 và tiếp tục đếm lại 18 ticks để phát xung lặp lại tuần hoàn đều đặn.</w:t>
+        <w:t xml:space="preserve">độ rộng đúng 1 chu kỳ clock 1 MHz. Nếu người dùng tiếp tục giữ phím, bộ đếm tự động reset về 0 và tiếp tục đếm lại 18 pulses để phát xung lặp lại tuần hoàn đều đặn.</w:t>
       </w:r>
     </w:p>
     <w:bookmarkEnd w:id="69"/>
@@ -12060,7 +12257,7 @@
         <w:rPr>
           <w:rStyle w:val="VerbatimChar"/>
         </w:rPr>
-        <w:t xml:space="preserve">tick_1khz</w:t>
+        <w:t xml:space="preserve">pulse_1khz</w:t>
       </w:r>
       <w:r>
         <w:t xml:space="preserve"> </w:t>
@@ -12519,7 +12716,7 @@
               <w:rPr>
                 <w:rStyle w:val="VerbatimChar"/>
               </w:rPr>
-              <w:t xml:space="preserve">tick_1khz</w:t>
+              <w:t xml:space="preserve">pulse_1khz</w:t>
             </w:r>
           </w:p>
         </w:tc>
@@ -13301,6 +13498,46 @@
       </w:pPr>
       <w:r>
         <w:t xml:space="preserve">3.4.3 Nguyên lý hoạt động (Operating Principle)</w:t>
+      </w:r>
+    </w:p>
+    <w:p>
+      <w:pPr>
+        <w:pStyle w:val="Compact"/>
+        <w:numPr>
+          <w:ilvl w:val="0"/>
+          <w:numId w:val="1023"/>
+        </w:numPr>
+      </w:pPr>
+      <w:r>
+        <w:rPr>
+          <w:b/>
+          <w:bCs/>
+        </w:rPr>
+        <w:t xml:space="preserve">Tham số cấu hình:</w:t>
+      </w:r>
+      <w:r>
+        <w:t xml:space="preserve"> </w:t>
+      </w:r>
+      <w:r>
+        <w:rPr>
+          <w:rStyle w:val="VerbatimChar"/>
+        </w:rPr>
+        <w:t xml:space="preserve">P_DEBOUNCE_PULSES = 20</w:t>
+      </w:r>
+      <w:r>
+        <w:t xml:space="preserve">,</w:t>
+      </w:r>
+      <w:r>
+        <w:t xml:space="preserve"> </w:t>
+      </w:r>
+      <w:r>
+        <w:rPr>
+          <w:rStyle w:val="VerbatimChar"/>
+        </w:rPr>
+        <w:t xml:space="preserve">P_DEBOUNCE_TOL_PCT = 10</w:t>
+      </w:r>
+      <w:r>
+        <w:t xml:space="preserve">.</w:t>
       </w:r>
     </w:p>
     <w:p>
@@ -14345,7 +14582,7 @@
               <w:rPr>
                 <w:rStyle w:val="VerbatimChar"/>
               </w:rPr>
-              <w:t xml:space="preserve">sec_tick</w:t>
+              <w:t xml:space="preserve">sec_pulse</w:t>
             </w:r>
           </w:p>
         </w:tc>
@@ -15879,7 +16116,7 @@
               <w:rPr>
                 <w:rStyle w:val="VerbatimChar"/>
               </w:rPr>
-              <w:t xml:space="preserve">sec_tick == 1</w:t>
+              <w:t xml:space="preserve">sec_pulse == 1</w:t>
             </w:r>
             <w:r>
               <w:t xml:space="preserve"> </w:t>
@@ -16003,7 +16240,7 @@
               <w:rPr>
                 <w:rStyle w:val="VerbatimChar"/>
               </w:rPr>
-              <w:t xml:space="preserve">sec_tick == 1</w:t>
+              <w:t xml:space="preserve">sec_pulse == 1</w:t>
             </w:r>
             <w:r>
               <w:t xml:space="preserve"> </w:t>
@@ -16294,7 +16531,7 @@
               <w:rPr>
                 <w:rStyle w:val="VerbatimChar"/>
               </w:rPr>
-              <w:t xml:space="preserve">sec_tick == 1</w:t>
+              <w:t xml:space="preserve">sec_pulse == 1</w:t>
             </w:r>
             <w:r>
               <w:t xml:space="preserve"> </w:t>
@@ -16418,7 +16655,7 @@
               <w:rPr>
                 <w:rStyle w:val="VerbatimChar"/>
               </w:rPr>
-              <w:t xml:space="preserve">sec_tick == 1</w:t>
+              <w:t xml:space="preserve">sec_pulse == 1</w:t>
             </w:r>
             <w:r>
               <w:t xml:space="preserve"> </w:t>
@@ -16737,7 +16974,7 @@
               <w:rPr>
                 <w:rStyle w:val="VerbatimChar"/>
               </w:rPr>
-              <w:t xml:space="preserve">sec_tick == 1</w:t>
+              <w:t xml:space="preserve">sec_pulse == 1</w:t>
             </w:r>
             <w:r>
               <w:t xml:space="preserve"> </w:t>
@@ -16861,7 +17098,7 @@
               <w:rPr>
                 <w:rStyle w:val="VerbatimChar"/>
               </w:rPr>
-              <w:t xml:space="preserve">sec_tick == 1</w:t>
+              <w:t xml:space="preserve">sec_pulse == 1</w:t>
             </w:r>
             <w:r>
               <w:t xml:space="preserve"> </w:t>
@@ -16930,7 +17167,7 @@
           <w:i/>
           <w:iCs/>
         </w:rPr>
-        <w:t xml:space="preserve">Ghi chú: Bộ đếm timeout 5s tự động xóa về 0 mỗi khi người dùng có thao tác bấm phím UP hoặc DOWN (Keep-alive).</w:t>
+        <w:t xml:space="preserve">Ghi chú: Bộ đếm timeout 5s tự động xóa về 0 mỗi khi người dùng có thao tác bấm phím UP hoặc DOWN (Keep-alive). Tham số cấu hình: P_TIMEOUT_SEC = 5, P_SEC_WIDTH = 6, P_MIN_WIDTH = 6, P_HOUR_WIDTH = 5; Hằng số cục bộ PL_TIMEOUT_CNT_WIDTH = 3.</w:t>
       </w:r>
     </w:p>
     <w:bookmarkEnd w:id="90"/>
@@ -17069,7 +17306,7 @@
         <w:rPr>
           <w:rStyle w:val="VerbatimChar"/>
         </w:rPr>
-        <w:t xml:space="preserve">sec_tick</w:t>
+        <w:t xml:space="preserve">sec_pulse</w:t>
       </w:r>
       <w:r>
         <w:t xml:space="preserve"> </w:t>
@@ -17540,7 +17777,7 @@
               <w:rPr>
                 <w:rStyle w:val="VerbatimChar"/>
               </w:rPr>
-              <w:t xml:space="preserve">sec_tick</w:t>
+              <w:t xml:space="preserve">sec_pulse</w:t>
             </w:r>
           </w:p>
         </w:tc>
@@ -18064,7 +18301,7 @@
               <w:rPr>
                 <w:rStyle w:val="VerbatimChar"/>
               </w:rPr>
-              <w:t xml:space="preserve">s_out == 59 &amp; sec_tick &amp; ~load_en</w:t>
+              <w:t xml:space="preserve">s_out == 59 &amp; sec_pulse &amp; ~load_en</w:t>
             </w:r>
             <w:r>
               <w:t xml:space="preserve">)</w:t>
@@ -18118,7 +18355,7 @@
           <w:i/>
           <w:iCs/>
         </w:rPr>
-        <w:t xml:space="preserve">Ghi chú: Cờ sec_rollover bị khóa (gated = 0) khi load_en = 1 để tránh kích hoạt nhảy phút ngoài ý muốn khi nạp thời gian.</w:t>
+        <w:t xml:space="preserve">Ghi chú: Cờ sec_rollover bị khóa (gated = 0) khi load_en = 1 để tránh kích hoạt nhảy phút ngoài ý muốn khi nạp thời gian. Tham số cấu hình: P_SEC_WIDTH = 6.</w:t>
       </w:r>
     </w:p>
     <w:bookmarkEnd w:id="100"/>
@@ -18217,7 +18454,7 @@
         <w:rPr>
           <w:rStyle w:val="VerbatimChar"/>
         </w:rPr>
-        <w:t xml:space="preserve">sec_tick == 1</w:t>
+        <w:t xml:space="preserve">sec_pulse == 1</w:t>
       </w:r>
       <w:r>
         <w:t xml:space="preserve">, bộ đếm tăng Modulo-60 (0 .. 59 -&gt; 0) liên tục 24/7 chuẩn thời gian thực.</w:t>
@@ -18245,7 +18482,7 @@
         <w:rPr>
           <w:rStyle w:val="VerbatimChar"/>
         </w:rPr>
-        <w:t xml:space="preserve">sec_rollover = (r_sec == 6'd59) &amp; sec_tick &amp; ~load_en;</w:t>
+        <w:t xml:space="preserve">sec_rollover = (r_sec == 6'd59) &amp; sec_pulse &amp; ~load_en;</w:t>
       </w:r>
       <w:r>
         <w:t xml:space="preserve">.</w:t>
@@ -19448,7 +19685,7 @@
           <w:i/>
           <w:iCs/>
         </w:rPr>
-        <w:t xml:space="preserve">Ghi chú: Bộ đếm phút tăng 1 đơn vị mỗi khi nhận xung sec_rollover từ second_counter và nạp đè song song khi có load_en = 1.</w:t>
+        <w:t xml:space="preserve">Ghi chú: Bộ đếm phút tăng 1 đơn vị mỗi khi nhận xung sec_rollover từ second_counter và nạp đè song song khi có load_en = 1. Tham số cấu hình: P_MIN_WIDTH = 6.</w:t>
       </w:r>
     </w:p>
     <w:bookmarkEnd w:id="111"/>
@@ -20668,7 +20905,7 @@
           <w:i/>
           <w:iCs/>
         </w:rPr>
-        <w:t xml:space="preserve">Ghi chú: Bộ đếm giờ tăng 1 đơn vị mỗi khi nhận xung min_rollover từ minute_counter và nạp đè song song khi có load_en = 1.</w:t>
+        <w:t xml:space="preserve">Ghi chú: Bộ đếm giờ tăng 1 đơn vị mỗi khi nhận xung min_rollover từ minute_counter và nạp đè song song khi có load_en = 1. Tham số cấu hình: P_HOUR_WIDTH = 5.</w:t>
       </w:r>
     </w:p>
     <w:bookmarkEnd w:id="122"/>
@@ -20921,7 +21158,7 @@
         <w:rPr>
           <w:rStyle w:val="VerbatimChar"/>
         </w:rPr>
-        <w:t xml:space="preserve">MODE_RUN</w:t>
+        <w:t xml:space="preserve">PL_MODE_RUN = 2'b00</w:t>
       </w:r>
       <w:r>
         <w:t xml:space="preserve">) và giá trị trong bộ đệm chỉnh sửa (khi ở các chế độ</w:t>
@@ -22309,7 +22546,7 @@
           <w:i/>
           <w:iCs/>
         </w:rPr>
-        <w:t xml:space="preserve">Ghi chú: Mạch hoạt động hoàn toàn bằng logic tổ hợp zero-latency, không sử dụng Flip-Flop.</w:t>
+        <w:t xml:space="preserve">Ghi chú: Mạch hoạt động hoàn toàn bằng logic tổ hợp zero-latency, không sử dụng Flip-Flop. Tham số cấu hình: P_SEC_WIDTH = 6, P_MIN_WIDTH = 6, P_HOUR_WIDTH = 5; Tham số cục bộ: PL_MODE_RUN = 2’b00.</w:t>
       </w:r>
     </w:p>
     <w:bookmarkEnd w:id="133"/>
@@ -22361,7 +22598,7 @@
         <w:rPr>
           <w:rStyle w:val="VerbatimChar"/>
         </w:rPr>
-        <w:t xml:space="preserve">s_out = (adj_mode == 2'b00) ? s_cnt : s_adj;</w:t>
+        <w:t xml:space="preserve">s_out = (adj_mode == PL_MODE_RUN) ? s_cnt : s_adj;</w:t>
       </w:r>
     </w:p>
     <w:p>
@@ -22376,7 +22613,7 @@
         <w:rPr>
           <w:rStyle w:val="VerbatimChar"/>
         </w:rPr>
-        <w:t xml:space="preserve">m_out = (adj_mode == 2'b00) ? m_cnt : m_adj;</w:t>
+        <w:t xml:space="preserve">m_out = (adj_mode == PL_MODE_RUN) ? m_cnt : m_adj;</w:t>
       </w:r>
     </w:p>
     <w:p>
@@ -22391,7 +22628,7 @@
         <w:rPr>
           <w:rStyle w:val="VerbatimChar"/>
         </w:rPr>
-        <w:t xml:space="preserve">h_out = (adj_mode == 2'b00) ? h_cnt : h_adj;</w:t>
+        <w:t xml:space="preserve">h_out = (adj_mode == PL_MODE_RUN) ? h_cnt : h_adj;</w:t>
       </w:r>
     </w:p>
     <w:bookmarkEnd w:id="134"/>
@@ -24651,7 +24888,7 @@
           <w:b/>
           <w:bCs/>
         </w:rPr>
-        <w:t xml:space="preserve">TC2: Kiểm chứng Xung Phân Tầng Prescaler (tick_1khz, sec_tick):</w:t>
+        <w:t xml:space="preserve">TC2: Kiểm chứng Xung Phân Tầng Prescaler (pulse_1khz, sec_pulse):</w:t>
       </w:r>
       <w:r>
         <w:t xml:space="preserve"> </w:t>
@@ -24666,7 +24903,7 @@
         <w:rPr>
           <w:rStyle w:val="VerbatimChar"/>
         </w:rPr>
-        <w:t xml:space="preserve">tick_1khz</w:t>
+        <w:t xml:space="preserve">pulse_1khz</w:t>
       </w:r>
       <w:r>
         <w:t xml:space="preserve"> </w:t>
@@ -24681,7 +24918,7 @@
         <w:rPr>
           <w:rStyle w:val="VerbatimChar"/>
         </w:rPr>
-        <w:t xml:space="preserve">sec_tick</w:t>
+        <w:t xml:space="preserve">sec_pulse</w:t>
       </w:r>
       <w:r>
         <w:t xml:space="preserve"> </w:t>
@@ -24979,7 +25216,7 @@
         <w:t xml:space="preserve"> </w:t>
       </w:r>
       <w:r>
-        <w:t xml:space="preserve">Nhấn &lt; 18ms (17 ticks) bị hủy hoàn toàn, giữ &gt;= 18ms phát đúng 1 xung, giữ lâu phát Auto-Repeat đều đặn.</w:t>
+        <w:t xml:space="preserve">Nhấn &lt; 18ms (17 pulses) bị hủy hoàn toàn, giữ &gt;= 18ms phát đúng 1 xung, giữ lâu phát Auto-Repeat đều đặn.</w:t>
       </w:r>
     </w:p>
     <w:p>

</xml_diff>

<commit_message>
feat(HMS_Timer_Ngo_Thai_Binh): update RTL, testbench, spec docs and add verification test plan (xlsx/pdf)
</commit_message>
<xml_diff>
--- a/HMS_Timer_Ngo_Thai_Binh/docs/SPECIFICATION.docx
+++ b/HMS_Timer_Ngo_Thai_Binh/docs/SPECIFICATION.docx
@@ -493,7 +493,7 @@
         <w:t xml:space="preserve"> </w:t>
       </w:r>
       <w:r>
-        <w:t xml:space="preserve">(Single-Channel Button Debouncer 20ms ±10% with Clock Enable)</w:t>
+        <w:t xml:space="preserve">(Single-Channel Button Debouncer 20ms with Clock Enable)</w:t>
       </w:r>
     </w:p>
     <w:p>
@@ -837,7 +837,7 @@
         <w:t xml:space="preserve">down_in</w:t>
       </w:r>
       <w:r>
-        <w:t xml:space="preserve">) cho phép người dùng chuyển đổi trạng thái và điều chỉnh độc lập từng trường thời gian với cơ chế tự động lặp lại (Auto-Repeat), bộ đệm chỉnh giờ độc lập, bộ chuyển mạch hiển thị chuyên dụng, cùng tính năng tự động thoát và hủy thay đổi sau 5 giây không thao tác (Inactivity Timeout).</w:t>
+        <w:t xml:space="preserve">) cho phép người dùng chuyển đổi trạng thái và điều chỉnh độc lập từng trường thời gian với cơ chế lọc rung phím hai chiều phát xung sự kiện chuẩn 1 chu kỳ (Single Event Pulse), bộ đệm chỉnh giờ độc lập, bộ chuyển mạch hiển thị chuyên dụng chống glitch 1 chu kỳ, cùng tính năng tự động thoát và hủy thay đổi sau 5 giây không thao tác (Inactivity Timeout).</w:t>
       </w:r>
     </w:p>
     <w:p>
@@ -1311,7 +1311,7 @@
               <w:jc w:val="left"/>
             </w:pPr>
             <w:r>
-              <w:t xml:space="preserve">Tự Động Lặp Lại</w:t>
+              <w:t xml:space="preserve">Lọc Rung 2 Chiều &amp; Phát Xung Đơn</w:t>
             </w:r>
           </w:p>
         </w:tc>
@@ -1338,7 +1338,7 @@
               <w:jc w:val="left"/>
             </w:pPr>
             <w:r>
-              <w:t xml:space="preserve">Hỗ trợ tính năng Auto-Repeat: Giữ phím liên tục sẽ tự động phát xung tuần hoàn đều đặn.</w:t>
+              <w:t xml:space="preserve">Khử rung chuyển trạng thái 2 chiều (nhấn/nhả 20 ms), phát duy nhất 1 xung chuẩn 1-cycle master clock khi nhấn phím (Single-Event Pulse, không Auto-Repeat).</w:t>
             </w:r>
           </w:p>
         </w:tc>
@@ -1367,7 +1367,7 @@
               <w:jc w:val="left"/>
             </w:pPr>
             <w:r>
-              <w:t xml:space="preserve">Dung Sai Khử Rung</w:t>
+              <w:t xml:space="preserve">Thời Gian Khử Rung</w:t>
             </w:r>
           </w:p>
         </w:tc>
@@ -1394,7 +1394,7 @@
               <w:jc w:val="left"/>
             </w:pPr>
             <w:r>
-              <w:t xml:space="preserve">Áp dụng dải dung sai ±10% (18 ms .. 22 ms) cho bộ khử rung phím.</w:t>
+              <w:t xml:space="preserve">Khử rung phím chuẩn 20 ms (20 pulses @ 1 kHz) cho toàn bộ các nút bấm.</w:t>
             </w:r>
           </w:p>
         </w:tc>
@@ -1776,7 +1776,7 @@
               <w:jc w:val="left"/>
             </w:pPr>
             <w:r>
-              <w:t xml:space="preserve">Output Switch MUX</w:t>
+              <w:t xml:space="preserve">Output Switch Anti-Glitch MUX</w:t>
             </w:r>
           </w:p>
         </w:tc>
@@ -1818,7 +1818,40 @@
               <w:t xml:space="preserve"> </w:t>
             </w:r>
             <w:r>
-              <w:t xml:space="preserve">để chuyển mạch hiển thị: xuất đệm khi chỉnh giờ và xuất counter khi chạy đếm bình thường.</w:t>
+              <w:t xml:space="preserve">để chuyển mạch hiển thị: xuất đệm khi chỉnh giờ (</w:t>
+            </w:r>
+            <w:r>
+              <w:rPr>
+                <w:rStyle w:val="VerbatimChar"/>
+              </w:rPr>
+              <w:t xml:space="preserve">MODE_ADJ_*</w:t>
+            </w:r>
+            <w:r>
+              <w:t xml:space="preserve">), xuất counter khi chạy đếm bình thường (</w:t>
+            </w:r>
+            <w:r>
+              <w:rPr>
+                <w:rStyle w:val="VerbatimChar"/>
+              </w:rPr>
+              <w:t xml:space="preserve">MODE_RUN</w:t>
+            </w:r>
+            <w:r>
+              <w:t xml:space="preserve">), và bypass giữ đệm khi</w:t>
+            </w:r>
+            <w:r>
+              <w:t xml:space="preserve"> </w:t>
+            </w:r>
+            <w:r>
+              <w:rPr>
+                <w:rStyle w:val="VerbatimChar"/>
+              </w:rPr>
+              <w:t xml:space="preserve">load_en = 1</w:t>
+            </w:r>
+            <w:r>
+              <w:t xml:space="preserve"> </w:t>
+            </w:r>
+            <w:r>
+              <w:t xml:space="preserve">để triệt tiêu hoàn toàn glitch 1 chu kỳ khi chuyển chế độ.</w:t>
             </w:r>
           </w:p>
         </w:tc>
@@ -1966,7 +1999,7 @@
               <w:t xml:space="preserve">pulse_1khz</w:t>
             </w:r>
             <w:r>
-              <w:t xml:space="preserve">, bộ đếm 5-bit (0 .. 17), cắt giảm 85% năng lượng.</w:t>
+              <w:t xml:space="preserve">, bộ đếm 5-bit (0 .. 19), cắt giảm 85% năng lượng.</w:t>
             </w:r>
           </w:p>
         </w:tc>
@@ -2232,7 +2265,7 @@
               <w:jc w:val="left"/>
             </w:pPr>
             <w:r>
-              <w:t xml:space="preserve">Triển khai khối Reset Synchronizer 2-FF đồng bộ hóa hoàn toàn trên miền clock 1 MHz.</w:t>
+              <w:t xml:space="preserve">Triển khai khối Reset Synchronizer 2-FF xác lập bất đồng bộ, giải trừ đồng bộ trên miền clock 1 MHz.</w:t>
             </w:r>
           </w:p>
         </w:tc>
@@ -2604,7 +2637,7 @@
           <w:b/>
           <w:bCs/>
         </w:rPr>
-        <w:t xml:space="preserve">Kiến trúc Tách biệt Bộ Đệm &amp; Chuyển Mạch Hiển Thị (</w:t>
+        <w:t xml:space="preserve">Kiến trúc Tách biệt Bộ Đệm &amp; Chuyển Mạch Hiển Thị Chống Glitch (</w:t>
       </w:r>
       <w:r>
         <w:rPr>
@@ -2707,6 +2740,48 @@
       </w:r>
       <w:r>
         <w:t xml:space="preserve">hoạt động bằng logic tổ hợp không độ trễ chuyển mạch tức thời.</w:t>
+      </w:r>
+    </w:p>
+    <w:p>
+      <w:pPr>
+        <w:pStyle w:val="Compact"/>
+        <w:numPr>
+          <w:ilvl w:val="1"/>
+          <w:numId w:val="1009"/>
+        </w:numPr>
+      </w:pPr>
+      <w:r>
+        <w:t xml:space="preserve">Tích hợp tín hiệu điều khiển</w:t>
+      </w:r>
+      <w:r>
+        <w:t xml:space="preserve"> </w:t>
+      </w:r>
+      <w:r>
+        <w:rPr>
+          <w:rStyle w:val="VerbatimChar"/>
+        </w:rPr>
+        <w:t xml:space="preserve">load_en</w:t>
+      </w:r>
+      <w:r>
+        <w:t xml:space="preserve"> </w:t>
+      </w:r>
+      <w:r>
+        <w:t xml:space="preserve">để bypass giữ nguyên giá trị bộ đệm trong chu kỳ nạp song song, đảm bảo không có bất kỳ xung nhiễu (glitch) nào xuất hiện tại các cổng ngõ ra</w:t>
+      </w:r>
+      <w:r>
+        <w:t xml:space="preserve"> </w:t>
+      </w:r>
+      <w:r>
+        <w:rPr>
+          <w:rStyle w:val="VerbatimChar"/>
+        </w:rPr>
+        <w:t xml:space="preserve">s_out, m_out, h_out</w:t>
+      </w:r>
+      <w:r>
+        <w:t xml:space="preserve"> </w:t>
+      </w:r>
+      <w:r>
+        <w:t xml:space="preserve">khi chuyển từ chế độ chỉnh giờ sang chạy bình thường.</w:t>
       </w:r>
     </w:p>
     <w:p>
@@ -3926,7 +4001,7 @@
               <w:rPr>
                 <w:rStyle w:val="VerbatimChar"/>
               </w:rPr>
-              <w:t xml:space="preserve">P_PULSE_1HZ_FREQ_HZ</w:t>
+              <w:t xml:space="preserve">P_DEBOUNCE_PULSES</w:t>
             </w:r>
           </w:p>
         </w:tc>
@@ -3956,22 +4031,22 @@
               <w:rPr>
                 <w:rStyle w:val="VerbatimChar"/>
               </w:rPr>
-              <w:t xml:space="preserve">1</w:t>
-            </w:r>
-          </w:p>
-        </w:tc>
-        <w:tc>
-          <w:tcPr/>
-          <w:p>
-            <w:pPr>
-              <w:pStyle w:val="Compact"/>
-              <w:jc w:val="center"/>
-            </w:pPr>
-            <w:r>
-              <w:rPr>
-                <w:rStyle w:val="VerbatimChar"/>
-              </w:rPr>
-              <w:t xml:space="preserve">1</w:t>
+              <w:t xml:space="preserve">20</w:t>
+            </w:r>
+          </w:p>
+        </w:tc>
+        <w:tc>
+          <w:tcPr/>
+          <w:p>
+            <w:pPr>
+              <w:pStyle w:val="Compact"/>
+              <w:jc w:val="center"/>
+            </w:pPr>
+            <w:r>
+              <w:rPr>
+                <w:rStyle w:val="VerbatimChar"/>
+              </w:rPr>
+              <w:t xml:space="preserve">20</w:t>
             </w:r>
           </w:p>
         </w:tc>
@@ -3998,22 +4073,34 @@
               <w:jc w:val="left"/>
             </w:pPr>
             <w:r>
-              <w:t xml:space="preserve">Tần số xung chuẩn đếm giây thời gian thực (1 Hz)</w:t>
-            </w:r>
-          </w:p>
-        </w:tc>
-        <w:tc>
-          <w:tcPr/>
-          <w:p>
-            <w:pPr>
-              <w:pStyle w:val="Compact"/>
-              <w:jc w:val="left"/>
-            </w:pPr>
-            <w:r>
-              <w:rPr>
-                <w:rStyle w:val="VerbatimChar"/>
-              </w:rPr>
-              <w:t xml:space="preserve">clk_prescaler</w:t>
+              <w:t xml:space="preserve">Số chu kỳ lấy mẫu 1kHz danh định (20 ms)</w:t>
+            </w:r>
+          </w:p>
+        </w:tc>
+        <w:tc>
+          <w:tcPr/>
+          <w:p>
+            <w:pPr>
+              <w:pStyle w:val="Compact"/>
+              <w:jc w:val="left"/>
+            </w:pPr>
+            <w:r>
+              <w:rPr>
+                <w:rStyle w:val="VerbatimChar"/>
+              </w:rPr>
+              <w:t xml:space="preserve">button_debouncer</w:t>
+            </w:r>
+            <w:r>
+              <w:t xml:space="preserve">,</w:t>
+            </w:r>
+            <w:r>
+              <w:t xml:space="preserve"> </w:t>
+            </w:r>
+            <w:r>
+              <w:rPr>
+                <w:rStyle w:val="VerbatimChar"/>
+              </w:rPr>
+              <w:t xml:space="preserve">button_controller</w:t>
             </w:r>
             <w:r>
               <w:t xml:space="preserve">,</w:t>
@@ -4042,7 +4129,7 @@
               <w:rPr>
                 <w:rStyle w:val="VerbatimChar"/>
               </w:rPr>
-              <w:t xml:space="preserve">P_DIV_1KHZ_MAX</w:t>
+              <w:t xml:space="preserve">P_TIMEOUT_SEC</w:t>
             </w:r>
           </w:p>
         </w:tc>
@@ -4072,230 +4159,22 @@
               <w:rPr>
                 <w:rStyle w:val="VerbatimChar"/>
               </w:rPr>
-              <w:t xml:space="preserve">999</w:t>
-            </w:r>
-          </w:p>
-        </w:tc>
-        <w:tc>
-          <w:tcPr/>
-          <w:p>
-            <w:pPr>
-              <w:pStyle w:val="Compact"/>
-              <w:jc w:val="center"/>
-            </w:pPr>
-            <w:r>
-              <w:rPr>
-                <w:rStyle w:val="VerbatimChar"/>
-              </w:rPr>
-              <w:t xml:space="preserve">0</w:t>
-            </w:r>
-          </w:p>
-        </w:tc>
-        <w:tc>
-          <w:tcPr/>
-          <w:p>
-            <w:pPr>
-              <w:pStyle w:val="Compact"/>
-              <w:jc w:val="center"/>
-            </w:pPr>
-            <w:r>
-              <w:rPr>
-                <w:rStyle w:val="VerbatimChar"/>
-              </w:rPr>
-              <w:t xml:space="preserve">DERIVED</w:t>
-            </w:r>
-          </w:p>
-        </w:tc>
-        <w:tc>
-          <w:tcPr/>
-          <w:p>
-            <w:pPr>
-              <w:pStyle w:val="Compact"/>
-              <w:jc w:val="left"/>
-            </w:pPr>
-            <w:r>
-              <w:t xml:space="preserve">Ngưỡng đếm tràn của Tầng 1 Prescaler</w:t>
-            </w:r>
-          </w:p>
-        </w:tc>
-        <w:tc>
-          <w:tcPr/>
-          <w:p>
-            <w:pPr>
-              <w:pStyle w:val="Compact"/>
-              <w:jc w:val="left"/>
-            </w:pPr>
-            <w:r>
-              <w:rPr>
-                <w:rStyle w:val="VerbatimChar"/>
-              </w:rPr>
-              <w:t xml:space="preserve">clk_prescaler</w:t>
-            </w:r>
-          </w:p>
-        </w:tc>
-      </w:tr>
-      <w:tr>
-        <w:tc>
-          <w:tcPr/>
-          <w:p>
-            <w:pPr>
-              <w:pStyle w:val="Compact"/>
-              <w:jc w:val="left"/>
-            </w:pPr>
-            <w:r>
-              <w:rPr>
-                <w:rStyle w:val="VerbatimChar"/>
-              </w:rPr>
-              <w:t xml:space="preserve">P_DIV_1HZ_MAX</w:t>
-            </w:r>
-          </w:p>
-        </w:tc>
-        <w:tc>
-          <w:tcPr/>
-          <w:p>
-            <w:pPr>
-              <w:pStyle w:val="Compact"/>
-              <w:jc w:val="center"/>
-            </w:pPr>
-            <w:r>
-              <w:rPr>
-                <w:rStyle w:val="VerbatimChar"/>
-              </w:rPr>
-              <w:t xml:space="preserve">int</w:t>
-            </w:r>
-          </w:p>
-        </w:tc>
-        <w:tc>
-          <w:tcPr/>
-          <w:p>
-            <w:pPr>
-              <w:pStyle w:val="Compact"/>
-              <w:jc w:val="center"/>
-            </w:pPr>
-            <w:r>
-              <w:rPr>
-                <w:rStyle w:val="VerbatimChar"/>
-              </w:rPr>
-              <w:t xml:space="preserve">999</w:t>
-            </w:r>
-          </w:p>
-        </w:tc>
-        <w:tc>
-          <w:tcPr/>
-          <w:p>
-            <w:pPr>
-              <w:pStyle w:val="Compact"/>
-              <w:jc w:val="center"/>
-            </w:pPr>
-            <w:r>
-              <w:rPr>
-                <w:rStyle w:val="VerbatimChar"/>
-              </w:rPr>
-              <w:t xml:space="preserve">99</w:t>
-            </w:r>
-          </w:p>
-        </w:tc>
-        <w:tc>
-          <w:tcPr/>
-          <w:p>
-            <w:pPr>
-              <w:pStyle w:val="Compact"/>
-              <w:jc w:val="center"/>
-            </w:pPr>
-            <w:r>
-              <w:rPr>
-                <w:rStyle w:val="VerbatimChar"/>
-              </w:rPr>
-              <w:t xml:space="preserve">DERIVED</w:t>
-            </w:r>
-          </w:p>
-        </w:tc>
-        <w:tc>
-          <w:tcPr/>
-          <w:p>
-            <w:pPr>
-              <w:pStyle w:val="Compact"/>
-              <w:jc w:val="left"/>
-            </w:pPr>
-            <w:r>
-              <w:t xml:space="preserve">Ngưỡng đếm tràn của Tầng 2 Prescaler</w:t>
-            </w:r>
-          </w:p>
-        </w:tc>
-        <w:tc>
-          <w:tcPr/>
-          <w:p>
-            <w:pPr>
-              <w:pStyle w:val="Compact"/>
-              <w:jc w:val="left"/>
-            </w:pPr>
-            <w:r>
-              <w:rPr>
-                <w:rStyle w:val="VerbatimChar"/>
-              </w:rPr>
-              <w:t xml:space="preserve">clk_prescaler</w:t>
-            </w:r>
-          </w:p>
-        </w:tc>
-      </w:tr>
-      <w:tr>
-        <w:tc>
-          <w:tcPr/>
-          <w:p>
-            <w:pPr>
-              <w:pStyle w:val="Compact"/>
-              <w:jc w:val="left"/>
-            </w:pPr>
-            <w:r>
-              <w:rPr>
-                <w:rStyle w:val="VerbatimChar"/>
-              </w:rPr>
-              <w:t xml:space="preserve">P_DEBOUNCE_PULSES</w:t>
-            </w:r>
-          </w:p>
-        </w:tc>
-        <w:tc>
-          <w:tcPr/>
-          <w:p>
-            <w:pPr>
-              <w:pStyle w:val="Compact"/>
-              <w:jc w:val="center"/>
-            </w:pPr>
-            <w:r>
-              <w:rPr>
-                <w:rStyle w:val="VerbatimChar"/>
-              </w:rPr>
-              <w:t xml:space="preserve">int</w:t>
-            </w:r>
-          </w:p>
-        </w:tc>
-        <w:tc>
-          <w:tcPr/>
-          <w:p>
-            <w:pPr>
-              <w:pStyle w:val="Compact"/>
-              <w:jc w:val="center"/>
-            </w:pPr>
-            <w:r>
-              <w:rPr>
-                <w:rStyle w:val="VerbatimChar"/>
-              </w:rPr>
-              <w:t xml:space="preserve">20</w:t>
-            </w:r>
-          </w:p>
-        </w:tc>
-        <w:tc>
-          <w:tcPr/>
-          <w:p>
-            <w:pPr>
-              <w:pStyle w:val="Compact"/>
-              <w:jc w:val="center"/>
-            </w:pPr>
-            <w:r>
-              <w:rPr>
-                <w:rStyle w:val="VerbatimChar"/>
-              </w:rPr>
-              <w:t xml:space="preserve">20</w:t>
+              <w:t xml:space="preserve">5</w:t>
+            </w:r>
+          </w:p>
+        </w:tc>
+        <w:tc>
+          <w:tcPr/>
+          <w:p>
+            <w:pPr>
+              <w:pStyle w:val="Compact"/>
+              <w:jc w:val="center"/>
+            </w:pPr>
+            <w:r>
+              <w:rPr>
+                <w:rStyle w:val="VerbatimChar"/>
+              </w:rPr>
+              <w:t xml:space="preserve">5</w:t>
             </w:r>
           </w:p>
         </w:tc>
@@ -4322,262 +4201,6 @@
               <w:jc w:val="left"/>
             </w:pPr>
             <w:r>
-              <w:t xml:space="preserve">Số chu kỳ lấy mẫu 1kHz danh định (20 ms)</w:t>
-            </w:r>
-          </w:p>
-        </w:tc>
-        <w:tc>
-          <w:tcPr/>
-          <w:p>
-            <w:pPr>
-              <w:pStyle w:val="Compact"/>
-              <w:jc w:val="left"/>
-            </w:pPr>
-            <w:r>
-              <w:rPr>
-                <w:rStyle w:val="VerbatimChar"/>
-              </w:rPr>
-              <w:t xml:space="preserve">button_debouncer</w:t>
-            </w:r>
-            <w:r>
-              <w:t xml:space="preserve">,</w:t>
-            </w:r>
-            <w:r>
-              <w:t xml:space="preserve"> </w:t>
-            </w:r>
-            <w:r>
-              <w:rPr>
-                <w:rStyle w:val="VerbatimChar"/>
-              </w:rPr>
-              <w:t xml:space="preserve">button_controller</w:t>
-            </w:r>
-            <w:r>
-              <w:t xml:space="preserve">,</w:t>
-            </w:r>
-            <w:r>
-              <w:t xml:space="preserve"> </w:t>
-            </w:r>
-            <w:r>
-              <w:rPr>
-                <w:rStyle w:val="VerbatimChar"/>
-              </w:rPr>
-              <w:t xml:space="preserve">hms_timer</w:t>
-            </w:r>
-          </w:p>
-        </w:tc>
-      </w:tr>
-      <w:tr>
-        <w:tc>
-          <w:tcPr/>
-          <w:p>
-            <w:pPr>
-              <w:pStyle w:val="Compact"/>
-              <w:jc w:val="left"/>
-            </w:pPr>
-            <w:r>
-              <w:rPr>
-                <w:rStyle w:val="VerbatimChar"/>
-              </w:rPr>
-              <w:t xml:space="preserve">P_DEBOUNCE_TOL_PCT</w:t>
-            </w:r>
-          </w:p>
-        </w:tc>
-        <w:tc>
-          <w:tcPr/>
-          <w:p>
-            <w:pPr>
-              <w:pStyle w:val="Compact"/>
-              <w:jc w:val="center"/>
-            </w:pPr>
-            <w:r>
-              <w:rPr>
-                <w:rStyle w:val="VerbatimChar"/>
-              </w:rPr>
-              <w:t xml:space="preserve">int</w:t>
-            </w:r>
-          </w:p>
-        </w:tc>
-        <w:tc>
-          <w:tcPr/>
-          <w:p>
-            <w:pPr>
-              <w:pStyle w:val="Compact"/>
-              <w:jc w:val="center"/>
-            </w:pPr>
-            <w:r>
-              <w:rPr>
-                <w:rStyle w:val="VerbatimChar"/>
-              </w:rPr>
-              <w:t xml:space="preserve">10</w:t>
-            </w:r>
-          </w:p>
-        </w:tc>
-        <w:tc>
-          <w:tcPr/>
-          <w:p>
-            <w:pPr>
-              <w:pStyle w:val="Compact"/>
-              <w:jc w:val="center"/>
-            </w:pPr>
-            <w:r>
-              <w:rPr>
-                <w:rStyle w:val="VerbatimChar"/>
-              </w:rPr>
-              <w:t xml:space="preserve">10</w:t>
-            </w:r>
-          </w:p>
-        </w:tc>
-        <w:tc>
-          <w:tcPr/>
-          <w:p>
-            <w:pPr>
-              <w:pStyle w:val="Compact"/>
-              <w:jc w:val="center"/>
-            </w:pPr>
-            <w:r>
-              <w:rPr>
-                <w:rStyle w:val="VerbatimChar"/>
-              </w:rPr>
-              <w:t xml:space="preserve">USER-PROVIDED</w:t>
-            </w:r>
-          </w:p>
-        </w:tc>
-        <w:tc>
-          <w:tcPr/>
-          <w:p>
-            <w:pPr>
-              <w:pStyle w:val="Compact"/>
-              <w:jc w:val="left"/>
-            </w:pPr>
-            <w:r>
-              <w:t xml:space="preserve">Dung sai khử rung phím ±10% (18 ms .. 22 ms)</w:t>
-            </w:r>
-          </w:p>
-        </w:tc>
-        <w:tc>
-          <w:tcPr/>
-          <w:p>
-            <w:pPr>
-              <w:pStyle w:val="Compact"/>
-              <w:jc w:val="left"/>
-            </w:pPr>
-            <w:r>
-              <w:rPr>
-                <w:rStyle w:val="VerbatimChar"/>
-              </w:rPr>
-              <w:t xml:space="preserve">button_debouncer</w:t>
-            </w:r>
-            <w:r>
-              <w:t xml:space="preserve">,</w:t>
-            </w:r>
-            <w:r>
-              <w:t xml:space="preserve"> </w:t>
-            </w:r>
-            <w:r>
-              <w:rPr>
-                <w:rStyle w:val="VerbatimChar"/>
-              </w:rPr>
-              <w:t xml:space="preserve">button_controller</w:t>
-            </w:r>
-            <w:r>
-              <w:t xml:space="preserve">,</w:t>
-            </w:r>
-            <w:r>
-              <w:t xml:space="preserve"> </w:t>
-            </w:r>
-            <w:r>
-              <w:rPr>
-                <w:rStyle w:val="VerbatimChar"/>
-              </w:rPr>
-              <w:t xml:space="preserve">hms_timer</w:t>
-            </w:r>
-          </w:p>
-        </w:tc>
-      </w:tr>
-      <w:tr>
-        <w:tc>
-          <w:tcPr/>
-          <w:p>
-            <w:pPr>
-              <w:pStyle w:val="Compact"/>
-              <w:jc w:val="left"/>
-            </w:pPr>
-            <w:r>
-              <w:rPr>
-                <w:rStyle w:val="VerbatimChar"/>
-              </w:rPr>
-              <w:t xml:space="preserve">P_TIMEOUT_SEC</w:t>
-            </w:r>
-          </w:p>
-        </w:tc>
-        <w:tc>
-          <w:tcPr/>
-          <w:p>
-            <w:pPr>
-              <w:pStyle w:val="Compact"/>
-              <w:jc w:val="center"/>
-            </w:pPr>
-            <w:r>
-              <w:rPr>
-                <w:rStyle w:val="VerbatimChar"/>
-              </w:rPr>
-              <w:t xml:space="preserve">int</w:t>
-            </w:r>
-          </w:p>
-        </w:tc>
-        <w:tc>
-          <w:tcPr/>
-          <w:p>
-            <w:pPr>
-              <w:pStyle w:val="Compact"/>
-              <w:jc w:val="center"/>
-            </w:pPr>
-            <w:r>
-              <w:rPr>
-                <w:rStyle w:val="VerbatimChar"/>
-              </w:rPr>
-              <w:t xml:space="preserve">5</w:t>
-            </w:r>
-          </w:p>
-        </w:tc>
-        <w:tc>
-          <w:tcPr/>
-          <w:p>
-            <w:pPr>
-              <w:pStyle w:val="Compact"/>
-              <w:jc w:val="center"/>
-            </w:pPr>
-            <w:r>
-              <w:rPr>
-                <w:rStyle w:val="VerbatimChar"/>
-              </w:rPr>
-              <w:t xml:space="preserve">5</w:t>
-            </w:r>
-          </w:p>
-        </w:tc>
-        <w:tc>
-          <w:tcPr/>
-          <w:p>
-            <w:pPr>
-              <w:pStyle w:val="Compact"/>
-              <w:jc w:val="center"/>
-            </w:pPr>
-            <w:r>
-              <w:rPr>
-                <w:rStyle w:val="VerbatimChar"/>
-              </w:rPr>
-              <w:t xml:space="preserve">USER-PROVIDED</w:t>
-            </w:r>
-          </w:p>
-        </w:tc>
-        <w:tc>
-          <w:tcPr/>
-          <w:p>
-            <w:pPr>
-              <w:pStyle w:val="Compact"/>
-              <w:jc w:val="left"/>
-            </w:pPr>
-            <w:r>
               <w:t xml:space="preserve">Ngưỡng thời gian tự động hủy đệm và thoát về RUN (5s)</w:t>
             </w:r>
           </w:p>
@@ -4594,426 +4217,6 @@
                 <w:rStyle w:val="VerbatimChar"/>
               </w:rPr>
               <w:t xml:space="preserve">mode_controller</w:t>
-            </w:r>
-            <w:r>
-              <w:t xml:space="preserve">,</w:t>
-            </w:r>
-            <w:r>
-              <w:t xml:space="preserve"> </w:t>
-            </w:r>
-            <w:r>
-              <w:rPr>
-                <w:rStyle w:val="VerbatimChar"/>
-              </w:rPr>
-              <w:t xml:space="preserve">hms_timer</w:t>
-            </w:r>
-          </w:p>
-        </w:tc>
-      </w:tr>
-      <w:tr>
-        <w:tc>
-          <w:tcPr/>
-          <w:p>
-            <w:pPr>
-              <w:pStyle w:val="Compact"/>
-              <w:jc w:val="left"/>
-            </w:pPr>
-            <w:r>
-              <w:rPr>
-                <w:rStyle w:val="VerbatimChar"/>
-              </w:rPr>
-              <w:t xml:space="preserve">P_SEC_WIDTH</w:t>
-            </w:r>
-          </w:p>
-        </w:tc>
-        <w:tc>
-          <w:tcPr/>
-          <w:p>
-            <w:pPr>
-              <w:pStyle w:val="Compact"/>
-              <w:jc w:val="center"/>
-            </w:pPr>
-            <w:r>
-              <w:rPr>
-                <w:rStyle w:val="VerbatimChar"/>
-              </w:rPr>
-              <w:t xml:space="preserve">int</w:t>
-            </w:r>
-          </w:p>
-        </w:tc>
-        <w:tc>
-          <w:tcPr/>
-          <w:p>
-            <w:pPr>
-              <w:pStyle w:val="Compact"/>
-              <w:jc w:val="center"/>
-            </w:pPr>
-            <w:r>
-              <w:rPr>
-                <w:rStyle w:val="VerbatimChar"/>
-              </w:rPr>
-              <w:t xml:space="preserve">6</w:t>
-            </w:r>
-          </w:p>
-        </w:tc>
-        <w:tc>
-          <w:tcPr/>
-          <w:p>
-            <w:pPr>
-              <w:pStyle w:val="Compact"/>
-              <w:jc w:val="center"/>
-            </w:pPr>
-            <w:r>
-              <w:rPr>
-                <w:rStyle w:val="VerbatimChar"/>
-              </w:rPr>
-              <w:t xml:space="preserve">6</w:t>
-            </w:r>
-          </w:p>
-        </w:tc>
-        <w:tc>
-          <w:tcPr/>
-          <w:p>
-            <w:pPr>
-              <w:pStyle w:val="Compact"/>
-              <w:jc w:val="center"/>
-            </w:pPr>
-            <w:r>
-              <w:rPr>
-                <w:rStyle w:val="VerbatimChar"/>
-              </w:rPr>
-              <w:t xml:space="preserve">DERIVED</w:t>
-            </w:r>
-          </w:p>
-        </w:tc>
-        <w:tc>
-          <w:tcPr/>
-          <w:p>
-            <w:pPr>
-              <w:pStyle w:val="Compact"/>
-              <w:jc w:val="left"/>
-            </w:pPr>
-            <w:r>
-              <w:t xml:space="preserve">Độ rộng bus dữ liệu Giây (0 .. 59)</w:t>
-            </w:r>
-          </w:p>
-        </w:tc>
-        <w:tc>
-          <w:tcPr/>
-          <w:p>
-            <w:pPr>
-              <w:pStyle w:val="Compact"/>
-              <w:jc w:val="left"/>
-            </w:pPr>
-            <w:r>
-              <w:rPr>
-                <w:rStyle w:val="VerbatimChar"/>
-              </w:rPr>
-              <w:t xml:space="preserve">second_counter</w:t>
-            </w:r>
-            <w:r>
-              <w:t xml:space="preserve">,</w:t>
-            </w:r>
-            <w:r>
-              <w:t xml:space="preserve"> </w:t>
-            </w:r>
-            <w:r>
-              <w:rPr>
-                <w:rStyle w:val="VerbatimChar"/>
-              </w:rPr>
-              <w:t xml:space="preserve">mode_controller</w:t>
-            </w:r>
-            <w:r>
-              <w:t xml:space="preserve">,</w:t>
-            </w:r>
-            <w:r>
-              <w:t xml:space="preserve"> </w:t>
-            </w:r>
-            <w:r>
-              <w:rPr>
-                <w:rStyle w:val="VerbatimChar"/>
-              </w:rPr>
-              <w:t xml:space="preserve">output_switch</w:t>
-            </w:r>
-            <w:r>
-              <w:t xml:space="preserve">,</w:t>
-            </w:r>
-            <w:r>
-              <w:t xml:space="preserve"> </w:t>
-            </w:r>
-            <w:r>
-              <w:rPr>
-                <w:rStyle w:val="VerbatimChar"/>
-              </w:rPr>
-              <w:t xml:space="preserve">hms_timer</w:t>
-            </w:r>
-          </w:p>
-        </w:tc>
-      </w:tr>
-      <w:tr>
-        <w:tc>
-          <w:tcPr/>
-          <w:p>
-            <w:pPr>
-              <w:pStyle w:val="Compact"/>
-              <w:jc w:val="left"/>
-            </w:pPr>
-            <w:r>
-              <w:rPr>
-                <w:rStyle w:val="VerbatimChar"/>
-              </w:rPr>
-              <w:t xml:space="preserve">P_MIN_WIDTH</w:t>
-            </w:r>
-          </w:p>
-        </w:tc>
-        <w:tc>
-          <w:tcPr/>
-          <w:p>
-            <w:pPr>
-              <w:pStyle w:val="Compact"/>
-              <w:jc w:val="center"/>
-            </w:pPr>
-            <w:r>
-              <w:rPr>
-                <w:rStyle w:val="VerbatimChar"/>
-              </w:rPr>
-              <w:t xml:space="preserve">int</w:t>
-            </w:r>
-          </w:p>
-        </w:tc>
-        <w:tc>
-          <w:tcPr/>
-          <w:p>
-            <w:pPr>
-              <w:pStyle w:val="Compact"/>
-              <w:jc w:val="center"/>
-            </w:pPr>
-            <w:r>
-              <w:rPr>
-                <w:rStyle w:val="VerbatimChar"/>
-              </w:rPr>
-              <w:t xml:space="preserve">6</w:t>
-            </w:r>
-          </w:p>
-        </w:tc>
-        <w:tc>
-          <w:tcPr/>
-          <w:p>
-            <w:pPr>
-              <w:pStyle w:val="Compact"/>
-              <w:jc w:val="center"/>
-            </w:pPr>
-            <w:r>
-              <w:rPr>
-                <w:rStyle w:val="VerbatimChar"/>
-              </w:rPr>
-              <w:t xml:space="preserve">6</w:t>
-            </w:r>
-          </w:p>
-        </w:tc>
-        <w:tc>
-          <w:tcPr/>
-          <w:p>
-            <w:pPr>
-              <w:pStyle w:val="Compact"/>
-              <w:jc w:val="center"/>
-            </w:pPr>
-            <w:r>
-              <w:rPr>
-                <w:rStyle w:val="VerbatimChar"/>
-              </w:rPr>
-              <w:t xml:space="preserve">DERIVED</w:t>
-            </w:r>
-          </w:p>
-        </w:tc>
-        <w:tc>
-          <w:tcPr/>
-          <w:p>
-            <w:pPr>
-              <w:pStyle w:val="Compact"/>
-              <w:jc w:val="left"/>
-            </w:pPr>
-            <w:r>
-              <w:t xml:space="preserve">Độ rộng bus dữ liệu Phút (0 .. 59)</w:t>
-            </w:r>
-          </w:p>
-        </w:tc>
-        <w:tc>
-          <w:tcPr/>
-          <w:p>
-            <w:pPr>
-              <w:pStyle w:val="Compact"/>
-              <w:jc w:val="left"/>
-            </w:pPr>
-            <w:r>
-              <w:rPr>
-                <w:rStyle w:val="VerbatimChar"/>
-              </w:rPr>
-              <w:t xml:space="preserve">minute_counter</w:t>
-            </w:r>
-            <w:r>
-              <w:t xml:space="preserve">,</w:t>
-            </w:r>
-            <w:r>
-              <w:t xml:space="preserve"> </w:t>
-            </w:r>
-            <w:r>
-              <w:rPr>
-                <w:rStyle w:val="VerbatimChar"/>
-              </w:rPr>
-              <w:t xml:space="preserve">mode_controller</w:t>
-            </w:r>
-            <w:r>
-              <w:t xml:space="preserve">,</w:t>
-            </w:r>
-            <w:r>
-              <w:t xml:space="preserve"> </w:t>
-            </w:r>
-            <w:r>
-              <w:rPr>
-                <w:rStyle w:val="VerbatimChar"/>
-              </w:rPr>
-              <w:t xml:space="preserve">output_switch</w:t>
-            </w:r>
-            <w:r>
-              <w:t xml:space="preserve">,</w:t>
-            </w:r>
-            <w:r>
-              <w:t xml:space="preserve"> </w:t>
-            </w:r>
-            <w:r>
-              <w:rPr>
-                <w:rStyle w:val="VerbatimChar"/>
-              </w:rPr>
-              <w:t xml:space="preserve">hms_timer</w:t>
-            </w:r>
-          </w:p>
-        </w:tc>
-      </w:tr>
-      <w:tr>
-        <w:tc>
-          <w:tcPr/>
-          <w:p>
-            <w:pPr>
-              <w:pStyle w:val="Compact"/>
-              <w:jc w:val="left"/>
-            </w:pPr>
-            <w:r>
-              <w:rPr>
-                <w:rStyle w:val="VerbatimChar"/>
-              </w:rPr>
-              <w:t xml:space="preserve">P_HOUR_WIDTH</w:t>
-            </w:r>
-          </w:p>
-        </w:tc>
-        <w:tc>
-          <w:tcPr/>
-          <w:p>
-            <w:pPr>
-              <w:pStyle w:val="Compact"/>
-              <w:jc w:val="center"/>
-            </w:pPr>
-            <w:r>
-              <w:rPr>
-                <w:rStyle w:val="VerbatimChar"/>
-              </w:rPr>
-              <w:t xml:space="preserve">int</w:t>
-            </w:r>
-          </w:p>
-        </w:tc>
-        <w:tc>
-          <w:tcPr/>
-          <w:p>
-            <w:pPr>
-              <w:pStyle w:val="Compact"/>
-              <w:jc w:val="center"/>
-            </w:pPr>
-            <w:r>
-              <w:rPr>
-                <w:rStyle w:val="VerbatimChar"/>
-              </w:rPr>
-              <w:t xml:space="preserve">5</w:t>
-            </w:r>
-          </w:p>
-        </w:tc>
-        <w:tc>
-          <w:tcPr/>
-          <w:p>
-            <w:pPr>
-              <w:pStyle w:val="Compact"/>
-              <w:jc w:val="center"/>
-            </w:pPr>
-            <w:r>
-              <w:rPr>
-                <w:rStyle w:val="VerbatimChar"/>
-              </w:rPr>
-              <w:t xml:space="preserve">5</w:t>
-            </w:r>
-          </w:p>
-        </w:tc>
-        <w:tc>
-          <w:tcPr/>
-          <w:p>
-            <w:pPr>
-              <w:pStyle w:val="Compact"/>
-              <w:jc w:val="center"/>
-            </w:pPr>
-            <w:r>
-              <w:rPr>
-                <w:rStyle w:val="VerbatimChar"/>
-              </w:rPr>
-              <w:t xml:space="preserve">DERIVED</w:t>
-            </w:r>
-          </w:p>
-        </w:tc>
-        <w:tc>
-          <w:tcPr/>
-          <w:p>
-            <w:pPr>
-              <w:pStyle w:val="Compact"/>
-              <w:jc w:val="left"/>
-            </w:pPr>
-            <w:r>
-              <w:t xml:space="preserve">Độ rộng bus dữ liệu Giờ (0 .. 23)</w:t>
-            </w:r>
-          </w:p>
-        </w:tc>
-        <w:tc>
-          <w:tcPr/>
-          <w:p>
-            <w:pPr>
-              <w:pStyle w:val="Compact"/>
-              <w:jc w:val="left"/>
-            </w:pPr>
-            <w:r>
-              <w:rPr>
-                <w:rStyle w:val="VerbatimChar"/>
-              </w:rPr>
-              <w:t xml:space="preserve">hour_counter</w:t>
-            </w:r>
-            <w:r>
-              <w:t xml:space="preserve">,</w:t>
-            </w:r>
-            <w:r>
-              <w:t xml:space="preserve"> </w:t>
-            </w:r>
-            <w:r>
-              <w:rPr>
-                <w:rStyle w:val="VerbatimChar"/>
-              </w:rPr>
-              <w:t xml:space="preserve">mode_controller</w:t>
-            </w:r>
-            <w:r>
-              <w:t xml:space="preserve">,</w:t>
-            </w:r>
-            <w:r>
-              <w:t xml:space="preserve"> </w:t>
-            </w:r>
-            <w:r>
-              <w:rPr>
-                <w:rStyle w:val="VerbatimChar"/>
-              </w:rPr>
-              <w:t xml:space="preserve">output_switch</w:t>
             </w:r>
             <w:r>
               <w:t xml:space="preserve">,</w:t>
@@ -5040,7 +4243,7 @@
           <w:i/>
           <w:iCs/>
         </w:rPr>
-        <w:t xml:space="preserve">Ghi chú: Toàn bộ tham số module bắt buộc tuân thủ tiền tố P_ và hằng số nội bộ tuân thủ tiền tố PL_ theo chuẩn rtl_spec_architect.</w:t>
+        <w:t xml:space="preserve">Ghi chú: Toàn bộ tham số module bắt buộc tuân thủ tiền tố P_ và hằng số nội bộ tuân thủ tiền tố PL_ theo chuẩn rtl_spec_architect. Các bus dữ liệu giờ, phút, giây được cố định kích thước bit trực tiếp [4:0] và [5:0].</w:t>
       </w:r>
     </w:p>
     <w:p>
@@ -5465,19 +4668,19 @@
               <w:jc w:val="center"/>
             </w:pPr>
             <w:r>
-              <w:t xml:space="preserve">Async/Sync</w:t>
-            </w:r>
-          </w:p>
-        </w:tc>
-        <w:tc>
-          <w:tcPr/>
-          <w:p>
-            <w:pPr>
-              <w:pStyle w:val="Compact"/>
-              <w:jc w:val="left"/>
-            </w:pPr>
-            <w:r>
-              <w:t xml:space="preserve">Reset toàn cục, tích cực mức thấp (qua bộ reset synchronizer)</w:t>
+              <w:t xml:space="preserve">Async (Active-Low)</w:t>
+            </w:r>
+          </w:p>
+        </w:tc>
+        <w:tc>
+          <w:tcPr/>
+          <w:p>
+            <w:pPr>
+              <w:pStyle w:val="Compact"/>
+              <w:jc w:val="left"/>
+            </w:pPr>
+            <w:r>
+              <w:t xml:space="preserve">Reset toàn cục bất đồng bộ, tích cực mức thấp (được đồng bộ hóa giải trừ qua reset_sync)</w:t>
             </w:r>
           </w:p>
         </w:tc>
@@ -6197,7 +5400,7 @@
           <w:i/>
           <w:iCs/>
         </w:rPr>
-        <w:t xml:space="preserve">Ghi chú: Tất cả tín hiệu ngõ vào nút bấm bất đồng bộ đều được đồng bộ hóa và lọc rung phím 20ms ±10% trước khi đưa vào hệ thống.</w:t>
+        <w:t xml:space="preserve">Ghi chú: Tất cả tín hiệu ngõ vào nút bấm bất đồng bộ đều được đồng bộ hóa và lọc rung phím 20ms trước khi đưa vào hệ thống.</w:t>
       </w:r>
     </w:p>
     <w:p>
@@ -6347,7 +5550,7 @@
         <w:t xml:space="preserve">clk</w:t>
       </w:r>
       <w:r>
-        <w:t xml:space="preserve">) và đường reset đồng bộ</w:t>
+        <w:t xml:space="preserve">) và đường reset bất đồng bộ giải trừ đồng bộ</w:t>
       </w:r>
       <w:r>
         <w:t xml:space="preserve"> </w:t>
@@ -7082,7 +6285,7 @@
           <w:b/>
           <w:bCs/>
         </w:rPr>
-        <w:t xml:space="preserve">Bộ Đồng Bộ Hóa Reset Đồng Bộ Hoàn Toàn (</w:t>
+        <w:t xml:space="preserve">Bộ Đồng Bộ Hóa Reset Xác Lập Bất Đồng Bộ, Giải Trừ Đồng Bộ (</w:t>
       </w:r>
       <w:r>
         <w:rPr>
@@ -7151,7 +6354,7 @@
         </w:numPr>
       </w:pPr>
       <w:r>
-        <w:t xml:space="preserve">Sử dụng 2 tầng Flip-Flop đồng bộ hóa trên sườn dương</w:t>
+        <w:t xml:space="preserve">Sử dụng 2 tầng Flip-Flop: xác lập Reset bất đồng bộ tức thời khi</w:t>
       </w:r>
       <w:r>
         <w:t xml:space="preserve"> </w:t>
@@ -7160,22 +6363,22 @@
         <w:rPr>
           <w:rStyle w:val="VerbatimChar"/>
         </w:rPr>
-        <w:t xml:space="preserve">clk</w:t>
-      </w:r>
-      <w:r>
-        <w:t xml:space="preserve"> </w:t>
-      </w:r>
-      <w:r>
-        <w:t xml:space="preserve">(</w:t>
+        <w:t xml:space="preserve">rstn = 0</w:t>
+      </w:r>
+      <w:r>
+        <w:t xml:space="preserve"> </w:t>
+      </w:r>
+      <w:r>
+        <w:t xml:space="preserve">(zero clock latency) và giải trừ đồng bộ (</w:t>
       </w:r>
       <w:r>
         <w:rPr>
           <w:rStyle w:val="VerbatimChar"/>
         </w:rPr>
-        <w:t xml:space="preserve">always_ff @(posedge clk)</w:t>
-      </w:r>
-      <w:r>
-        <w:t xml:space="preserve">), tạo ra tín hiệu</w:t>
+        <w:t xml:space="preserve">Sync Deassert</w:t>
+      </w:r>
+      <w:r>
+        <w:t xml:space="preserve">) sau 2 chu kỳ clock 1 MHz khi</w:t>
       </w:r>
       <w:r>
         <w:t xml:space="preserve"> </w:t>
@@ -7184,13 +6387,10 @@
         <w:rPr>
           <w:rStyle w:val="VerbatimChar"/>
         </w:rPr>
-        <w:t xml:space="preserve">rstn_sync</w:t>
-      </w:r>
-      <w:r>
-        <w:t xml:space="preserve"> </w:t>
-      </w:r>
-      <w:r>
-        <w:t xml:space="preserve">kích hoạt đồng bộ.</w:t>
+        <w:t xml:space="preserve">rstn = 1</w:t>
+      </w:r>
+      <w:r>
+        <w:t xml:space="preserve">.</w:t>
       </w:r>
     </w:p>
     <w:p>
@@ -7202,16 +6402,31 @@
         </w:numPr>
       </w:pPr>
       <w:r>
-        <w:t xml:space="preserve">Các khối downstream sử dụng kiểu reset đồng bộ (</w:t>
+        <w:t xml:space="preserve">Các khối downstream sử dụng kiểu reset bất đồng bộ (</w:t>
       </w:r>
       <w:r>
         <w:rPr>
           <w:rStyle w:val="VerbatimChar"/>
         </w:rPr>
-        <w:t xml:space="preserve">if (!rstn)</w:t>
-      </w:r>
-      <w:r>
-        <w:t xml:space="preserve">), ánh xạ trực tiếp vào chân reset đồng bộ (S/R) của FPGA/ASIC cells, triệt tiêu hoàn toàn vi phạm thời gian Recovery và Removal.</w:t>
+        <w:t xml:space="preserve">always_ff @(posedge clk or negedge rstn)</w:t>
+      </w:r>
+      <w:r>
+        <w:t xml:space="preserve">), ánh xạ trực tiếp vào chân Clear/Reset bất đồng bộ của tế bào chuẩn ASIC/FPGA, kết hợp giải trừ đồng bộ qua</w:t>
+      </w:r>
+      <w:r>
+        <w:t xml:space="preserve"> </w:t>
+      </w:r>
+      <w:r>
+        <w:rPr>
+          <w:rStyle w:val="VerbatimChar"/>
+        </w:rPr>
+        <w:t xml:space="preserve">rstn_sync</w:t>
+      </w:r>
+      <w:r>
+        <w:t xml:space="preserve"> </w:t>
+      </w:r>
+      <w:r>
+        <w:t xml:space="preserve">giúp triệt tiêu hoàn toàn vi phạm thời gian Recovery và Removal.</w:t>
       </w:r>
     </w:p>
     <w:p>
@@ -7458,7 +6673,7 @@
               <w:jc w:val="left"/>
             </w:pPr>
             <w:r>
-              <w:t xml:space="preserve">Tín hiệu reset tích cực mức thấp được đồng bộ hóa khử vi phạm recovery/removal</w:t>
+              <w:t xml:space="preserve">Tín hiệu reset bất đồng bộ tích cực thấp được đồng bộ hóa giải trừ khử vi phạm recovery/removal</w:t>
             </w:r>
           </w:p>
         </w:tc>
@@ -7981,17 +7196,29 @@
               </w:rPr>
               <w:t xml:space="preserve">u_hour_counter</w:t>
             </w:r>
-          </w:p>
-        </w:tc>
-        <w:tc>
-          <w:tcPr/>
-          <w:p>
-            <w:pPr>
-              <w:pStyle w:val="Compact"/>
-              <w:jc w:val="left"/>
-            </w:pPr>
-            <w:r>
-              <w:t xml:space="preserve">Xung 1-cycle kích hoạt nạp song song giá trị mới vào counters khi commit</w:t>
+            <w:r>
+              <w:t xml:space="preserve">,</w:t>
+            </w:r>
+            <w:r>
+              <w:t xml:space="preserve"> </w:t>
+            </w:r>
+            <w:r>
+              <w:rPr>
+                <w:rStyle w:val="VerbatimChar"/>
+              </w:rPr>
+              <w:t xml:space="preserve">u_output_switch</w:t>
+            </w:r>
+          </w:p>
+        </w:tc>
+        <w:tc>
+          <w:tcPr/>
+          <w:p>
+            <w:pPr>
+              <w:pStyle w:val="Compact"/>
+              <w:jc w:val="left"/>
+            </w:pPr>
+            <w:r>
+              <w:t xml:space="preserve">Xung 1-cycle kích hoạt nạp song song giá trị mới vào counters khi commit và giữ đệm hiển thị chống glitch 1 chu kỳ</w:t>
             </w:r>
           </w:p>
         </w:tc>
@@ -8757,13 +7984,13 @@
       </w:r>
     </w:p>
     <w:bookmarkEnd w:id="31"/>
-    <w:bookmarkStart w:id="35" w:name="Xe5b147d231e4b430cb853ac4eeb3b4d56ad9445"/>
+    <w:bookmarkStart w:id="35" w:name="Xd46c22cc54c8e716daa811db6938d418e993365"/>
     <w:p>
       <w:pPr>
         <w:pStyle w:val="Heading3"/>
       </w:pPr>
       <w:r>
-        <w:t xml:space="preserve">2.5.2 Giản đồ Lọc Rung Phím Dung Sai ±10% &amp; Auto-Repeat</w:t>
+        <w:t xml:space="preserve">2.5.2 Giản đồ Lọc Rung Phím 2 Chiều 20ms &amp; Phát Xung Sự Kiện Đơn Chu Kỳ (Single-Event Pulse)</w:t>
       </w:r>
     </w:p>
     <w:p>
@@ -8771,7 +7998,7 @@
         <w:pStyle w:val="FirstParagraph"/>
       </w:pPr>
       <w:r>
-        <w:t xml:space="preserve">Giản đồ thời gian minh họa bộ lọc nhiễu rung phím 20 ms ±10% (18 pulses @ 1 kHz) và cơ chế tự động phát xung lặp lại (Auto-Repeat) khi giữ phím:</w:t>
+        <w:t xml:space="preserve">Giản đồ thời gian minh họa bộ lọc nhiễu rung phím 20 ms (20 pulses @ 1 kHz) lọc rung 2 chiều xác nhận chuyển trạng thái và phát xung sự kiện đơn chu kỳ (Single-Event Pulse) khi nhấn phím:</w:t>
       </w:r>
     </w:p>
     <w:p>
@@ -8781,9 +8008,9 @@
       <w:r>
         <w:drawing>
           <wp:inline>
-            <wp:extent cx="5334000" cy="1388852"/>
+            <wp:extent cx="5334000" cy="1600200"/>
             <wp:effectExtent b="0" l="0" r="0" t="0"/>
-            <wp:docPr descr="Hình 2.5.2: Giản đồ xung lọc rung phím 18ms (dung sai 10%) và Auto-Repeat (WaveDrom)" title="" id="33" name="Picture"/>
+            <wp:docPr descr="Hình 2.5.2: Giản đồ xung lọc rung phím 20ms và phát xung đơn chu kỳ (WaveDrom)" title="" id="33" name="Picture"/>
             <a:graphic>
               <a:graphicData uri="http://schemas.openxmlformats.org/drawingml/2006/picture">
                 <pic:pic>
@@ -8802,7 +8029,7 @@
                   <pic:spPr bwMode="auto">
                     <a:xfrm>
                       <a:off x="0" y="0"/>
-                      <a:ext cx="5334000" cy="1388852"/>
+                      <a:ext cx="5334000" cy="1600200"/>
                     </a:xfrm>
                     <a:prstGeom prst="rect">
                       <a:avLst/>
@@ -8826,7 +8053,7 @@
         <w:pStyle w:val="ImageCaption"/>
       </w:pPr>
       <w:r>
-        <w:t xml:space="preserve">Hình 2.5.2: Giản đồ xung lọc rung phím 18ms (dung sai 10%) và Auto-Repeat (WaveDrom)</w:t>
+        <w:t xml:space="preserve">Hình 2.5.2: Giản đồ xung lọc rung phím 20ms và phát xung đơn chu kỳ (WaveDrom)</w:t>
       </w:r>
     </w:p>
     <w:bookmarkEnd w:id="35"/>
@@ -8970,13 +8197,13 @@
         <w:t xml:space="preserve"> </w:t>
       </w:r>
       <w:r>
-        <w:t xml:space="preserve">Khối đồng bộ hóa reset hệ thống (Universal 2-Stage Synchronous Reset Synchronizer):</w:t>
-      </w:r>
-      <w:r>
-        <w:t xml:space="preserve"> </w:t>
-      </w:r>
-      <w:r>
-        <w:t xml:space="preserve">- Sử dụng kiến trúc đồng bộ hóa 2 tầng D Flip-Flop thuần túy trên sườn dương</w:t>
+        <w:t xml:space="preserve">Khối đồng bộ hóa reset hệ thống (Universal 2-Stage Asynchronous Assert, Synchronous Deassert Reset Synchronizer):</w:t>
+      </w:r>
+      <w:r>
+        <w:t xml:space="preserve"> </w:t>
+      </w:r>
+      <w:r>
+        <w:t xml:space="preserve">- Sử dụng kiến trúc đồng bộ hóa 2 tầng D Flip-Flop: xác lập Reset bất đồng bộ tức thời khi</w:t>
       </w:r>
       <w:r>
         <w:t xml:space="preserve"> </w:t>
@@ -8985,6 +8212,21 @@
         <w:rPr>
           <w:rStyle w:val="VerbatimChar"/>
         </w:rPr>
+        <w:t xml:space="preserve">rstn_async = 0</w:t>
+      </w:r>
+      <w:r>
+        <w:t xml:space="preserve"> </w:t>
+      </w:r>
+      <w:r>
+        <w:t xml:space="preserve">(zero clock latency) và giải trừ đồng bộ qua 2 chu kỳ xung nhịp</w:t>
+      </w:r>
+      <w:r>
+        <w:t xml:space="preserve"> </w:t>
+      </w:r>
+      <w:r>
+        <w:rPr>
+          <w:rStyle w:val="VerbatimChar"/>
+        </w:rPr>
         <w:t xml:space="preserve">clk</w:t>
       </w:r>
       <w:r>
@@ -8997,22 +8239,10 @@
         <w:rPr>
           <w:rStyle w:val="VerbatimChar"/>
         </w:rPr>
-        <w:t xml:space="preserve">always_ff @(posedge clk)</w:t>
-      </w:r>
-      <w:r>
-        <w:t xml:space="preserve">), tương thích hoàn hảo và phổ quát trên cả nền tảng FPGA (ánh xạ trực tiếp vào</w:t>
-      </w:r>
-      <w:r>
-        <w:t xml:space="preserve"> </w:t>
-      </w:r>
-      <w:r>
-        <w:rPr>
-          <w:rStyle w:val="VerbatimChar"/>
-        </w:rPr>
-        <w:t xml:space="preserve">FDRE</w:t>
-      </w:r>
-      <w:r>
-        <w:t xml:space="preserve">) và ASIC standard cell libraries.</w:t>
+        <w:t xml:space="preserve">always_ff @(posedge clk or negedge rstn_async)</w:t>
+      </w:r>
+      <w:r>
+        <w:t xml:space="preserve">), tương thích hoàn hảo và phổ quát trên cả nền tảng FPGA và ASIC standard cell libraries.</w:t>
       </w:r>
       <w:r>
         <w:t xml:space="preserve"> </w:t>
@@ -9522,19 +8752,19 @@
               <w:jc w:val="left"/>
             </w:pPr>
             <w:r>
-              <w:t xml:space="preserve">Tín hiệu reset tích cực mức thấp đã đồng bộ hóa giải trừ</w:t>
-            </w:r>
-          </w:p>
-        </w:tc>
-        <w:tc>
-          <w:tcPr/>
-          <w:p>
-            <w:pPr>
-              <w:pStyle w:val="Compact"/>
-              <w:jc w:val="left"/>
-            </w:pPr>
-            <w:r>
-              <w:t xml:space="preserve">Đồng bộ posedge clk</w:t>
+              <w:t xml:space="preserve">Tín hiệu reset tích cực mức thấp: xác lập bất đồng bộ tức thì, giải trừ đồng bộ</w:t>
+            </w:r>
+          </w:p>
+        </w:tc>
+        <w:tc>
+          <w:tcPr/>
+          <w:p>
+            <w:pPr>
+              <w:pStyle w:val="Compact"/>
+              <w:jc w:val="left"/>
+            </w:pPr>
+            <w:r>
+              <w:t xml:space="preserve">posedge clk / negedge rstn_async</w:t>
             </w:r>
           </w:p>
         </w:tc>
@@ -9564,7 +8794,7 @@
           <w:i/>
           <w:iCs/>
         </w:rPr>
-        <w:t xml:space="preserve">Ghi chú: Tín hiệu rstn_sync chuyển lên mức 1 sau 2 chu kỳ clk sau khi rstn_async giải trừ, triệt tiêu nguy cơ vi phạm timing.</w:t>
+        <w:t xml:space="preserve">Ghi chú: Tín hiệu rstn_sync xác lập mức 0 bất đồng bộ ngay khi rstn_async = 0 và chuyển lên mức 1 sau 2 chu kỳ clk sau khi rstn_async giải trừ, triệt tiêu nguy cơ vi phạm timing.</w:t>
       </w:r>
     </w:p>
     <w:bookmarkEnd w:id="46"/>
@@ -9590,7 +8820,7 @@
           <w:b/>
           <w:bCs/>
         </w:rPr>
-        <w:t xml:space="preserve">Kiến trúc Universal Synchronous 2-FF:</w:t>
+        <w:t xml:space="preserve">Kiến trúc Asynchronous Assert, Synchronous Deassert 2-FF:</w:t>
       </w:r>
       <w:r>
         <w:t xml:space="preserve"> </w:t>
@@ -9647,16 +8877,46 @@
         </w:numPr>
       </w:pPr>
       <w:r>
-        <w:t xml:space="preserve">Cả 2 tầng FF hoạt động đồng bộ trên sườn dương</w:t>
-      </w:r>
-      <w:r>
-        <w:t xml:space="preserve"> </w:t>
+        <w:t xml:space="preserve">Tầng 1 (</w:t>
       </w:r>
       <w:r>
         <w:rPr>
           <w:rStyle w:val="VerbatimChar"/>
         </w:rPr>
-        <w:t xml:space="preserve">clk</w:t>
+        <w:t xml:space="preserve">meta_rstn</w:t>
+      </w:r>
+      <w:r>
+        <w:t xml:space="preserve">) trực tiếp bắt sự kiện giải trừ reset bất đồng bộ (chịu rủi ro metastability). Tầng 2 (</w:t>
+      </w:r>
+      <w:r>
+        <w:rPr>
+          <w:rStyle w:val="VerbatimChar"/>
+        </w:rPr>
+        <w:t xml:space="preserve">sync_rstn</w:t>
+      </w:r>
+      <w:r>
+        <w:t xml:space="preserve">) loại bỏ metastability và phát tín hiệu reset đồng bộ.</w:t>
+      </w:r>
+    </w:p>
+    <w:p>
+      <w:pPr>
+        <w:pStyle w:val="Compact"/>
+        <w:numPr>
+          <w:ilvl w:val="2"/>
+          <w:numId w:val="1021"/>
+        </w:numPr>
+      </w:pPr>
+      <w:r>
+        <w:t xml:space="preserve">Khi</w:t>
+      </w:r>
+      <w:r>
+        <w:t xml:space="preserve"> </w:t>
+      </w:r>
+      <w:r>
+        <w:rPr>
+          <w:rStyle w:val="VerbatimChar"/>
+        </w:rPr>
+        <w:t xml:space="preserve">rstn_async == 0</w:t>
       </w:r>
       <w:r>
         <w:t xml:space="preserve">:</w:t>
@@ -9668,7 +8928,25 @@
         <w:rPr>
           <w:rStyle w:val="VerbatimChar"/>
         </w:rPr>
-        <w:t xml:space="preserve">r_sync_stage1 &lt;= rstn_async;</w:t>
+        <w:t xml:space="preserve">meta_rstn &lt;= 1'b0; sync_rstn &lt;= 1'b0;</w:t>
+      </w:r>
+      <w:r>
+        <w:t xml:space="preserve"> </w:t>
+      </w:r>
+      <w:r>
+        <w:t xml:space="preserve">ngay lập tức (không phụ thuộc xung clock).</w:t>
+      </w:r>
+    </w:p>
+    <w:p>
+      <w:pPr>
+        <w:pStyle w:val="Compact"/>
+        <w:numPr>
+          <w:ilvl w:val="2"/>
+          <w:numId w:val="1021"/>
+        </w:numPr>
+      </w:pPr>
+      <w:r>
+        <w:t xml:space="preserve">Khi</w:t>
       </w:r>
       <w:r>
         <w:t xml:space="preserve"> </w:t>
@@ -9677,7 +8955,37 @@
         <w:rPr>
           <w:rStyle w:val="VerbatimChar"/>
         </w:rPr>
-        <w:t xml:space="preserve">r_sync_stage2 &lt;= r_sync_stage1;</w:t>
+        <w:t xml:space="preserve">rstn_async == 1</w:t>
+      </w:r>
+      <w:r>
+        <w:t xml:space="preserve">:</w:t>
+      </w:r>
+      <w:r>
+        <w:t xml:space="preserve"> </w:t>
+      </w:r>
+      <w:r>
+        <w:rPr>
+          <w:rStyle w:val="VerbatimChar"/>
+        </w:rPr>
+        <w:t xml:space="preserve">meta_rstn &lt;= 1'b1; sync_rstn &lt;= meta_rstn;</w:t>
+      </w:r>
+      <w:r>
+        <w:t xml:space="preserve"> </w:t>
+      </w:r>
+      <w:r>
+        <w:t xml:space="preserve">trên các cạnh</w:t>
+      </w:r>
+      <w:r>
+        <w:t xml:space="preserve"> </w:t>
+      </w:r>
+      <w:r>
+        <w:rPr>
+          <w:rStyle w:val="VerbatimChar"/>
+        </w:rPr>
+        <w:t xml:space="preserve">posedge clk</w:t>
+      </w:r>
+      <w:r>
+        <w:t xml:space="preserve">.</w:t>
       </w:r>
     </w:p>
     <w:p>
@@ -9698,7 +9006,7 @@
         <w:rPr>
           <w:rStyle w:val="VerbatimChar"/>
         </w:rPr>
-        <w:t xml:space="preserve">rstn_sync = r_sync_stage2;</w:t>
+        <w:t xml:space="preserve">rstn_sync = sync_rstn;</w:t>
       </w:r>
     </w:p>
     <w:p>
@@ -9735,7 +9043,7 @@
         <w:t xml:space="preserve"> </w:t>
       </w:r>
       <w:r>
-        <w:t xml:space="preserve">được đưa đến tất cả các khối chức năng con tuần tự trong hệ thống, đảm bảo toàn bộ hệ thống khởi động và thoát reset đồng thời và sạch sẽ.</w:t>
+        <w:t xml:space="preserve">được đưa đến chân reset bất đồng bộ của tất cả các khối chức năng con tuần tự trong hệ thống, đảm bảo toàn bộ hệ thống khởi động tức thời và thoát reset đồng thời, sạch sẽ sau 2 chu kỳ clock.</w:t>
       </w:r>
     </w:p>
     <w:bookmarkEnd w:id="47"/>
@@ -10271,19 +9579,22 @@
               <w:jc w:val="center"/>
             </w:pPr>
             <w:r>
-              <w:t xml:space="preserve">Sync</w:t>
-            </w:r>
-          </w:p>
-        </w:tc>
-        <w:tc>
-          <w:tcPr/>
-          <w:p>
-            <w:pPr>
-              <w:pStyle w:val="Compact"/>
-              <w:jc w:val="left"/>
-            </w:pPr>
-            <w:r>
-              <w:t xml:space="preserve">Reset đồng bộ, tích cực mức thấp (</w:t>
+              <w:t xml:space="preserve">Async (Sync Deassert)</w:t>
+            </w:r>
+          </w:p>
+        </w:tc>
+        <w:tc>
+          <w:tcPr/>
+          <w:p>
+            <w:pPr>
+              <w:pStyle w:val="Compact"/>
+              <w:jc w:val="left"/>
+            </w:pPr>
+            <w:r>
+              <w:t xml:space="preserve">Reset bất đồng bộ tích cực thấp (từ</w:t>
+            </w:r>
+            <w:r>
+              <w:t xml:space="preserve"> </w:t>
             </w:r>
             <w:r>
               <w:rPr>
@@ -10423,7 +9734,7 @@
               <w:jc w:val="left"/>
             </w:pPr>
             <w:r>
-              <w:t xml:space="preserve">Tầng 1 đạt P_DIV_1KHZ_MAX</w:t>
+              <w:t xml:space="preserve">Tầng 1 đạt chu kỳ chia tần</w:t>
             </w:r>
           </w:p>
         </w:tc>
@@ -10542,7 +9853,7 @@
               <w:jc w:val="left"/>
             </w:pPr>
             <w:r>
-              <w:t xml:space="preserve">Tầng 2 đạt P_DIV_1HZ_MAX &amp; pulse_1khz</w:t>
+              <w:t xml:space="preserve">Tầng 2 đạt chu kỳ chia tần &amp; pulse_1khz</w:t>
             </w:r>
           </w:p>
         </w:tc>
@@ -10590,7 +9901,7 @@
         <w:pStyle w:val="Compact"/>
         <w:numPr>
           <w:ilvl w:val="0"/>
-          <w:numId w:val="1021"/>
+          <w:numId w:val="1022"/>
         </w:numPr>
       </w:pPr>
       <w:r>
@@ -10620,66 +9931,6 @@
           <w:rStyle w:val="VerbatimChar"/>
         </w:rPr>
         <w:t xml:space="preserve">P_PULSE_1KHZ_FREQ_HZ = 1_000</w:t>
-      </w:r>
-      <w:r>
-        <w:t xml:space="preserve">,</w:t>
-      </w:r>
-      <w:r>
-        <w:t xml:space="preserve"> </w:t>
-      </w:r>
-      <w:r>
-        <w:rPr>
-          <w:rStyle w:val="VerbatimChar"/>
-        </w:rPr>
-        <w:t xml:space="preserve">P_PULSE_1HZ_FREQ_HZ = 1</w:t>
-      </w:r>
-      <w:r>
-        <w:t xml:space="preserve">,</w:t>
-      </w:r>
-      <w:r>
-        <w:t xml:space="preserve"> </w:t>
-      </w:r>
-      <w:r>
-        <w:rPr>
-          <w:rStyle w:val="VerbatimChar"/>
-        </w:rPr>
-        <w:t xml:space="preserve">P_DIV_1KHZ_MAX = 999</w:t>
-      </w:r>
-      <w:r>
-        <w:t xml:space="preserve">,</w:t>
-      </w:r>
-      <w:r>
-        <w:t xml:space="preserve"> </w:t>
-      </w:r>
-      <w:r>
-        <w:rPr>
-          <w:rStyle w:val="VerbatimChar"/>
-        </w:rPr>
-        <w:t xml:space="preserve">P_DIV_1HZ_MAX = 999</w:t>
-      </w:r>
-      <w:r>
-        <w:t xml:space="preserve">,</w:t>
-      </w:r>
-      <w:r>
-        <w:t xml:space="preserve"> </w:t>
-      </w:r>
-      <w:r>
-        <w:rPr>
-          <w:rStyle w:val="VerbatimChar"/>
-        </w:rPr>
-        <w:t xml:space="preserve">P_CNT_1KHZ_WIDTH = 10</w:t>
-      </w:r>
-      <w:r>
-        <w:t xml:space="preserve">,</w:t>
-      </w:r>
-      <w:r>
-        <w:t xml:space="preserve"> </w:t>
-      </w:r>
-      <w:r>
-        <w:rPr>
-          <w:rStyle w:val="VerbatimChar"/>
-        </w:rPr>
-        <w:t xml:space="preserve">P_CNT_1HZ_WIDTH = 10</w:t>
       </w:r>
       <w:r>
         <w:t xml:space="preserve">.</w:t>
@@ -10690,7 +9941,7 @@
         <w:pStyle w:val="Compact"/>
         <w:numPr>
           <w:ilvl w:val="0"/>
-          <w:numId w:val="1021"/>
+          <w:numId w:val="1022"/>
         </w:numPr>
       </w:pPr>
       <w:r>
@@ -10704,7 +9955,7 @@
         <w:t xml:space="preserve"> </w:t>
       </w:r>
       <w:r>
-        <w:t xml:space="preserve">Sử dụng bộ đếm 10-bit (</w:t>
+        <w:t xml:space="preserve">Sử dụng bộ đếm 20-bit (</w:t>
       </w:r>
       <w:r>
         <w:rPr>
@@ -10722,7 +9973,7 @@
         <w:rPr>
           <w:rStyle w:val="VerbatimChar"/>
         </w:rPr>
-        <w:t xml:space="preserve">P_DIV_1KHZ_MAX</w:t>
+        <w:t xml:space="preserve">(P_CLK_FREQ_HZ / P_PULSE_1KHZ_FREQ_HZ - 1)</w:t>
       </w:r>
       <w:r>
         <w:t xml:space="preserve"> </w:t>
@@ -10778,7 +10029,7 @@
         <w:pStyle w:val="Compact"/>
         <w:numPr>
           <w:ilvl w:val="0"/>
-          <w:numId w:val="1021"/>
+          <w:numId w:val="1022"/>
         </w:numPr>
       </w:pPr>
       <w:r>
@@ -10792,7 +10043,7 @@
         <w:t xml:space="preserve"> </w:t>
       </w:r>
       <w:r>
-        <w:t xml:space="preserve">Sử dụng bộ đếm 10-bit (</w:t>
+        <w:t xml:space="preserve">Sử dụng bộ đếm 20-bit (</w:t>
       </w:r>
       <w:r>
         <w:rPr>
@@ -10837,13 +10088,13 @@
         <w:rPr>
           <w:rStyle w:val="VerbatimChar"/>
         </w:rPr>
-        <w:t xml:space="preserve">r_cnt_1hz == 999</w:t>
-      </w:r>
-      <w:r>
-        <w:t xml:space="preserve"> </w:t>
-      </w:r>
-      <w:r>
-        <w:t xml:space="preserve">đồng thời có</w:t>
+        <w:t xml:space="preserve">r_cnt_1hz == (P_PULSE_1KHZ_FREQ_HZ - 1)</w:t>
+      </w:r>
+      <w:r>
+        <w:t xml:space="preserve"> </w:t>
+      </w:r>
+      <w:r>
+        <w:t xml:space="preserve">(999) đồng thời có</w:t>
       </w:r>
       <w:r>
         <w:t xml:space="preserve"> </w:t>
@@ -10878,7 +10129,7 @@
         <w:pStyle w:val="Compact"/>
         <w:numPr>
           <w:ilvl w:val="0"/>
-          <w:numId w:val="1021"/>
+          <w:numId w:val="1022"/>
         </w:numPr>
       </w:pPr>
       <w:r>
@@ -11061,7 +10312,7 @@
         <w:t xml:space="preserve">pulse_1khz</w:t>
       </w:r>
       <w:r>
-        <w:t xml:space="preserve">), áp dụng dải dung sai thời gian danh định 20 ms ±10% (18 ms .. 22 ms) và tự động phát xung tuần hoàn khi giữ phím (Auto-Repeat).</w:t>
+        <w:t xml:space="preserve">), áp dụng cơ chế lọc rung hai chiều xác nhận chuyển trạng thái (Two-Way Transition Qualification) trong 20 ms (20 pulses @ 1 kHz) và phát xung sự kiện chuẩn 1 chu kỳ master clock khi nhấn phím (Single Event Pulse).</w:t>
       </w:r>
     </w:p>
     <w:bookmarkStart w:id="67" w:name="sơ-đồ-khối-block-diagram-2"/>
@@ -11449,19 +10700,22 @@
               <w:jc w:val="center"/>
             </w:pPr>
             <w:r>
-              <w:t xml:space="preserve">Sync</w:t>
-            </w:r>
-          </w:p>
-        </w:tc>
-        <w:tc>
-          <w:tcPr/>
-          <w:p>
-            <w:pPr>
-              <w:pStyle w:val="Compact"/>
-              <w:jc w:val="left"/>
-            </w:pPr>
-            <w:r>
-              <w:t xml:space="preserve">Reset đồng bộ, tích cực mức thấp (</w:t>
+              <w:t xml:space="preserve">Async (Sync Deassert)</w:t>
+            </w:r>
+          </w:p>
+        </w:tc>
+        <w:tc>
+          <w:tcPr/>
+          <w:p>
+            <w:pPr>
+              <w:pStyle w:val="Compact"/>
+              <w:jc w:val="left"/>
+            </w:pPr>
+            <w:r>
+              <w:t xml:space="preserve">Reset bất đồng bộ tích cực thấp (từ</w:t>
+            </w:r>
+            <w:r>
+              <w:t xml:space="preserve"> </w:t>
             </w:r>
             <w:r>
               <w:rPr>
@@ -11848,7 +11102,7 @@
           <w:i/>
           <w:iCs/>
         </w:rPr>
-        <w:t xml:space="preserve">Ghi chú: Bộ đếm 5-bit (0..17) hoạt động trên xung nhịp 1 MHz được kích hoạt bởi clk_en (1 kHz) tương ứng thời gian nhận diện phím hợp lệ 18 ms (20 ms - 10%). Ngõ ra btn_event tự động xóa về 0 sau đúng 1 chu kỳ clock 1 MHz.</w:t>
+        <w:t xml:space="preserve">Ghi chú: Bộ đếm hoạt động trên xung nhịp 1 MHz được kích hoạt bởi clk_en (1 kHz) tương ứng thời gian nhận diện phím hợp lệ 20 ms. Ngõ ra btn_event tự động xóa về 0 sau đúng 1 chu kỳ clock 1 MHz.</w:t>
       </w:r>
     </w:p>
     <w:bookmarkEnd w:id="68"/>
@@ -11866,7 +11120,7 @@
         <w:pStyle w:val="Compact"/>
         <w:numPr>
           <w:ilvl w:val="0"/>
-          <w:numId w:val="1022"/>
+          <w:numId w:val="1023"/>
         </w:numPr>
       </w:pPr>
       <w:r>
@@ -11874,13 +11128,7 @@
           <w:b/>
           <w:bCs/>
         </w:rPr>
-        <w:t xml:space="preserve">Tham số &amp; Hằng số:</w:t>
-      </w:r>
-      <w:r>
-        <w:t xml:space="preserve"> </w:t>
-      </w:r>
-      <w:r>
-        <w:t xml:space="preserve">Tham số cấu hình</w:t>
+        <w:t xml:space="preserve">Tham số cấu hình:</w:t>
       </w:r>
       <w:r>
         <w:t xml:space="preserve"> </w:t>
@@ -11890,54 +11138,6 @@
           <w:rStyle w:val="VerbatimChar"/>
         </w:rPr>
         <w:t xml:space="preserve">P_DEBOUNCE_PULSES = 20</w:t>
-      </w:r>
-      <w:r>
-        <w:t xml:space="preserve">,</w:t>
-      </w:r>
-      <w:r>
-        <w:t xml:space="preserve"> </w:t>
-      </w:r>
-      <w:r>
-        <w:rPr>
-          <w:rStyle w:val="VerbatimChar"/>
-        </w:rPr>
-        <w:t xml:space="preserve">P_DEBOUNCE_TOL_PCT = 10</w:t>
-      </w:r>
-      <w:r>
-        <w:t xml:space="preserve">. Hằng số cục bộ</w:t>
-      </w:r>
-      <w:r>
-        <w:t xml:space="preserve"> </w:t>
-      </w:r>
-      <w:r>
-        <w:rPr>
-          <w:rStyle w:val="VerbatimChar"/>
-        </w:rPr>
-        <w:t xml:space="preserve">PL_DEBOUNCE_MIN_PULSES = 18</w:t>
-      </w:r>
-      <w:r>
-        <w:t xml:space="preserve">,</w:t>
-      </w:r>
-      <w:r>
-        <w:t xml:space="preserve"> </w:t>
-      </w:r>
-      <w:r>
-        <w:rPr>
-          <w:rStyle w:val="VerbatimChar"/>
-        </w:rPr>
-        <w:t xml:space="preserve">PL_EFFECTIVE_PULSES = 18</w:t>
-      </w:r>
-      <w:r>
-        <w:t xml:space="preserve">,</w:t>
-      </w:r>
-      <w:r>
-        <w:t xml:space="preserve"> </w:t>
-      </w:r>
-      <w:r>
-        <w:rPr>
-          <w:rStyle w:val="VerbatimChar"/>
-        </w:rPr>
-        <w:t xml:space="preserve">PL_CNT_WIDTH = 5</w:t>
       </w:r>
       <w:r>
         <w:t xml:space="preserve">.</w:t>
@@ -11948,7 +11148,7 @@
         <w:pStyle w:val="Compact"/>
         <w:numPr>
           <w:ilvl w:val="0"/>
-          <w:numId w:val="1022"/>
+          <w:numId w:val="1023"/>
         </w:numPr>
       </w:pPr>
       <w:r>
@@ -11956,7 +11156,7 @@
           <w:b/>
           <w:bCs/>
         </w:rPr>
-        <w:t xml:space="preserve">Đồng bộ hóa 2 tầng:</w:t>
+        <w:t xml:space="preserve">Đồng bộ hóa 2 tầng (1 MHz):</w:t>
       </w:r>
       <w:r>
         <w:t xml:space="preserve"> </w:t>
@@ -11977,22 +11177,70 @@
         <w:t xml:space="preserve"> </w:t>
       </w:r>
       <w:r>
-        <w:t xml:space="preserve">đi qua 2 tầng Flip-Flop được lấy mẫu ở mỗi xung</w:t>
-      </w:r>
-      <w:r>
-        <w:t xml:space="preserve"> </w:t>
+        <w:t xml:space="preserve">đi qua 2 tầng Flip-Flop (</w:t>
       </w:r>
       <w:r>
         <w:rPr>
           <w:rStyle w:val="VerbatimChar"/>
         </w:rPr>
-        <w:t xml:space="preserve">clk_en</w:t>
-      </w:r>
-      <w:r>
-        <w:t xml:space="preserve"> </w:t>
-      </w:r>
-      <w:r>
-        <w:t xml:space="preserve">để chống hiện tượng bất ổn định (Metastability).</w:t>
+        <w:t xml:space="preserve">meta_btn</w:t>
+      </w:r>
+      <w:r>
+        <w:t xml:space="preserve"> </w:t>
+      </w:r>
+      <w:r>
+        <w:t xml:space="preserve">và</w:t>
+      </w:r>
+      <w:r>
+        <w:t xml:space="preserve"> </w:t>
+      </w:r>
+      <w:r>
+        <w:rPr>
+          <w:rStyle w:val="VerbatimChar"/>
+        </w:rPr>
+        <w:t xml:space="preserve">sync_btn</w:t>
+      </w:r>
+      <w:r>
+        <w:t xml:space="preserve">) có thuộc tính</w:t>
+      </w:r>
+      <w:r>
+        <w:t xml:space="preserve"> </w:t>
+      </w:r>
+      <w:r>
+        <w:rPr>
+          <w:rStyle w:val="VerbatimChar"/>
+        </w:rPr>
+        <w:t xml:space="preserve">(* ASYNC_REG = "TRUE" *)</w:t>
+      </w:r>
+      <w:r>
+        <w:t xml:space="preserve">, hoạt động trực tiếp ở xung nhịp hệ thống 1 MHz (</w:t>
+      </w:r>
+      <w:r>
+        <w:rPr>
+          <w:rStyle w:val="VerbatimChar"/>
+        </w:rPr>
+        <w:t xml:space="preserve">clk</w:t>
+      </w:r>
+      <w:r>
+        <w:t xml:space="preserve">) để giải trừ hiện tượng bất ổn định (Metastability). Tầng 1 (</w:t>
+      </w:r>
+      <w:r>
+        <w:rPr>
+          <w:rStyle w:val="VerbatimChar"/>
+        </w:rPr>
+        <w:t xml:space="preserve">meta_btn</w:t>
+      </w:r>
+      <w:r>
+        <w:t xml:space="preserve">) trực tiếp nhận tín hiệu nút bấm từ bên ngoài; tầng 2 (</w:t>
+      </w:r>
+      <w:r>
+        <w:rPr>
+          <w:rStyle w:val="VerbatimChar"/>
+        </w:rPr>
+        <w:t xml:space="preserve">sync_btn</w:t>
+      </w:r>
+      <w:r>
+        <w:t xml:space="preserve">) cung cấp mức tín hiệu ổn định đã đồng bộ hóa sang miền clock 1 MHz.</w:t>
       </w:r>
     </w:p>
     <w:p>
@@ -12000,7 +11248,7 @@
         <w:pStyle w:val="Compact"/>
         <w:numPr>
           <w:ilvl w:val="0"/>
-          <w:numId w:val="1022"/>
+          <w:numId w:val="1023"/>
         </w:numPr>
       </w:pPr>
       <w:r>
@@ -12008,13 +11256,19 @@
           <w:b/>
           <w:bCs/>
         </w:rPr>
-        <w:t xml:space="preserve">Ngưỡng dung sai ±10%:</w:t>
-      </w:r>
-      <w:r>
-        <w:t xml:space="preserve"> </w:t>
-      </w:r>
-      <w:r>
-        <w:t xml:space="preserve">Với chu kỳ 20 ms tại tần số lấy mẫu 1 kHz, số chu kỳ danh định là 20 pulses. Dải dung sai ±10% cho phép nhận diện phím hợp lệ từ 18 pulses:</w:t>
+        <w:t xml:space="preserve">Lọc rung 2 hướng (Transition Qualification Filter):</w:t>
+      </w:r>
+    </w:p>
+    <w:p>
+      <w:pPr>
+        <w:pStyle w:val="Compact"/>
+        <w:numPr>
+          <w:ilvl w:val="1"/>
+          <w:numId w:val="1024"/>
+        </w:numPr>
+      </w:pPr>
+      <w:r>
+        <w:t xml:space="preserve">Mạch theo dõi trạng thái nút bấm ổn định hiện tại qua thanh ghi</w:t>
       </w:r>
       <w:r>
         <w:t xml:space="preserve"> </w:t>
@@ -12023,7 +11277,163 @@
         <w:rPr>
           <w:rStyle w:val="VerbatimChar"/>
         </w:rPr>
-        <w:t xml:space="preserve">PL_EFFECTIVE_PULSES = P_DEBOUNCE_PULSES - floor(P_DEBOUNCE_PULSES * P_DEBOUNCE_TOL_PCT / 100) = 18 pulses (18 ms)</w:t>
+        <w:t xml:space="preserve">debounced_btn</w:t>
+      </w:r>
+      <w:r>
+        <w:t xml:space="preserve">.</w:t>
+      </w:r>
+    </w:p>
+    <w:p>
+      <w:pPr>
+        <w:pStyle w:val="Compact"/>
+        <w:numPr>
+          <w:ilvl w:val="1"/>
+          <w:numId w:val="1024"/>
+        </w:numPr>
+      </w:pPr>
+      <w:r>
+        <w:t xml:space="preserve">Khi tín hiệu đồng bộ</w:t>
+      </w:r>
+      <w:r>
+        <w:t xml:space="preserve"> </w:t>
+      </w:r>
+      <w:r>
+        <w:rPr>
+          <w:rStyle w:val="VerbatimChar"/>
+        </w:rPr>
+        <w:t xml:space="preserve">sync_btn</w:t>
+      </w:r>
+      <w:r>
+        <w:t xml:space="preserve"> </w:t>
+      </w:r>
+      <w:r>
+        <w:t xml:space="preserve">trùng với</w:t>
+      </w:r>
+      <w:r>
+        <w:t xml:space="preserve"> </w:t>
+      </w:r>
+      <w:r>
+        <w:rPr>
+          <w:rStyle w:val="VerbatimChar"/>
+        </w:rPr>
+        <w:t xml:space="preserve">debounced_btn</w:t>
+      </w:r>
+      <w:r>
+        <w:t xml:space="preserve"> </w:t>
+      </w:r>
+      <w:r>
+        <w:t xml:space="preserve">(không có chuyển trạng thái), bộ đếm</w:t>
+      </w:r>
+      <w:r>
+        <w:t xml:space="preserve"> </w:t>
+      </w:r>
+      <w:r>
+        <w:rPr>
+          <w:rStyle w:val="VerbatimChar"/>
+        </w:rPr>
+        <w:t xml:space="preserve">timer_cnt</w:t>
+      </w:r>
+      <w:r>
+        <w:t xml:space="preserve"> </w:t>
+      </w:r>
+      <w:r>
+        <w:t xml:space="preserve">được giữ ở 0.</w:t>
+      </w:r>
+    </w:p>
+    <w:p>
+      <w:pPr>
+        <w:pStyle w:val="Compact"/>
+        <w:numPr>
+          <w:ilvl w:val="1"/>
+          <w:numId w:val="1024"/>
+        </w:numPr>
+      </w:pPr>
+      <w:r>
+        <w:t xml:space="preserve">Khi</w:t>
+      </w:r>
+      <w:r>
+        <w:t xml:space="preserve"> </w:t>
+      </w:r>
+      <w:r>
+        <w:rPr>
+          <w:rStyle w:val="VerbatimChar"/>
+        </w:rPr>
+        <w:t xml:space="preserve">sync_btn</w:t>
+      </w:r>
+      <w:r>
+        <w:t xml:space="preserve"> </w:t>
+      </w:r>
+      <w:r>
+        <w:t xml:space="preserve">khác</w:t>
+      </w:r>
+      <w:r>
+        <w:t xml:space="preserve"> </w:t>
+      </w:r>
+      <w:r>
+        <w:rPr>
+          <w:rStyle w:val="VerbatimChar"/>
+        </w:rPr>
+        <w:t xml:space="preserve">debounced_btn</w:t>
+      </w:r>
+      <w:r>
+        <w:t xml:space="preserve">, bộ đếm</w:t>
+      </w:r>
+      <w:r>
+        <w:t xml:space="preserve"> </w:t>
+      </w:r>
+      <w:r>
+        <w:rPr>
+          <w:rStyle w:val="VerbatimChar"/>
+        </w:rPr>
+        <w:t xml:space="preserve">timer_cnt</w:t>
+      </w:r>
+      <w:r>
+        <w:t xml:space="preserve"> </w:t>
+      </w:r>
+      <w:r>
+        <w:t xml:space="preserve">đếm các xung kích hoạt</w:t>
+      </w:r>
+      <w:r>
+        <w:t xml:space="preserve"> </w:t>
+      </w:r>
+      <w:r>
+        <w:rPr>
+          <w:rStyle w:val="VerbatimChar"/>
+        </w:rPr>
+        <w:t xml:space="preserve">clk_en</w:t>
+      </w:r>
+      <w:r>
+        <w:t xml:space="preserve"> </w:t>
+      </w:r>
+      <w:r>
+        <w:t xml:space="preserve">(1 kHz). Yêu cầu</w:t>
+      </w:r>
+      <w:r>
+        <w:t xml:space="preserve"> </w:t>
+      </w:r>
+      <w:r>
+        <w:rPr>
+          <w:rStyle w:val="VerbatimChar"/>
+        </w:rPr>
+        <w:t xml:space="preserve">P_DEBOUNCE_PULSES</w:t>
+      </w:r>
+      <w:r>
+        <w:t xml:space="preserve"> </w:t>
+      </w:r>
+      <w:r>
+        <w:t xml:space="preserve">mẫu liên tục (đếm từ 0 đến</w:t>
+      </w:r>
+      <w:r>
+        <w:t xml:space="preserve"> </w:t>
+      </w:r>
+      <w:r>
+        <w:rPr>
+          <w:rStyle w:val="VerbatimChar"/>
+        </w:rPr>
+        <w:t xml:space="preserve">COUNT_LIMIT = P_DEBOUNCE_PULSES - 1</w:t>
+      </w:r>
+      <w:r>
+        <w:t xml:space="preserve">) để xác nhận chuyển đổi trạng thái mới (áp dụng cho cả sườn lên khi nhấn và sườn xuống khi nhả phím).</w:t>
       </w:r>
     </w:p>
     <w:p>
@@ -12031,7 +11441,7 @@
         <w:pStyle w:val="Compact"/>
         <w:numPr>
           <w:ilvl w:val="0"/>
-          <w:numId w:val="1022"/>
+          <w:numId w:val="1023"/>
         </w:numPr>
       </w:pPr>
       <w:r>
@@ -12039,13 +11449,25 @@
           <w:b/>
           <w:bCs/>
         </w:rPr>
-        <w:t xml:space="preserve">Loại bỏ nhiễu rung (&lt; 18 ms):</w:t>
-      </w:r>
-      <w:r>
-        <w:t xml:space="preserve"> </w:t>
-      </w:r>
-      <w:r>
-        <w:t xml:space="preserve">Nếu phím bị nhả trước khi bộ đếm 5-bit đạt 17 (đếm từ 0 .. 17 là 18 pulses), bộ đếm lập tức bị xóa về 0, không phát xung.</w:t>
+        <w:t xml:space="preserve">Loại bỏ xung nhiễu glitch (&lt; 20 ms):</w:t>
+      </w:r>
+      <w:r>
+        <w:t xml:space="preserve"> </w:t>
+      </w:r>
+      <w:r>
+        <w:t xml:space="preserve">Bất kỳ xung nhiễu nào có độ rộng nhỏ hơn 20 ms đều bị reset bộ đếm về 0 ngay khi tín hiệu trả về trạng thái cũ, không làm thay đổi</w:t>
+      </w:r>
+      <w:r>
+        <w:t xml:space="preserve"> </w:t>
+      </w:r>
+      <w:r>
+        <w:rPr>
+          <w:rStyle w:val="VerbatimChar"/>
+        </w:rPr>
+        <w:t xml:space="preserve">debounced_btn</w:t>
+      </w:r>
+      <w:r>
+        <w:t xml:space="preserve">.</w:t>
       </w:r>
     </w:p>
     <w:p>
@@ -12053,7 +11475,7 @@
         <w:pStyle w:val="Compact"/>
         <w:numPr>
           <w:ilvl w:val="0"/>
-          <w:numId w:val="1022"/>
+          <w:numId w:val="1023"/>
         </w:numPr>
       </w:pPr>
       <w:r>
@@ -12061,28 +11483,85 @@
           <w:b/>
           <w:bCs/>
         </w:rPr>
-        <w:t xml:space="preserve">Auto-Repeat (&gt;= 18 ms):</w:t>
-      </w:r>
-      <w:r>
-        <w:t xml:space="preserve"> </w:t>
-      </w:r>
-      <w:r>
-        <w:t xml:space="preserve">Khi bộ đếm đạt 17, mạch phát xung</w:t>
-      </w:r>
-      <w:r>
-        <w:t xml:space="preserve"> </w:t>
+        <w:t xml:space="preserve">Phát xung sự kiện (Event Generation):</w:t>
+      </w:r>
+      <w:r>
+        <w:t xml:space="preserve"> </w:t>
+      </w:r>
+      <w:r>
+        <w:t xml:space="preserve">Khi đạt đủ 20 mẫu liên tục của một lần nhấn phím hợp lệ (</w:t>
       </w:r>
       <w:r>
         <w:rPr>
           <w:rStyle w:val="VerbatimChar"/>
         </w:rPr>
+        <w:t xml:space="preserve">sync_btn == 1'b1</w:t>
+      </w:r>
+      <w:r>
+        <w:t xml:space="preserve">), mạch cập nhật</w:t>
+      </w:r>
+      <w:r>
+        <w:t xml:space="preserve"> </w:t>
+      </w:r>
+      <w:r>
+        <w:rPr>
+          <w:rStyle w:val="VerbatimChar"/>
+        </w:rPr>
+        <w:t xml:space="preserve">debounced_btn &lt;= 1'b1</w:t>
+      </w:r>
+      <w:r>
+        <w:t xml:space="preserve">, xóa</w:t>
+      </w:r>
+      <w:r>
+        <w:t xml:space="preserve"> </w:t>
+      </w:r>
+      <w:r>
+        <w:rPr>
+          <w:rStyle w:val="VerbatimChar"/>
+        </w:rPr>
+        <w:t xml:space="preserve">timer_cnt &lt;= '0'</w:t>
+      </w:r>
+      <w:r>
+        <w:t xml:space="preserve">, và đồng thời phát xung sự kiện</w:t>
+      </w:r>
+      <w:r>
+        <w:t xml:space="preserve"> </w:t>
+      </w:r>
+      <w:r>
+        <w:rPr>
+          <w:rStyle w:val="VerbatimChar"/>
+        </w:rPr>
         <w:t xml:space="preserve">btn_event = 1</w:t>
       </w:r>
       <w:r>
         <w:t xml:space="preserve"> </w:t>
       </w:r>
       <w:r>
-        <w:t xml:space="preserve">độ rộng đúng 1 chu kỳ clock 1 MHz. Nếu người dùng tiếp tục giữ phím, bộ đếm tự động reset về 0 và tiếp tục đếm lại 18 pulses để phát xung lặp lại tuần hoàn đều đặn.</w:t>
+        <w:t xml:space="preserve">độ rộng đúng 1 chu kỳ clock 1 MHz. Khi nhả phím (</w:t>
+      </w:r>
+      <w:r>
+        <w:rPr>
+          <w:rStyle w:val="VerbatimChar"/>
+        </w:rPr>
+        <w:t xml:space="preserve">sync_btn == 1'b0</w:t>
+      </w:r>
+      <w:r>
+        <w:t xml:space="preserve">), mạch chỉ cập nhật</w:t>
+      </w:r>
+      <w:r>
+        <w:t xml:space="preserve"> </w:t>
+      </w:r>
+      <w:r>
+        <w:rPr>
+          <w:rStyle w:val="VerbatimChar"/>
+        </w:rPr>
+        <w:t xml:space="preserve">debounced_btn &lt;= 1'b0</w:t>
+      </w:r>
+      <w:r>
+        <w:t xml:space="preserve"> </w:t>
+      </w:r>
+      <w:r>
+        <w:t xml:space="preserve">và không phát xung sự kiện (không Auto-Repeat).</w:t>
       </w:r>
     </w:p>
     <w:bookmarkEnd w:id="69"/>
@@ -12100,7 +11579,7 @@
         <w:pStyle w:val="FirstParagraph"/>
       </w:pPr>
       <w:r>
-        <w:t xml:space="preserve">Giản đồ thời gian lọc rung phím, loại bỏ xung nhiễu ngắn và phát xung auto-repeat:</w:t>
+        <w:t xml:space="preserve">Giản đồ thời gian lọc rung phím 2 chiều, loại bỏ xung nhiễu ngắn và phát xung sự kiện đơn chu kỳ:</w:t>
       </w:r>
     </w:p>
     <w:p>
@@ -12110,7 +11589,7 @@
       <w:r>
         <w:drawing>
           <wp:inline>
-            <wp:extent cx="5334000" cy="1472184"/>
+            <wp:extent cx="5334000" cy="1665514"/>
             <wp:effectExtent b="0" l="0" r="0" t="0"/>
             <wp:docPr descr="Hình 3.3.4: Giản đồ xung lọc nhiễu glitch và phát xung kích hoạt button_debouncer (WaveDrom)" title="" id="71" name="Picture"/>
             <a:graphic>
@@ -12131,7 +11610,7 @@
                   <pic:spPr bwMode="auto">
                     <a:xfrm>
                       <a:off x="0" y="0"/>
-                      <a:ext cx="5334000" cy="1472184"/>
+                      <a:ext cx="5334000" cy="1665514"/>
                     </a:xfrm>
                     <a:prstGeom prst="rect">
                       <a:avLst/>
@@ -12651,19 +12130,22 @@
               <w:jc w:val="center"/>
             </w:pPr>
             <w:r>
-              <w:t xml:space="preserve">Sync</w:t>
-            </w:r>
-          </w:p>
-        </w:tc>
-        <w:tc>
-          <w:tcPr/>
-          <w:p>
-            <w:pPr>
-              <w:pStyle w:val="Compact"/>
-              <w:jc w:val="left"/>
-            </w:pPr>
-            <w:r>
-              <w:t xml:space="preserve">Reset đồng bộ, tích cực mức thấp (</w:t>
+              <w:t xml:space="preserve">Async (Sync Deassert)</w:t>
+            </w:r>
+          </w:p>
+        </w:tc>
+        <w:tc>
+          <w:tcPr/>
+          <w:p>
+            <w:pPr>
+              <w:pStyle w:val="Compact"/>
+              <w:jc w:val="left"/>
+            </w:pPr>
+            <w:r>
+              <w:t xml:space="preserve">Reset bất đồng bộ tích cực thấp (từ</w:t>
+            </w:r>
+            <w:r>
+              <w:t xml:space="preserve"> </w:t>
             </w:r>
             <w:r>
               <w:rPr>
@@ -13505,7 +12987,7 @@
         <w:pStyle w:val="Compact"/>
         <w:numPr>
           <w:ilvl w:val="0"/>
-          <w:numId w:val="1023"/>
+          <w:numId w:val="1025"/>
         </w:numPr>
       </w:pPr>
       <w:r>
@@ -13523,18 +13005,6 @@
           <w:rStyle w:val="VerbatimChar"/>
         </w:rPr>
         <w:t xml:space="preserve">P_DEBOUNCE_PULSES = 20</w:t>
-      </w:r>
-      <w:r>
-        <w:t xml:space="preserve">,</w:t>
-      </w:r>
-      <w:r>
-        <w:t xml:space="preserve"> </w:t>
-      </w:r>
-      <w:r>
-        <w:rPr>
-          <w:rStyle w:val="VerbatimChar"/>
-        </w:rPr>
-        <w:t xml:space="preserve">P_DEBOUNCE_TOL_PCT = 10</w:t>
       </w:r>
       <w:r>
         <w:t xml:space="preserve">.</w:t>
@@ -13545,7 +13015,7 @@
         <w:pStyle w:val="Compact"/>
         <w:numPr>
           <w:ilvl w:val="0"/>
-          <w:numId w:val="1023"/>
+          <w:numId w:val="1025"/>
         </w:numPr>
       </w:pPr>
       <w:r>
@@ -13572,7 +13042,7 @@
         <w:pStyle w:val="Compact"/>
         <w:numPr>
           <w:ilvl w:val="0"/>
-          <w:numId w:val="1023"/>
+          <w:numId w:val="1025"/>
         </w:numPr>
       </w:pPr>
       <w:r>
@@ -13667,7 +13137,7 @@
       <w:r>
         <w:drawing>
           <wp:inline>
-            <wp:extent cx="5334000" cy="1388852"/>
+            <wp:extent cx="5334000" cy="1600200"/>
             <wp:effectExtent b="0" l="0" r="0" t="0"/>
             <wp:docPr descr="Hình 3.4.4: Giản đồ thời gian căn chỉnh xung nút bấm 1MHz của button_controller (WaveDrom)" title="" id="81" name="Picture"/>
             <a:graphic>
@@ -13688,7 +13158,7 @@
                   <pic:spPr bwMode="auto">
                     <a:xfrm>
                       <a:off x="0" y="0"/>
-                      <a:ext cx="5334000" cy="1388852"/>
+                      <a:ext cx="5334000" cy="1600200"/>
                     </a:xfrm>
                     <a:prstGeom prst="rect">
                       <a:avLst/>
@@ -13757,7 +13227,7 @@
         <w:t xml:space="preserve"> </w:t>
       </w:r>
       <w:r>
-        <w:t xml:space="preserve">FSM điều khiển 4 chế độ hoạt động, quản lý bộ đệm chỉnh giờ độc lập (</w:t>
+        <w:t xml:space="preserve">FSM điều khiển 4 chế độ hoạt động tuân thủ kiến trúc chuẩn 3-always-block (State FF, Next-State Comb, Datapath FF), quản lý bộ đệm chỉnh giờ độc lập (</w:t>
       </w:r>
       <w:r>
         <w:rPr>
@@ -14178,19 +13648,22 @@
               <w:jc w:val="center"/>
             </w:pPr>
             <w:r>
-              <w:t xml:space="preserve">Sync</w:t>
-            </w:r>
-          </w:p>
-        </w:tc>
-        <w:tc>
-          <w:tcPr/>
-          <w:p>
-            <w:pPr>
-              <w:pStyle w:val="Compact"/>
-              <w:jc w:val="left"/>
-            </w:pPr>
-            <w:r>
-              <w:t xml:space="preserve">Reset đồng bộ, tích cực mức thấp (</w:t>
+              <w:t xml:space="preserve">Async (Sync Deassert)</w:t>
+            </w:r>
+          </w:p>
+        </w:tc>
+        <w:tc>
+          <w:tcPr/>
+          <w:p>
+            <w:pPr>
+              <w:pStyle w:val="Compact"/>
+              <w:jc w:val="left"/>
+            </w:pPr>
+            <w:r>
+              <w:t xml:space="preserve">Reset bất đồng bộ tích cực thấp (từ</w:t>
+            </w:r>
+            <w:r>
+              <w:t xml:space="preserve"> </w:t>
             </w:r>
             <w:r>
               <w:rPr>
@@ -15607,13 +15080,13 @@
       </w:r>
     </w:p>
     <w:bookmarkEnd w:id="89"/>
-    <w:bookmarkStart w:id="90" w:name="Xc8f1e7bd94f926cb2aa61088509a86926f88034"/>
+    <w:bookmarkStart w:id="90" w:name="X91b28a37a87d2a20a723687a235fa073c917e27"/>
     <w:p>
       <w:pPr>
         <w:pStyle w:val="Heading3"/>
       </w:pPr>
       <w:r>
-        <w:t xml:space="preserve">3.5.3 Bảng chuyển trạng thái FSM kết hợp Timeout 5s &amp; Buffer Chỉnh Giờ (FSM Table)</w:t>
+        <w:t xml:space="preserve">3.5.3 Nguyên lý hoạt động (Operating Principle)</w:t>
       </w:r>
     </w:p>
     <w:p>
@@ -17167,7 +16640,359 @@
           <w:i/>
           <w:iCs/>
         </w:rPr>
-        <w:t xml:space="preserve">Ghi chú: Bộ đếm timeout 5s tự động xóa về 0 mỗi khi người dùng có thao tác bấm phím UP hoặc DOWN (Keep-alive). Tham số cấu hình: P_TIMEOUT_SEC = 5, P_SEC_WIDTH = 6, P_MIN_WIDTH = 6, P_HOUR_WIDTH = 5; Hằng số cục bộ PL_TIMEOUT_CNT_WIDTH = 3.</w:t>
+        <w:t xml:space="preserve">Ghi chú: Bộ đếm timeout 5s tự động xóa về 0 mỗi khi người dùng có thao tác bấm phím UP hoặc DOWN (Keep-alive). Tham số cấu hình: P_TIMEOUT_SEC = 5; Hằng số cục bộ PL_TIMEOUT_CNT_WIDTH = 3.</w:t>
+      </w:r>
+    </w:p>
+    <w:p>
+      <w:pPr>
+        <w:pStyle w:val="Compact"/>
+        <w:numPr>
+          <w:ilvl w:val="0"/>
+          <w:numId w:val="1026"/>
+        </w:numPr>
+      </w:pPr>
+      <w:r>
+        <w:rPr>
+          <w:b/>
+          <w:bCs/>
+        </w:rPr>
+        <w:t xml:space="preserve">Kiến trúc FSM Chuẩn 3 Always Blocks (3-Always-Block Architecture):</w:t>
+      </w:r>
+    </w:p>
+    <w:p>
+      <w:pPr>
+        <w:pStyle w:val="Compact"/>
+        <w:numPr>
+          <w:ilvl w:val="1"/>
+          <w:numId w:val="1027"/>
+        </w:numPr>
+      </w:pPr>
+      <w:r>
+        <w:rPr>
+          <w:b/>
+          <w:bCs/>
+        </w:rPr>
+        <w:t xml:space="preserve">Khối 1 (State Register Sequential Logic -</w:t>
+      </w:r>
+      <w:r>
+        <w:rPr>
+          <w:b/>
+          <w:bCs/>
+        </w:rPr>
+        <w:t xml:space="preserve"> </w:t>
+      </w:r>
+      <w:r>
+        <w:rPr>
+          <w:rStyle w:val="VerbatimChar"/>
+          <w:b/>
+          <w:bCs/>
+        </w:rPr>
+        <w:t xml:space="preserve">always_ff @(posedge clk or negedge rstn)</w:t>
+      </w:r>
+      <w:r>
+        <w:rPr>
+          <w:b/>
+          <w:bCs/>
+        </w:rPr>
+        <w:t xml:space="preserve">):</w:t>
+      </w:r>
+      <w:r>
+        <w:t xml:space="preserve"> </w:t>
+      </w:r>
+      <w:r>
+        <w:t xml:space="preserve">Chốt trạng thái hoạt động hiện tại</w:t>
+      </w:r>
+      <w:r>
+        <w:t xml:space="preserve"> </w:t>
+      </w:r>
+      <w:r>
+        <w:rPr>
+          <w:rStyle w:val="VerbatimChar"/>
+        </w:rPr>
+        <w:t xml:space="preserve">state_reg &lt;= state_next</w:t>
+      </w:r>
+      <w:r>
+        <w:t xml:space="preserve">. Khi reset bất đồng bộ (</w:t>
+      </w:r>
+      <w:r>
+        <w:rPr>
+          <w:rStyle w:val="VerbatimChar"/>
+        </w:rPr>
+        <w:t xml:space="preserve">!rstn</w:t>
+      </w:r>
+      <w:r>
+        <w:t xml:space="preserve">),</w:t>
+      </w:r>
+      <w:r>
+        <w:t xml:space="preserve"> </w:t>
+      </w:r>
+      <w:r>
+        <w:rPr>
+          <w:rStyle w:val="VerbatimChar"/>
+        </w:rPr>
+        <w:t xml:space="preserve">state_reg</w:t>
+      </w:r>
+      <w:r>
+        <w:t xml:space="preserve"> </w:t>
+      </w:r>
+      <w:r>
+        <w:t xml:space="preserve">được khởi tạo về</w:t>
+      </w:r>
+      <w:r>
+        <w:t xml:space="preserve"> </w:t>
+      </w:r>
+      <w:r>
+        <w:rPr>
+          <w:rStyle w:val="VerbatimChar"/>
+        </w:rPr>
+        <w:t xml:space="preserve">MODE_RUN</w:t>
+      </w:r>
+      <w:r>
+        <w:t xml:space="preserve">.</w:t>
+      </w:r>
+    </w:p>
+    <w:p>
+      <w:pPr>
+        <w:pStyle w:val="Compact"/>
+        <w:numPr>
+          <w:ilvl w:val="1"/>
+          <w:numId w:val="1027"/>
+        </w:numPr>
+      </w:pPr>
+      <w:r>
+        <w:rPr>
+          <w:b/>
+          <w:bCs/>
+        </w:rPr>
+        <w:t xml:space="preserve">Khối 2 (Next-State Combinational Logic -</w:t>
+      </w:r>
+      <w:r>
+        <w:rPr>
+          <w:b/>
+          <w:bCs/>
+        </w:rPr>
+        <w:t xml:space="preserve"> </w:t>
+      </w:r>
+      <w:r>
+        <w:rPr>
+          <w:rStyle w:val="VerbatimChar"/>
+          <w:b/>
+          <w:bCs/>
+        </w:rPr>
+        <w:t xml:space="preserve">always_comb</w:t>
+      </w:r>
+      <w:r>
+        <w:rPr>
+          <w:b/>
+          <w:bCs/>
+        </w:rPr>
+        <w:t xml:space="preserve">):</w:t>
+      </w:r>
+      <w:r>
+        <w:t xml:space="preserve"> </w:t>
+      </w:r>
+      <w:r>
+        <w:t xml:space="preserve">Tính toán logic chuyển trạng thái</w:t>
+      </w:r>
+      <w:r>
+        <w:t xml:space="preserve"> </w:t>
+      </w:r>
+      <w:r>
+        <w:rPr>
+          <w:rStyle w:val="VerbatimChar"/>
+        </w:rPr>
+        <w:t xml:space="preserve">state_next</w:t>
+      </w:r>
+      <w:r>
+        <w:t xml:space="preserve"> </w:t>
+      </w:r>
+      <w:r>
+        <w:t xml:space="preserve">từ</w:t>
+      </w:r>
+      <w:r>
+        <w:t xml:space="preserve"> </w:t>
+      </w:r>
+      <w:r>
+        <w:rPr>
+          <w:rStyle w:val="VerbatimChar"/>
+        </w:rPr>
+        <w:t xml:space="preserve">state_reg</w:t>
+      </w:r>
+      <w:r>
+        <w:t xml:space="preserve">, các xung nút bấm (</w:t>
+      </w:r>
+      <w:r>
+        <w:rPr>
+          <w:rStyle w:val="VerbatimChar"/>
+        </w:rPr>
+        <w:t xml:space="preserve">sel_pulse</w:t>
+      </w:r>
+      <w:r>
+        <w:t xml:space="preserve">,</w:t>
+      </w:r>
+      <w:r>
+        <w:t xml:space="preserve"> </w:t>
+      </w:r>
+      <w:r>
+        <w:rPr>
+          <w:rStyle w:val="VerbatimChar"/>
+        </w:rPr>
+        <w:t xml:space="preserve">any_button</w:t>
+      </w:r>
+      <w:r>
+        <w:t xml:space="preserve">), xung nhịp 1 giây (</w:t>
+      </w:r>
+      <w:r>
+        <w:rPr>
+          <w:rStyle w:val="VerbatimChar"/>
+        </w:rPr>
+        <w:t xml:space="preserve">sec_pulse</w:t>
+      </w:r>
+      <w:r>
+        <w:t xml:space="preserve">), và trạng thái bộ đếm timeout (</w:t>
+      </w:r>
+      <w:r>
+        <w:rPr>
+          <w:rStyle w:val="VerbatimChar"/>
+        </w:rPr>
+        <w:t xml:space="preserve">timeout_cnt &gt;= P_TIMEOUT_SEC - 1</w:t>
+      </w:r>
+      <w:r>
+        <w:t xml:space="preserve">). Mặc định gán</w:t>
+      </w:r>
+      <w:r>
+        <w:t xml:space="preserve"> </w:t>
+      </w:r>
+      <w:r>
+        <w:rPr>
+          <w:rStyle w:val="VerbatimChar"/>
+        </w:rPr>
+        <w:t xml:space="preserve">state_next = state_reg</w:t>
+      </w:r>
+      <w:r>
+        <w:t xml:space="preserve"> </w:t>
+      </w:r>
+      <w:r>
+        <w:t xml:space="preserve">tránh tạo latch.</w:t>
+      </w:r>
+    </w:p>
+    <w:p>
+      <w:pPr>
+        <w:pStyle w:val="Compact"/>
+        <w:numPr>
+          <w:ilvl w:val="1"/>
+          <w:numId w:val="1027"/>
+        </w:numPr>
+      </w:pPr>
+      <w:r>
+        <w:rPr>
+          <w:b/>
+          <w:bCs/>
+        </w:rPr>
+        <w:t xml:space="preserve">Khối 3 (Datapath &amp; Registered Outputs Sequential Logic -</w:t>
+      </w:r>
+      <w:r>
+        <w:rPr>
+          <w:b/>
+          <w:bCs/>
+        </w:rPr>
+        <w:t xml:space="preserve"> </w:t>
+      </w:r>
+      <w:r>
+        <w:rPr>
+          <w:rStyle w:val="VerbatimChar"/>
+          <w:b/>
+          <w:bCs/>
+        </w:rPr>
+        <w:t xml:space="preserve">always_ff @(posedge clk or negedge rstn)</w:t>
+      </w:r>
+      <w:r>
+        <w:rPr>
+          <w:b/>
+          <w:bCs/>
+        </w:rPr>
+        <w:t xml:space="preserve">):</w:t>
+      </w:r>
+      <w:r>
+        <w:t xml:space="preserve"> </w:t>
+      </w:r>
+      <w:r>
+        <w:t xml:space="preserve">Cập nhật toàn bộ các thanh ghi dữ liệu đệm chỉnh sửa (</w:t>
+      </w:r>
+      <w:r>
+        <w:rPr>
+          <w:rStyle w:val="VerbatimChar"/>
+        </w:rPr>
+        <w:t xml:space="preserve">r_adj_sec</w:t>
+      </w:r>
+      <w:r>
+        <w:t xml:space="preserve">,</w:t>
+      </w:r>
+      <w:r>
+        <w:t xml:space="preserve"> </w:t>
+      </w:r>
+      <w:r>
+        <w:rPr>
+          <w:rStyle w:val="VerbatimChar"/>
+        </w:rPr>
+        <w:t xml:space="preserve">r_adj_min</w:t>
+      </w:r>
+      <w:r>
+        <w:t xml:space="preserve">,</w:t>
+      </w:r>
+      <w:r>
+        <w:t xml:space="preserve"> </w:t>
+      </w:r>
+      <w:r>
+        <w:rPr>
+          <w:rStyle w:val="VerbatimChar"/>
+        </w:rPr>
+        <w:t xml:space="preserve">r_adj_hour</w:t>
+      </w:r>
+      <w:r>
+        <w:t xml:space="preserve">), bộ đếm thời gian chờ</w:t>
+      </w:r>
+      <w:r>
+        <w:t xml:space="preserve"> </w:t>
+      </w:r>
+      <w:r>
+        <w:rPr>
+          <w:rStyle w:val="VerbatimChar"/>
+        </w:rPr>
+        <w:t xml:space="preserve">timeout_cnt</w:t>
+      </w:r>
+      <w:r>
+        <w:t xml:space="preserve">, và xung nạp đồng bộ</w:t>
+      </w:r>
+      <w:r>
+        <w:t xml:space="preserve"> </w:t>
+      </w:r>
+      <w:r>
+        <w:rPr>
+          <w:rStyle w:val="VerbatimChar"/>
+        </w:rPr>
+        <w:t xml:space="preserve">r_load_en</w:t>
+      </w:r>
+      <w:r>
+        <w:t xml:space="preserve"> </w:t>
+      </w:r>
+      <w:r>
+        <w:t xml:space="preserve">(mặc định xóa về</w:t>
+      </w:r>
+      <w:r>
+        <w:t xml:space="preserve"> </w:t>
+      </w:r>
+      <w:r>
+        <w:rPr>
+          <w:rStyle w:val="VerbatimChar"/>
+        </w:rPr>
+        <w:t xml:space="preserve">0</w:t>
+      </w:r>
+      <w:r>
+        <w:t xml:space="preserve"> </w:t>
+      </w:r>
+      <w:r>
+        <w:t xml:space="preserve">sau 1 chu kỳ clock).</w:t>
       </w:r>
     </w:p>
     <w:bookmarkEnd w:id="90"/>
@@ -17712,19 +17537,22 @@
               <w:jc w:val="center"/>
             </w:pPr>
             <w:r>
-              <w:t xml:space="preserve">Sync</w:t>
-            </w:r>
-          </w:p>
-        </w:tc>
-        <w:tc>
-          <w:tcPr/>
-          <w:p>
-            <w:pPr>
-              <w:pStyle w:val="Compact"/>
-              <w:jc w:val="left"/>
-            </w:pPr>
-            <w:r>
-              <w:t xml:space="preserve">Reset đồng bộ, tích cực mức thấp (</w:t>
+              <w:t xml:space="preserve">Async (Sync Deassert)</w:t>
+            </w:r>
+          </w:p>
+        </w:tc>
+        <w:tc>
+          <w:tcPr/>
+          <w:p>
+            <w:pPr>
+              <w:pStyle w:val="Compact"/>
+              <w:jc w:val="left"/>
+            </w:pPr>
+            <w:r>
+              <w:t xml:space="preserve">Reset bất đồng bộ tích cực thấp (từ</w:t>
+            </w:r>
+            <w:r>
+              <w:t xml:space="preserve"> </w:t>
             </w:r>
             <w:r>
               <w:rPr>
@@ -18355,11 +18183,11 @@
           <w:i/>
           <w:iCs/>
         </w:rPr>
-        <w:t xml:space="preserve">Ghi chú: Cờ sec_rollover bị khóa (gated = 0) khi load_en = 1 để tránh kích hoạt nhảy phút ngoài ý muốn khi nạp thời gian. Tham số cấu hình: P_SEC_WIDTH = 6.</w:t>
+        <w:t xml:space="preserve">Ghi chú: Cờ sec_rollover bị khóa (gated = 0) khi load_en = 1 để tránh kích hoạt nhảy phút ngoài ý muốn khi nạp thời gian. Độ rộng bus dữ liệu được cố định trực tiếp 6-bit [5:0].</w:t>
       </w:r>
     </w:p>
     <w:bookmarkEnd w:id="100"/>
-    <w:bookmarkStart w:id="101" w:name="X91b28a37a87d2a20a723687a235fa073c917e27"/>
+    <w:bookmarkStart w:id="101" w:name="X4cb421e8a7ac37d635df4294edf8bb5a49d7afc"/>
     <w:p>
       <w:pPr>
         <w:pStyle w:val="Heading3"/>
@@ -18373,7 +18201,7 @@
         <w:pStyle w:val="Compact"/>
         <w:numPr>
           <w:ilvl w:val="0"/>
-          <w:numId w:val="1024"/>
+          <w:numId w:val="1028"/>
         </w:numPr>
       </w:pPr>
       <w:r>
@@ -18419,7 +18247,7 @@
         <w:pStyle w:val="Compact"/>
         <w:numPr>
           <w:ilvl w:val="0"/>
-          <w:numId w:val="1024"/>
+          <w:numId w:val="1028"/>
         </w:numPr>
       </w:pPr>
       <w:r>
@@ -18465,7 +18293,7 @@
         <w:pStyle w:val="Compact"/>
         <w:numPr>
           <w:ilvl w:val="0"/>
-          <w:numId w:val="1024"/>
+          <w:numId w:val="1028"/>
         </w:numPr>
       </w:pPr>
       <w:r>
@@ -19042,19 +18870,22 @@
               <w:jc w:val="center"/>
             </w:pPr>
             <w:r>
-              <w:t xml:space="preserve">Sync</w:t>
-            </w:r>
-          </w:p>
-        </w:tc>
-        <w:tc>
-          <w:tcPr/>
-          <w:p>
-            <w:pPr>
-              <w:pStyle w:val="Compact"/>
-              <w:jc w:val="left"/>
-            </w:pPr>
-            <w:r>
-              <w:t xml:space="preserve">Reset đồng bộ, tích cực mức thấp (</w:t>
+              <w:t xml:space="preserve">Async (Sync Deassert)</w:t>
+            </w:r>
+          </w:p>
+        </w:tc>
+        <w:tc>
+          <w:tcPr/>
+          <w:p>
+            <w:pPr>
+              <w:pStyle w:val="Compact"/>
+              <w:jc w:val="left"/>
+            </w:pPr>
+            <w:r>
+              <w:t xml:space="preserve">Reset bất đồng bộ tích cực thấp (từ</w:t>
+            </w:r>
+            <w:r>
+              <w:t xml:space="preserve"> </w:t>
             </w:r>
             <w:r>
               <w:rPr>
@@ -19685,11 +19516,11 @@
           <w:i/>
           <w:iCs/>
         </w:rPr>
-        <w:t xml:space="preserve">Ghi chú: Bộ đếm phút tăng 1 đơn vị mỗi khi nhận xung sec_rollover từ second_counter và nạp đè song song khi có load_en = 1. Tham số cấu hình: P_MIN_WIDTH = 6.</w:t>
+        <w:t xml:space="preserve">Ghi chú: Bộ đếm phút tăng 1 đơn vị mỗi khi nhận xung sec_rollover từ second_counter và nạp đè song song khi có load_en = 1. Độ rộng bus dữ liệu được cố định trực tiếp 6-bit [5:0].</w:t>
       </w:r>
     </w:p>
     <w:bookmarkEnd w:id="111"/>
-    <w:bookmarkStart w:id="112" w:name="X4cb421e8a7ac37d635df4294edf8bb5a49d7afc"/>
+    <w:bookmarkStart w:id="112" w:name="Xbd2541b096dad5648a671cdf8422c06a251b7ae"/>
     <w:p>
       <w:pPr>
         <w:pStyle w:val="Heading3"/>
@@ -19703,7 +19534,7 @@
         <w:pStyle w:val="Compact"/>
         <w:numPr>
           <w:ilvl w:val="0"/>
-          <w:numId w:val="1025"/>
+          <w:numId w:val="1029"/>
         </w:numPr>
       </w:pPr>
       <w:r>
@@ -19749,7 +19580,7 @@
         <w:pStyle w:val="Compact"/>
         <w:numPr>
           <w:ilvl w:val="0"/>
-          <w:numId w:val="1025"/>
+          <w:numId w:val="1029"/>
         </w:numPr>
       </w:pPr>
       <w:r>
@@ -19795,7 +19626,7 @@
         <w:pStyle w:val="Compact"/>
         <w:numPr>
           <w:ilvl w:val="0"/>
-          <w:numId w:val="1025"/>
+          <w:numId w:val="1029"/>
         </w:numPr>
       </w:pPr>
       <w:r>
@@ -20384,19 +20215,22 @@
               <w:jc w:val="center"/>
             </w:pPr>
             <w:r>
-              <w:t xml:space="preserve">Sync</w:t>
-            </w:r>
-          </w:p>
-        </w:tc>
-        <w:tc>
-          <w:tcPr/>
-          <w:p>
-            <w:pPr>
-              <w:pStyle w:val="Compact"/>
-              <w:jc w:val="left"/>
-            </w:pPr>
-            <w:r>
-              <w:t xml:space="preserve">Reset đồng bộ, tích cực mức thấp (</w:t>
+              <w:t xml:space="preserve">Async (Sync Deassert)</w:t>
+            </w:r>
+          </w:p>
+        </w:tc>
+        <w:tc>
+          <w:tcPr/>
+          <w:p>
+            <w:pPr>
+              <w:pStyle w:val="Compact"/>
+              <w:jc w:val="left"/>
+            </w:pPr>
+            <w:r>
+              <w:t xml:space="preserve">Reset bất đồng bộ tích cực thấp (từ</w:t>
+            </w:r>
+            <w:r>
+              <w:t xml:space="preserve"> </w:t>
             </w:r>
             <w:r>
               <w:rPr>
@@ -20905,11 +20739,11 @@
           <w:i/>
           <w:iCs/>
         </w:rPr>
-        <w:t xml:space="preserve">Ghi chú: Bộ đếm giờ tăng 1 đơn vị mỗi khi nhận xung min_rollover từ minute_counter và nạp đè song song khi có load_en = 1. Tham số cấu hình: P_HOUR_WIDTH = 5.</w:t>
+        <w:t xml:space="preserve">Ghi chú: Bộ đếm giờ tăng 1 đơn vị mỗi khi nhận xung min_rollover từ minute_counter và nạp đè song song khi có load_en = 1. Độ rộng bus dữ liệu được cố định trực tiếp 5-bit [4:0].</w:t>
       </w:r>
     </w:p>
     <w:bookmarkEnd w:id="122"/>
-    <w:bookmarkStart w:id="123" w:name="Xbd2541b096dad5648a671cdf8422c06a251b7ae"/>
+    <w:bookmarkStart w:id="123" w:name="X4d077be0a7a57dfe46fa0fa4199bfc8fc7c3da4"/>
     <w:p>
       <w:pPr>
         <w:pStyle w:val="Heading3"/>
@@ -20923,7 +20757,7 @@
         <w:pStyle w:val="Compact"/>
         <w:numPr>
           <w:ilvl w:val="0"/>
-          <w:numId w:val="1026"/>
+          <w:numId w:val="1030"/>
         </w:numPr>
       </w:pPr>
       <w:r>
@@ -20969,7 +20803,7 @@
         <w:pStyle w:val="Compact"/>
         <w:numPr>
           <w:ilvl w:val="0"/>
-          <w:numId w:val="1026"/>
+          <w:numId w:val="1030"/>
         </w:numPr>
       </w:pPr>
       <w:r>
@@ -21149,7 +20983,7 @@
         <w:t xml:space="preserve"> </w:t>
       </w:r>
       <w:r>
-        <w:t xml:space="preserve">Bộ chuyển mạch đa hợp hiển thị tổ hợp (Combinational Display Multiplexer) lựa chọn giữa giá trị thời gian thực từ các bộ đếm nền (khi ở</w:t>
+        <w:t xml:space="preserve">Bộ chuyển mạch đa hợp hiển thị tổ hợp (Combinational Display Multiplexer) lựa chọn giữa giá trị thời gian thực từ các bộ đếm nền (khi ở chế độ RUN</w:t>
       </w:r>
       <w:r>
         <w:t xml:space="preserve"> </w:t>
@@ -21158,7 +20992,7 @@
         <w:rPr>
           <w:rStyle w:val="VerbatimChar"/>
         </w:rPr>
-        <w:t xml:space="preserve">PL_MODE_RUN = 2'b00</w:t>
+        <w:t xml:space="preserve">adj_mode == 2'b00</w:t>
       </w:r>
       <w:r>
         <w:t xml:space="preserve">) và giá trị trong bộ đệm chỉnh sửa (khi ở các chế độ</w:t>
@@ -21412,7 +21246,7 @@
               <w:rPr>
                 <w:rStyle w:val="VerbatimChar"/>
               </w:rPr>
-              <w:t xml:space="preserve">adj_mode[1:0]</w:t>
+              <w:t xml:space="preserve">load_en</w:t>
             </w:r>
           </w:p>
         </w:tc>
@@ -21436,19 +21270,19 @@
               <w:jc w:val="center"/>
             </w:pPr>
             <w:r>
-              <w:t xml:space="preserve">2</w:t>
-            </w:r>
-          </w:p>
-        </w:tc>
-        <w:tc>
-          <w:tcPr/>
-          <w:p>
-            <w:pPr>
-              <w:pStyle w:val="Compact"/>
-              <w:jc w:val="center"/>
-            </w:pPr>
-            <w:r>
-              <w:t xml:space="preserve">Status</w:t>
+              <w:t xml:space="preserve">1</w:t>
+            </w:r>
+          </w:p>
+        </w:tc>
+        <w:tc>
+          <w:tcPr/>
+          <w:p>
+            <w:pPr>
+              <w:pStyle w:val="Compact"/>
+              <w:jc w:val="center"/>
+            </w:pPr>
+            <w:r>
+              <w:t xml:space="preserve">Control</w:t>
             </w:r>
           </w:p>
         </w:tc>
@@ -21472,25 +21306,19 @@
               <w:jc w:val="left"/>
             </w:pPr>
             <w:r>
-              <w:t xml:space="preserve">Mã trạng thái chế độ hoạt động hiện tại</w:t>
-            </w:r>
-          </w:p>
-        </w:tc>
-        <w:tc>
-          <w:tcPr/>
-          <w:p>
-            <w:pPr>
-              <w:pStyle w:val="Compact"/>
-              <w:jc w:val="left"/>
-            </w:pPr>
-            <w:r>
-              <w:rPr>
-                <w:rStyle w:val="VerbatimChar"/>
-              </w:rPr>
-              <w:t xml:space="preserve">00</w:t>
-            </w:r>
-            <w:r>
-              <w:t xml:space="preserve">:RUN,</w:t>
+              <w:t xml:space="preserve">Xung 1-cycle kích hoạt nạp thời gian mới (giữ đệm hiển thị chống glitch)</w:t>
+            </w:r>
+          </w:p>
+        </w:tc>
+        <w:tc>
+          <w:tcPr/>
+          <w:p>
+            <w:pPr>
+              <w:pStyle w:val="Compact"/>
+              <w:jc w:val="left"/>
+            </w:pPr>
+            <w:r>
+              <w:t xml:space="preserve">Tích cực mức</w:t>
             </w:r>
             <w:r>
               <w:t xml:space="preserve"> </w:t>
@@ -21499,49 +21327,22 @@
               <w:rPr>
                 <w:rStyle w:val="VerbatimChar"/>
               </w:rPr>
-              <w:t xml:space="preserve">01</w:t>
-            </w:r>
-            <w:r>
-              <w:t xml:space="preserve">:SEC,</w:t>
-            </w:r>
-            <w:r>
-              <w:t xml:space="preserve"> </w:t>
-            </w:r>
-            <w:r>
-              <w:rPr>
-                <w:rStyle w:val="VerbatimChar"/>
-              </w:rPr>
-              <w:t xml:space="preserve">10</w:t>
-            </w:r>
-            <w:r>
-              <w:t xml:space="preserve">:MIN,</w:t>
-            </w:r>
-            <w:r>
-              <w:t xml:space="preserve"> </w:t>
-            </w:r>
-            <w:r>
-              <w:rPr>
-                <w:rStyle w:val="VerbatimChar"/>
-              </w:rPr>
-              <w:t xml:space="preserve">11</w:t>
-            </w:r>
-            <w:r>
-              <w:t xml:space="preserve">:HOUR</w:t>
-            </w:r>
-          </w:p>
-        </w:tc>
-        <w:tc>
-          <w:tcPr/>
-          <w:p>
-            <w:pPr>
-              <w:pStyle w:val="Compact"/>
-              <w:jc w:val="center"/>
-            </w:pPr>
-            <w:r>
-              <w:rPr>
-                <w:rStyle w:val="VerbatimChar"/>
-              </w:rPr>
-              <w:t xml:space="preserve">2'b00</w:t>
+              <w:t xml:space="preserve">1</w:t>
+            </w:r>
+          </w:p>
+        </w:tc>
+        <w:tc>
+          <w:tcPr/>
+          <w:p>
+            <w:pPr>
+              <w:pStyle w:val="Compact"/>
+              <w:jc w:val="center"/>
+            </w:pPr>
+            <w:r>
+              <w:rPr>
+                <w:rStyle w:val="VerbatimChar"/>
+              </w:rPr>
+              <w:t xml:space="preserve">0</w:t>
             </w:r>
           </w:p>
         </w:tc>
@@ -21558,7 +21359,7 @@
               <w:rPr>
                 <w:rStyle w:val="VerbatimChar"/>
               </w:rPr>
-              <w:t xml:space="preserve">s_cnt[5:0]</w:t>
+              <w:t xml:space="preserve">adj_mode[1:0]</w:t>
             </w:r>
           </w:p>
         </w:tc>
@@ -21582,19 +21383,19 @@
               <w:jc w:val="center"/>
             </w:pPr>
             <w:r>
-              <w:t xml:space="preserve">6</w:t>
-            </w:r>
-          </w:p>
-        </w:tc>
-        <w:tc>
-          <w:tcPr/>
-          <w:p>
-            <w:pPr>
-              <w:pStyle w:val="Compact"/>
-              <w:jc w:val="center"/>
-            </w:pPr>
-            <w:r>
-              <w:t xml:space="preserve">Data In</w:t>
+              <w:t xml:space="preserve">2</w:t>
+            </w:r>
+          </w:p>
+        </w:tc>
+        <w:tc>
+          <w:tcPr/>
+          <w:p>
+            <w:pPr>
+              <w:pStyle w:val="Compact"/>
+              <w:jc w:val="center"/>
+            </w:pPr>
+            <w:r>
+              <w:t xml:space="preserve">Status</w:t>
             </w:r>
           </w:p>
         </w:tc>
@@ -21618,7 +21419,25 @@
               <w:jc w:val="left"/>
             </w:pPr>
             <w:r>
-              <w:t xml:space="preserve">Giá trị giây thời gian thực từ</w:t>
+              <w:t xml:space="preserve">Mã trạng thái chế độ hoạt động hiện tại</w:t>
+            </w:r>
+          </w:p>
+        </w:tc>
+        <w:tc>
+          <w:tcPr/>
+          <w:p>
+            <w:pPr>
+              <w:pStyle w:val="Compact"/>
+              <w:jc w:val="left"/>
+            </w:pPr>
+            <w:r>
+              <w:rPr>
+                <w:rStyle w:val="VerbatimChar"/>
+              </w:rPr>
+              <w:t xml:space="preserve">00</w:t>
+            </w:r>
+            <w:r>
+              <w:t xml:space="preserve">:RUN,</w:t>
             </w:r>
             <w:r>
               <w:t xml:space="preserve"> </w:t>
@@ -21627,34 +21446,49 @@
               <w:rPr>
                 <w:rStyle w:val="VerbatimChar"/>
               </w:rPr>
-              <w:t xml:space="preserve">second_counter</w:t>
-            </w:r>
-          </w:p>
-        </w:tc>
-        <w:tc>
-          <w:tcPr/>
-          <w:p>
-            <w:pPr>
-              <w:pStyle w:val="Compact"/>
-              <w:jc w:val="left"/>
-            </w:pPr>
-            <w:r>
-              <w:t xml:space="preserve">0 .. 59</w:t>
-            </w:r>
-          </w:p>
-        </w:tc>
-        <w:tc>
-          <w:tcPr/>
-          <w:p>
-            <w:pPr>
-              <w:pStyle w:val="Compact"/>
-              <w:jc w:val="center"/>
-            </w:pPr>
-            <w:r>
-              <w:rPr>
-                <w:rStyle w:val="VerbatimChar"/>
-              </w:rPr>
-              <w:t xml:space="preserve">0</w:t>
+              <w:t xml:space="preserve">01</w:t>
+            </w:r>
+            <w:r>
+              <w:t xml:space="preserve">:SEC,</w:t>
+            </w:r>
+            <w:r>
+              <w:t xml:space="preserve"> </w:t>
+            </w:r>
+            <w:r>
+              <w:rPr>
+                <w:rStyle w:val="VerbatimChar"/>
+              </w:rPr>
+              <w:t xml:space="preserve">10</w:t>
+            </w:r>
+            <w:r>
+              <w:t xml:space="preserve">:MIN,</w:t>
+            </w:r>
+            <w:r>
+              <w:t xml:space="preserve"> </w:t>
+            </w:r>
+            <w:r>
+              <w:rPr>
+                <w:rStyle w:val="VerbatimChar"/>
+              </w:rPr>
+              <w:t xml:space="preserve">11</w:t>
+            </w:r>
+            <w:r>
+              <w:t xml:space="preserve">:HOUR</w:t>
+            </w:r>
+          </w:p>
+        </w:tc>
+        <w:tc>
+          <w:tcPr/>
+          <w:p>
+            <w:pPr>
+              <w:pStyle w:val="Compact"/>
+              <w:jc w:val="center"/>
+            </w:pPr>
+            <w:r>
+              <w:rPr>
+                <w:rStyle w:val="VerbatimChar"/>
+              </w:rPr>
+              <w:t xml:space="preserve">2'b00</w:t>
             </w:r>
           </w:p>
         </w:tc>
@@ -21671,7 +21505,7 @@
               <w:rPr>
                 <w:rStyle w:val="VerbatimChar"/>
               </w:rPr>
-              <w:t xml:space="preserve">m_cnt[5:0]</w:t>
+              <w:t xml:space="preserve">s_cnt[5:0]</w:t>
             </w:r>
           </w:p>
         </w:tc>
@@ -21731,7 +21565,7 @@
               <w:jc w:val="left"/>
             </w:pPr>
             <w:r>
-              <w:t xml:space="preserve">Giá trị phút thời gian thực từ</w:t>
+              <w:t xml:space="preserve">Giá trị giây thời gian thực từ</w:t>
             </w:r>
             <w:r>
               <w:t xml:space="preserve"> </w:t>
@@ -21740,7 +21574,7 @@
               <w:rPr>
                 <w:rStyle w:val="VerbatimChar"/>
               </w:rPr>
-              <w:t xml:space="preserve">minute_counter</w:t>
+              <w:t xml:space="preserve">second_counter</w:t>
             </w:r>
           </w:p>
         </w:tc>
@@ -21784,7 +21618,7 @@
               <w:rPr>
                 <w:rStyle w:val="VerbatimChar"/>
               </w:rPr>
-              <w:t xml:space="preserve">h_cnt[4:0]</w:t>
+              <w:t xml:space="preserve">m_cnt[5:0]</w:t>
             </w:r>
           </w:p>
         </w:tc>
@@ -21808,7 +21642,7 @@
               <w:jc w:val="center"/>
             </w:pPr>
             <w:r>
-              <w:t xml:space="preserve">5</w:t>
+              <w:t xml:space="preserve">6</w:t>
             </w:r>
           </w:p>
         </w:tc>
@@ -21844,7 +21678,7 @@
               <w:jc w:val="left"/>
             </w:pPr>
             <w:r>
-              <w:t xml:space="preserve">Giá trị giờ thời gian thực từ</w:t>
+              <w:t xml:space="preserve">Giá trị phút thời gian thực từ</w:t>
             </w:r>
             <w:r>
               <w:t xml:space="preserve"> </w:t>
@@ -21853,19 +21687,19 @@
               <w:rPr>
                 <w:rStyle w:val="VerbatimChar"/>
               </w:rPr>
-              <w:t xml:space="preserve">hour_counter</w:t>
-            </w:r>
-          </w:p>
-        </w:tc>
-        <w:tc>
-          <w:tcPr/>
-          <w:p>
-            <w:pPr>
-              <w:pStyle w:val="Compact"/>
-              <w:jc w:val="left"/>
-            </w:pPr>
-            <w:r>
-              <w:t xml:space="preserve">0 .. 23</w:t>
+              <w:t xml:space="preserve">minute_counter</w:t>
+            </w:r>
+          </w:p>
+        </w:tc>
+        <w:tc>
+          <w:tcPr/>
+          <w:p>
+            <w:pPr>
+              <w:pStyle w:val="Compact"/>
+              <w:jc w:val="left"/>
+            </w:pPr>
+            <w:r>
+              <w:t xml:space="preserve">0 .. 59</w:t>
             </w:r>
           </w:p>
         </w:tc>
@@ -21897,7 +21731,7 @@
               <w:rPr>
                 <w:rStyle w:val="VerbatimChar"/>
               </w:rPr>
-              <w:t xml:space="preserve">s_adj[5:0]</w:t>
+              <w:t xml:space="preserve">h_cnt[4:0]</w:t>
             </w:r>
           </w:p>
         </w:tc>
@@ -21921,7 +21755,7 @@
               <w:jc w:val="center"/>
             </w:pPr>
             <w:r>
-              <w:t xml:space="preserve">6</w:t>
+              <w:t xml:space="preserve">5</w:t>
             </w:r>
           </w:p>
         </w:tc>
@@ -21957,7 +21791,7 @@
               <w:jc w:val="left"/>
             </w:pPr>
             <w:r>
-              <w:t xml:space="preserve">Giá trị giây đang chỉnh từ</w:t>
+              <w:t xml:space="preserve">Giá trị giờ thời gian thực từ</w:t>
             </w:r>
             <w:r>
               <w:t xml:space="preserve"> </w:t>
@@ -21966,19 +21800,19 @@
               <w:rPr>
                 <w:rStyle w:val="VerbatimChar"/>
               </w:rPr>
-              <w:t xml:space="preserve">mode_controller</w:t>
-            </w:r>
-          </w:p>
-        </w:tc>
-        <w:tc>
-          <w:tcPr/>
-          <w:p>
-            <w:pPr>
-              <w:pStyle w:val="Compact"/>
-              <w:jc w:val="left"/>
-            </w:pPr>
-            <w:r>
-              <w:t xml:space="preserve">0 .. 59</w:t>
+              <w:t xml:space="preserve">hour_counter</w:t>
+            </w:r>
+          </w:p>
+        </w:tc>
+        <w:tc>
+          <w:tcPr/>
+          <w:p>
+            <w:pPr>
+              <w:pStyle w:val="Compact"/>
+              <w:jc w:val="left"/>
+            </w:pPr>
+            <w:r>
+              <w:t xml:space="preserve">0 .. 23</w:t>
             </w:r>
           </w:p>
         </w:tc>
@@ -22010,7 +21844,7 @@
               <w:rPr>
                 <w:rStyle w:val="VerbatimChar"/>
               </w:rPr>
-              <w:t xml:space="preserve">m_adj[5:0]</w:t>
+              <w:t xml:space="preserve">s_adj[5:0]</w:t>
             </w:r>
           </w:p>
         </w:tc>
@@ -22070,7 +21904,7 @@
               <w:jc w:val="left"/>
             </w:pPr>
             <w:r>
-              <w:t xml:space="preserve">Giá trị phút đang chỉnh từ</w:t>
+              <w:t xml:space="preserve">Giá trị giây đang chỉnh từ</w:t>
             </w:r>
             <w:r>
               <w:t xml:space="preserve"> </w:t>
@@ -22123,7 +21957,7 @@
               <w:rPr>
                 <w:rStyle w:val="VerbatimChar"/>
               </w:rPr>
-              <w:t xml:space="preserve">h_adj[4:0]</w:t>
+              <w:t xml:space="preserve">m_adj[5:0]</w:t>
             </w:r>
           </w:p>
         </w:tc>
@@ -22147,7 +21981,7 @@
               <w:jc w:val="center"/>
             </w:pPr>
             <w:r>
-              <w:t xml:space="preserve">5</w:t>
+              <w:t xml:space="preserve">6</w:t>
             </w:r>
           </w:p>
         </w:tc>
@@ -22183,7 +22017,7 @@
               <w:jc w:val="left"/>
             </w:pPr>
             <w:r>
-              <w:t xml:space="preserve">Giá trị giờ đang chỉnh từ</w:t>
+              <w:t xml:space="preserve">Giá trị phút đang chỉnh từ</w:t>
             </w:r>
             <w:r>
               <w:t xml:space="preserve"> </w:t>
@@ -22204,7 +22038,7 @@
               <w:jc w:val="left"/>
             </w:pPr>
             <w:r>
-              <w:t xml:space="preserve">0 .. 23</w:t>
+              <w:t xml:space="preserve">0 .. 59</w:t>
             </w:r>
           </w:p>
         </w:tc>
@@ -22236,43 +22070,43 @@
               <w:rPr>
                 <w:rStyle w:val="VerbatimChar"/>
               </w:rPr>
-              <w:t xml:space="preserve">s_out[5:0]</w:t>
-            </w:r>
-          </w:p>
-        </w:tc>
-        <w:tc>
-          <w:tcPr/>
-          <w:p>
-            <w:pPr>
-              <w:pStyle w:val="Compact"/>
-              <w:jc w:val="center"/>
-            </w:pPr>
-            <w:r>
-              <w:t xml:space="preserve">Output</w:t>
-            </w:r>
-          </w:p>
-        </w:tc>
-        <w:tc>
-          <w:tcPr/>
-          <w:p>
-            <w:pPr>
-              <w:pStyle w:val="Compact"/>
-              <w:jc w:val="center"/>
-            </w:pPr>
-            <w:r>
-              <w:t xml:space="preserve">6</w:t>
-            </w:r>
-          </w:p>
-        </w:tc>
-        <w:tc>
-          <w:tcPr/>
-          <w:p>
-            <w:pPr>
-              <w:pStyle w:val="Compact"/>
-              <w:jc w:val="center"/>
-            </w:pPr>
-            <w:r>
-              <w:t xml:space="preserve">Data Out</w:t>
+              <w:t xml:space="preserve">h_adj[4:0]</w:t>
+            </w:r>
+          </w:p>
+        </w:tc>
+        <w:tc>
+          <w:tcPr/>
+          <w:p>
+            <w:pPr>
+              <w:pStyle w:val="Compact"/>
+              <w:jc w:val="center"/>
+            </w:pPr>
+            <w:r>
+              <w:t xml:space="preserve">Input</w:t>
+            </w:r>
+          </w:p>
+        </w:tc>
+        <w:tc>
+          <w:tcPr/>
+          <w:p>
+            <w:pPr>
+              <w:pStyle w:val="Compact"/>
+              <w:jc w:val="center"/>
+            </w:pPr>
+            <w:r>
+              <w:t xml:space="preserve">5</w:t>
+            </w:r>
+          </w:p>
+        </w:tc>
+        <w:tc>
+          <w:tcPr/>
+          <w:p>
+            <w:pPr>
+              <w:pStyle w:val="Compact"/>
+              <w:jc w:val="center"/>
+            </w:pPr>
+            <w:r>
+              <w:t xml:space="preserve">Data In</w:t>
             </w:r>
           </w:p>
         </w:tc>
@@ -22296,19 +22130,28 @@
               <w:jc w:val="left"/>
             </w:pPr>
             <w:r>
-              <w:t xml:space="preserve">Giá trị giây đưa ra hiển thị chân Top</w:t>
-            </w:r>
-          </w:p>
-        </w:tc>
-        <w:tc>
-          <w:tcPr/>
-          <w:p>
-            <w:pPr>
-              <w:pStyle w:val="Compact"/>
-              <w:jc w:val="left"/>
-            </w:pPr>
-            <w:r>
-              <w:t xml:space="preserve">0 .. 59</w:t>
+              <w:t xml:space="preserve">Giá trị giờ đang chỉnh từ</w:t>
+            </w:r>
+            <w:r>
+              <w:t xml:space="preserve"> </w:t>
+            </w:r>
+            <w:r>
+              <w:rPr>
+                <w:rStyle w:val="VerbatimChar"/>
+              </w:rPr>
+              <w:t xml:space="preserve">mode_controller</w:t>
+            </w:r>
+          </w:p>
+        </w:tc>
+        <w:tc>
+          <w:tcPr/>
+          <w:p>
+            <w:pPr>
+              <w:pStyle w:val="Compact"/>
+              <w:jc w:val="left"/>
+            </w:pPr>
+            <w:r>
+              <w:t xml:space="preserve">0 .. 23</w:t>
             </w:r>
           </w:p>
         </w:tc>
@@ -22340,7 +22183,7 @@
               <w:rPr>
                 <w:rStyle w:val="VerbatimChar"/>
               </w:rPr>
-              <w:t xml:space="preserve">m_out[5:0]</w:t>
+              <w:t xml:space="preserve">s_out[5:0]</w:t>
             </w:r>
           </w:p>
         </w:tc>
@@ -22400,7 +22243,7 @@
               <w:jc w:val="left"/>
             </w:pPr>
             <w:r>
-              <w:t xml:space="preserve">Giá trị phút đưa ra hiển thị chân Top</w:t>
+              <w:t xml:space="preserve">Giá trị giây đưa ra hiển thị chân Top</w:t>
             </w:r>
           </w:p>
         </w:tc>
@@ -22444,6 +22287,110 @@
               <w:rPr>
                 <w:rStyle w:val="VerbatimChar"/>
               </w:rPr>
+              <w:t xml:space="preserve">m_out[5:0]</w:t>
+            </w:r>
+          </w:p>
+        </w:tc>
+        <w:tc>
+          <w:tcPr/>
+          <w:p>
+            <w:pPr>
+              <w:pStyle w:val="Compact"/>
+              <w:jc w:val="center"/>
+            </w:pPr>
+            <w:r>
+              <w:t xml:space="preserve">Output</w:t>
+            </w:r>
+          </w:p>
+        </w:tc>
+        <w:tc>
+          <w:tcPr/>
+          <w:p>
+            <w:pPr>
+              <w:pStyle w:val="Compact"/>
+              <w:jc w:val="center"/>
+            </w:pPr>
+            <w:r>
+              <w:t xml:space="preserve">6</w:t>
+            </w:r>
+          </w:p>
+        </w:tc>
+        <w:tc>
+          <w:tcPr/>
+          <w:p>
+            <w:pPr>
+              <w:pStyle w:val="Compact"/>
+              <w:jc w:val="center"/>
+            </w:pPr>
+            <w:r>
+              <w:t xml:space="preserve">Data Out</w:t>
+            </w:r>
+          </w:p>
+        </w:tc>
+        <w:tc>
+          <w:tcPr/>
+          <w:p>
+            <w:pPr>
+              <w:pStyle w:val="Compact"/>
+              <w:jc w:val="center"/>
+            </w:pPr>
+            <w:r>
+              <w:t xml:space="preserve">1 MHz</w:t>
+            </w:r>
+          </w:p>
+        </w:tc>
+        <w:tc>
+          <w:tcPr/>
+          <w:p>
+            <w:pPr>
+              <w:pStyle w:val="Compact"/>
+              <w:jc w:val="left"/>
+            </w:pPr>
+            <w:r>
+              <w:t xml:space="preserve">Giá trị phút đưa ra hiển thị chân Top</w:t>
+            </w:r>
+          </w:p>
+        </w:tc>
+        <w:tc>
+          <w:tcPr/>
+          <w:p>
+            <w:pPr>
+              <w:pStyle w:val="Compact"/>
+              <w:jc w:val="left"/>
+            </w:pPr>
+            <w:r>
+              <w:t xml:space="preserve">0 .. 59</w:t>
+            </w:r>
+          </w:p>
+        </w:tc>
+        <w:tc>
+          <w:tcPr/>
+          <w:p>
+            <w:pPr>
+              <w:pStyle w:val="Compact"/>
+              <w:jc w:val="center"/>
+            </w:pPr>
+            <w:r>
+              <w:rPr>
+                <w:rStyle w:val="VerbatimChar"/>
+              </w:rPr>
+              <w:t xml:space="preserve">0</w:t>
+            </w:r>
+          </w:p>
+        </w:tc>
+      </w:tr>
+      <w:tr>
+        <w:tc>
+          <w:tcPr/>
+          <w:p>
+            <w:pPr>
+              <w:pStyle w:val="Compact"/>
+              <w:jc w:val="left"/>
+            </w:pPr>
+            <w:r>
+              <w:rPr>
+                <w:rStyle w:val="VerbatimChar"/>
+              </w:rPr>
               <w:t xml:space="preserve">h_out[4:0]</w:t>
             </w:r>
           </w:p>
@@ -22546,11 +22493,11 @@
           <w:i/>
           <w:iCs/>
         </w:rPr>
-        <w:t xml:space="preserve">Ghi chú: Mạch hoạt động hoàn toàn bằng logic tổ hợp zero-latency, không sử dụng Flip-Flop. Tham số cấu hình: P_SEC_WIDTH = 6, P_MIN_WIDTH = 6, P_HOUR_WIDTH = 5; Tham số cục bộ: PL_MODE_RUN = 2’b00.</w:t>
+        <w:t xml:space="preserve">Ghi chú: Mạch hoạt động hoàn toàn bằng logic tổ hợp zero-latency, không sử dụng Flip-Flop. Độ rộng bus dữ liệu được chuẩn hóa trực tiếp [5:0] và [4:0].</w:t>
       </w:r>
     </w:p>
     <w:bookmarkEnd w:id="133"/>
-    <w:bookmarkStart w:id="134" w:name="X4d077be0a7a57dfe46fa0fa4199bfc8fc7c3da4"/>
+    <w:bookmarkStart w:id="134" w:name="X58c9990c4eae05af24348b0812f13aa1dd7ad7e"/>
     <w:p>
       <w:pPr>
         <w:pStyle w:val="Heading3"/>
@@ -22564,7 +22511,7 @@
         <w:pStyle w:val="Compact"/>
         <w:numPr>
           <w:ilvl w:val="0"/>
-          <w:numId w:val="1027"/>
+          <w:numId w:val="1031"/>
         </w:numPr>
       </w:pPr>
       <w:r>
@@ -22591,14 +22538,14 @@
         <w:pStyle w:val="Compact"/>
         <w:numPr>
           <w:ilvl w:val="1"/>
-          <w:numId w:val="1028"/>
+          <w:numId w:val="1032"/>
         </w:numPr>
       </w:pPr>
       <w:r>
         <w:rPr>
           <w:rStyle w:val="VerbatimChar"/>
         </w:rPr>
-        <w:t xml:space="preserve">s_out = (adj_mode == PL_MODE_RUN) ? s_cnt : s_adj;</w:t>
+        <w:t xml:space="preserve">s_out = (adj_mode == 2'b00 &amp;&amp; !load_en) ? s_cnt : s_adj;</w:t>
       </w:r>
     </w:p>
     <w:p>
@@ -22606,14 +22553,14 @@
         <w:pStyle w:val="Compact"/>
         <w:numPr>
           <w:ilvl w:val="1"/>
-          <w:numId w:val="1028"/>
+          <w:numId w:val="1032"/>
         </w:numPr>
       </w:pPr>
       <w:r>
         <w:rPr>
           <w:rStyle w:val="VerbatimChar"/>
         </w:rPr>
-        <w:t xml:space="preserve">m_out = (adj_mode == PL_MODE_RUN) ? m_cnt : m_adj;</w:t>
+        <w:t xml:space="preserve">m_out = (adj_mode == 2'b00 &amp;&amp; !load_en) ? m_cnt : m_adj;</w:t>
       </w:r>
     </w:p>
     <w:p>
@@ -22621,14 +22568,153 @@
         <w:pStyle w:val="Compact"/>
         <w:numPr>
           <w:ilvl w:val="1"/>
-          <w:numId w:val="1028"/>
+          <w:numId w:val="1032"/>
         </w:numPr>
       </w:pPr>
       <w:r>
         <w:rPr>
           <w:rStyle w:val="VerbatimChar"/>
         </w:rPr>
-        <w:t xml:space="preserve">h_out = (adj_mode == PL_MODE_RUN) ? h_cnt : h_adj;</w:t>
+        <w:t xml:space="preserve">h_out = (adj_mode == 2'b00 &amp;&amp; !load_en) ? h_cnt : h_adj;</w:t>
+      </w:r>
+    </w:p>
+    <w:p>
+      <w:pPr>
+        <w:pStyle w:val="Compact"/>
+        <w:numPr>
+          <w:ilvl w:val="0"/>
+          <w:numId w:val="1031"/>
+        </w:numPr>
+      </w:pPr>
+      <w:r>
+        <w:rPr>
+          <w:b/>
+          <w:bCs/>
+        </w:rPr>
+        <w:t xml:space="preserve">Cơ chế chống Glitch hiển thị khi chuyển chế độ (Anti-Glitch Display Bypass):</w:t>
+      </w:r>
+      <w:r>
+        <w:t xml:space="preserve"> </w:t>
+      </w:r>
+      <w:r>
+        <w:t xml:space="preserve">Khi kết thúc vòng chỉnh giờ và nhấn phím SEL để chuyển từ</w:t>
+      </w:r>
+      <w:r>
+        <w:t xml:space="preserve"> </w:t>
+      </w:r>
+      <w:r>
+        <w:rPr>
+          <w:rStyle w:val="VerbatimChar"/>
+        </w:rPr>
+        <w:t xml:space="preserve">MODE_ADJ_HOUR</w:t>
+      </w:r>
+      <w:r>
+        <w:t xml:space="preserve"> </w:t>
+      </w:r>
+      <w:r>
+        <w:t xml:space="preserve">về</w:t>
+      </w:r>
+      <w:r>
+        <w:t xml:space="preserve"> </w:t>
+      </w:r>
+      <w:r>
+        <w:rPr>
+          <w:rStyle w:val="VerbatimChar"/>
+        </w:rPr>
+        <w:t xml:space="preserve">MODE_RUN</w:t>
+      </w:r>
+      <w:r>
+        <w:t xml:space="preserve">, tín hiệu</w:t>
+      </w:r>
+      <w:r>
+        <w:t xml:space="preserve"> </w:t>
+      </w:r>
+      <w:r>
+        <w:rPr>
+          <w:rStyle w:val="VerbatimChar"/>
+        </w:rPr>
+        <w:t xml:space="preserve">adj_mode</w:t>
+      </w:r>
+      <w:r>
+        <w:t xml:space="preserve"> </w:t>
+      </w:r>
+      <w:r>
+        <w:t xml:space="preserve">chuyển sang</w:t>
+      </w:r>
+      <w:r>
+        <w:t xml:space="preserve"> </w:t>
+      </w:r>
+      <w:r>
+        <w:rPr>
+          <w:rStyle w:val="VerbatimChar"/>
+        </w:rPr>
+        <w:t xml:space="preserve">2'b00</w:t>
+      </w:r>
+      <w:r>
+        <w:t xml:space="preserve"> </w:t>
+      </w:r>
+      <w:r>
+        <w:t xml:space="preserve">đồng thời xung</w:t>
+      </w:r>
+      <w:r>
+        <w:t xml:space="preserve"> </w:t>
+      </w:r>
+      <w:r>
+        <w:rPr>
+          <w:rStyle w:val="VerbatimChar"/>
+        </w:rPr>
+        <w:t xml:space="preserve">load_en</w:t>
+      </w:r>
+      <w:r>
+        <w:t xml:space="preserve"> </w:t>
+      </w:r>
+      <w:r>
+        <w:t xml:space="preserve">được phát trong 1 chu kỳ clock. Do các bộ đếm cần 1 chu kỳ clock để nạp giá trị mới vào Flip-Flop, điều kiện</w:t>
+      </w:r>
+      <w:r>
+        <w:t xml:space="preserve"> </w:t>
+      </w:r>
+      <w:r>
+        <w:rPr>
+          <w:rStyle w:val="VerbatimChar"/>
+        </w:rPr>
+        <w:t xml:space="preserve">!load_en</w:t>
+      </w:r>
+      <w:r>
+        <w:t xml:space="preserve"> </w:t>
+      </w:r>
+      <w:r>
+        <w:t xml:space="preserve">đảm bảo</w:t>
+      </w:r>
+      <w:r>
+        <w:t xml:space="preserve"> </w:t>
+      </w:r>
+      <w:r>
+        <w:rPr>
+          <w:rStyle w:val="VerbatimChar"/>
+        </w:rPr>
+        <w:t xml:space="preserve">output_switch</w:t>
+      </w:r>
+      <w:r>
+        <w:t xml:space="preserve"> </w:t>
+      </w:r>
+      <w:r>
+        <w:t xml:space="preserve">tiếp tục giữ hiển thị giá trị từ bộ đệm</w:t>
+      </w:r>
+      <w:r>
+        <w:t xml:space="preserve"> </w:t>
+      </w:r>
+      <w:r>
+        <w:rPr>
+          <w:rStyle w:val="VerbatimChar"/>
+        </w:rPr>
+        <w:t xml:space="preserve">s_adj, m_adj, h_adj</w:t>
+      </w:r>
+      <w:r>
+        <w:t xml:space="preserve"> </w:t>
+      </w:r>
+      <w:r>
+        <w:t xml:space="preserve">thêm đúng 1 chu kỳ, loại bỏ hoàn toàn hiện tượng hiển thị thoáng qua (glitch) giá trị cũ của bộ đếm ngầm.</w:t>
       </w:r>
     </w:p>
     <w:bookmarkEnd w:id="134"/>
@@ -22656,7 +22742,7 @@
       <w:r>
         <w:drawing>
           <wp:inline>
-            <wp:extent cx="5334000" cy="1200150"/>
+            <wp:extent cx="5334000" cy="1366837"/>
             <wp:effectExtent b="0" l="0" r="0" t="0"/>
             <wp:docPr descr="Hình 3.9.4: Giản đồ chuyển mạch hiển thị tức thời zero-delay output_switch (WaveDrom)" title="" id="136" name="Picture"/>
             <a:graphic>
@@ -22677,7 +22763,7 @@
                   <pic:spPr bwMode="auto">
                     <a:xfrm>
                       <a:off x="0" y="0"/>
-                      <a:ext cx="5334000" cy="1200150"/>
+                      <a:ext cx="5334000" cy="1366837"/>
                     </a:xfrm>
                     <a:prstGeom prst="rect">
                       <a:avLst/>
@@ -23317,7 +23403,7 @@
               <w:rPr>
                 <w:rStyle w:val="VerbatimChar"/>
               </w:rPr>
-              <w:t xml:space="preserve">TC12: Auto-Repeat Long Hold</w:t>
+              <w:t xml:space="preserve">TC12: Single-Event Long Hold</w:t>
             </w:r>
           </w:p>
         </w:tc>
@@ -23341,7 +23427,7 @@
               <w:jc w:val="left"/>
             </w:pPr>
             <w:r>
-              <w:t xml:space="preserve">Auto-Repeat Monitor</w:t>
+              <w:t xml:space="preserve">Single-Event Monitor</w:t>
             </w:r>
           </w:p>
         </w:tc>
@@ -23419,31 +23505,31 @@
               <w:rPr>
                 <w:rStyle w:val="VerbatimChar"/>
               </w:rPr>
-              <w:t xml:space="preserve">TC12: 10% Debounce Tolerance Band</w:t>
-            </w:r>
-          </w:p>
-        </w:tc>
-        <w:tc>
-          <w:tcPr/>
-          <w:p>
-            <w:pPr>
-              <w:pStyle w:val="Compact"/>
-              <w:jc w:val="left"/>
-            </w:pPr>
-            <w:r>
-              <w:t xml:space="preserve">Boundary Value (17, 18, 22)</w:t>
-            </w:r>
-          </w:p>
-        </w:tc>
-        <w:tc>
-          <w:tcPr/>
-          <w:p>
-            <w:pPr>
-              <w:pStyle w:val="Compact"/>
-              <w:jc w:val="left"/>
-            </w:pPr>
-            <w:r>
-              <w:t xml:space="preserve">Tolerance Check</w:t>
+              <w:t xml:space="preserve">TC12: Debounce 20ms &amp; Noise Filter</w:t>
+            </w:r>
+          </w:p>
+        </w:tc>
+        <w:tc>
+          <w:tcPr/>
+          <w:p>
+            <w:pPr>
+              <w:pStyle w:val="Compact"/>
+              <w:jc w:val="left"/>
+            </w:pPr>
+            <w:r>
+              <w:t xml:space="preserve">Boundary Check (&lt;20, &gt;=20)</w:t>
+            </w:r>
+          </w:p>
+        </w:tc>
+        <w:tc>
+          <w:tcPr/>
+          <w:p>
+            <w:pPr>
+              <w:pStyle w:val="Compact"/>
+              <w:jc w:val="left"/>
+            </w:pPr>
+            <w:r>
+              <w:t xml:space="preserve">Noise Rejection Check</w:t>
             </w:r>
           </w:p>
         </w:tc>
@@ -24139,7 +24225,7 @@
               <w:rPr>
                 <w:rStyle w:val="VerbatimChar"/>
               </w:rPr>
-              <w:t xml:space="preserve">TC12: Debounce 20ms &amp; Auto-Repeat</w:t>
+              <w:t xml:space="preserve">TC12: Single-Event Verification</w:t>
             </w:r>
           </w:p>
         </w:tc>
@@ -24834,7 +24920,7 @@
         <w:pStyle w:val="Compact"/>
         <w:numPr>
           <w:ilvl w:val="0"/>
-          <w:numId w:val="1029"/>
+          <w:numId w:val="1033"/>
         </w:numPr>
       </w:pPr>
       <w:r>
@@ -24880,7 +24966,7 @@
         <w:pStyle w:val="Compact"/>
         <w:numPr>
           <w:ilvl w:val="0"/>
-          <w:numId w:val="1029"/>
+          <w:numId w:val="1033"/>
         </w:numPr>
       </w:pPr>
       <w:r>
@@ -24932,7 +25018,7 @@
         <w:pStyle w:val="Compact"/>
         <w:numPr>
           <w:ilvl w:val="0"/>
-          <w:numId w:val="1029"/>
+          <w:numId w:val="1033"/>
         </w:numPr>
       </w:pPr>
       <w:r>
@@ -25026,7 +25112,7 @@
         <w:pStyle w:val="Compact"/>
         <w:numPr>
           <w:ilvl w:val="0"/>
-          <w:numId w:val="1029"/>
+          <w:numId w:val="1033"/>
         </w:numPr>
       </w:pPr>
       <w:r>
@@ -25048,7 +25134,7 @@
         <w:pStyle w:val="Compact"/>
         <w:numPr>
           <w:ilvl w:val="0"/>
-          <w:numId w:val="1029"/>
+          <w:numId w:val="1033"/>
         </w:numPr>
       </w:pPr>
       <w:r>
@@ -25070,7 +25156,7 @@
         <w:pStyle w:val="Compact"/>
         <w:numPr>
           <w:ilvl w:val="0"/>
-          <w:numId w:val="1029"/>
+          <w:numId w:val="1033"/>
         </w:numPr>
       </w:pPr>
       <w:r>
@@ -25092,7 +25178,7 @@
         <w:pStyle w:val="Compact"/>
         <w:numPr>
           <w:ilvl w:val="0"/>
-          <w:numId w:val="1029"/>
+          <w:numId w:val="1033"/>
         </w:numPr>
       </w:pPr>
       <w:r>
@@ -25114,7 +25200,7 @@
         <w:pStyle w:val="Compact"/>
         <w:numPr>
           <w:ilvl w:val="0"/>
-          <w:numId w:val="1029"/>
+          <w:numId w:val="1033"/>
         </w:numPr>
       </w:pPr>
       <w:r>
@@ -25136,7 +25222,7 @@
         <w:pStyle w:val="Compact"/>
         <w:numPr>
           <w:ilvl w:val="0"/>
-          <w:numId w:val="1029"/>
+          <w:numId w:val="1033"/>
         </w:numPr>
       </w:pPr>
       <w:r>
@@ -25158,7 +25244,7 @@
         <w:pStyle w:val="Compact"/>
         <w:numPr>
           <w:ilvl w:val="0"/>
-          <w:numId w:val="1029"/>
+          <w:numId w:val="1033"/>
         </w:numPr>
       </w:pPr>
       <w:r>
@@ -25180,7 +25266,7 @@
         <w:pStyle w:val="Compact"/>
         <w:numPr>
           <w:ilvl w:val="0"/>
-          <w:numId w:val="1029"/>
+          <w:numId w:val="1033"/>
         </w:numPr>
       </w:pPr>
       <w:r>
@@ -25202,7 +25288,7 @@
         <w:pStyle w:val="Compact"/>
         <w:numPr>
           <w:ilvl w:val="0"/>
-          <w:numId w:val="1029"/>
+          <w:numId w:val="1033"/>
         </w:numPr>
       </w:pPr>
       <w:r>
@@ -25210,13 +25296,28 @@
           <w:b/>
           <w:bCs/>
         </w:rPr>
-        <w:t xml:space="preserve">TC12: Kiểm chứng Khử rung 20ms Dung sai ±10% &amp; Auto-Repeat:</w:t>
-      </w:r>
-      <w:r>
-        <w:t xml:space="preserve"> </w:t>
-      </w:r>
-      <w:r>
-        <w:t xml:space="preserve">Nhấn &lt; 18ms (17 pulses) bị hủy hoàn toàn, giữ &gt;= 18ms phát đúng 1 xung, giữ lâu phát Auto-Repeat đều đặn.</w:t>
+        <w:t xml:space="preserve">TC12: Kiểm chứng Khử rung 20ms &amp; Phát xung đơn chu kỳ (Single Event Verification):</w:t>
+      </w:r>
+      <w:r>
+        <w:t xml:space="preserve"> </w:t>
+      </w:r>
+      <w:r>
+        <w:t xml:space="preserve">Nhấn giữ &lt; 20ms (19 xung mẫu) bị hủy hoàn toàn (chống rung/nhiễu), nhấn giữ &gt;= 20ms (20 xung mẫu) phát đúng duy nhất 1 xung kích hoạt</w:t>
+      </w:r>
+      <w:r>
+        <w:t xml:space="preserve"> </w:t>
+      </w:r>
+      <w:r>
+        <w:rPr>
+          <w:rStyle w:val="VerbatimChar"/>
+        </w:rPr>
+        <w:t xml:space="preserve">btn_event</w:t>
+      </w:r>
+      <w:r>
+        <w:t xml:space="preserve"> </w:t>
+      </w:r>
+      <w:r>
+        <w:t xml:space="preserve">(1 chu kỳ clock hệ thống), giữ nút liên tục trong thời gian dài (60 chu kỳ) không tự động lặp (no auto-repeat), giải trừ nhấn nhả hoàn toàn trước khi tiếp nhận lần bấm kế tiếp.</w:t>
       </w:r>
     </w:p>
     <w:p>
@@ -25224,7 +25325,7 @@
         <w:pStyle w:val="Compact"/>
         <w:numPr>
           <w:ilvl w:val="0"/>
-          <w:numId w:val="1029"/>
+          <w:numId w:val="1033"/>
         </w:numPr>
       </w:pPr>
       <w:r>
@@ -25246,7 +25347,7 @@
         <w:pStyle w:val="Compact"/>
         <w:numPr>
           <w:ilvl w:val="0"/>
-          <w:numId w:val="1029"/>
+          <w:numId w:val="1033"/>
         </w:numPr>
       </w:pPr>
       <w:r>
@@ -25396,19 +25497,19 @@
               <w:jc w:val="center"/>
             </w:pPr>
             <w:r>
-              <w:t xml:space="preserve">90</w:t>
-            </w:r>
-          </w:p>
-        </w:tc>
-        <w:tc>
-          <w:tcPr/>
-          <w:p>
-            <w:pPr>
-              <w:pStyle w:val="Compact"/>
-              <w:jc w:val="center"/>
-            </w:pPr>
-            <w:r>
-              <w:t xml:space="preserve">90</w:t>
+              <w:t xml:space="preserve">89</w:t>
+            </w:r>
+          </w:p>
+        </w:tc>
+        <w:tc>
+          <w:tcPr/>
+          <w:p>
+            <w:pPr>
+              <w:pStyle w:val="Compact"/>
+              <w:jc w:val="center"/>
+            </w:pPr>
+            <w:r>
+              <w:t xml:space="preserve">89</w:t>
             </w:r>
           </w:p>
         </w:tc>
@@ -25801,7 +25902,7 @@
           <w:i/>
           <w:iCs/>
         </w:rPr>
-        <w:t xml:space="preserve">Ghi chú: Kết quả kiểm chứng đạt 100% Passed trên bộ 14 Functional Test Cases với 90/90 Assertions thành công.</w:t>
+        <w:t xml:space="preserve">Ghi chú: Kết quả kiểm chứng đạt 100% Passed trên bộ 14 Functional Test Cases với 89/89 Assertions &amp; Checks thành công.</w:t>
       </w:r>
     </w:p>
     <w:bookmarkEnd w:id="143"/>
@@ -26258,6 +26359,18 @@
     <w:abstractNumId w:val="991"/>
   </w:num>
   <w:num w:numId="1024">
+    <w:abstractNumId w:val="991"/>
+  </w:num>
+  <w:num w:numId="1025">
+    <w:abstractNumId w:val="991"/>
+  </w:num>
+  <w:num w:numId="1026">
+    <w:abstractNumId w:val="991"/>
+  </w:num>
+  <w:num w:numId="1027">
+    <w:abstractNumId w:val="991"/>
+  </w:num>
+  <w:num w:numId="1028">
     <w:abstractNumId w:val="99411"/>
     <w:lvlOverride w:ilvl="0">
       <w:startOverride w:val="1"/>
@@ -26287,7 +26400,7 @@
       <w:startOverride w:val="1"/>
     </w:lvlOverride>
   </w:num>
-  <w:num w:numId="1025">
+  <w:num w:numId="1029">
     <w:abstractNumId w:val="99411"/>
     <w:lvlOverride w:ilvl="0">
       <w:startOverride w:val="1"/>
@@ -26317,7 +26430,7 @@
       <w:startOverride w:val="1"/>
     </w:lvlOverride>
   </w:num>
-  <w:num w:numId="1026">
+  <w:num w:numId="1030">
     <w:abstractNumId w:val="99411"/>
     <w:lvlOverride w:ilvl="0">
       <w:startOverride w:val="1"/>
@@ -26347,13 +26460,13 @@
       <w:startOverride w:val="1"/>
     </w:lvlOverride>
   </w:num>
-  <w:num w:numId="1027">
+  <w:num w:numId="1031">
     <w:abstractNumId w:val="991"/>
   </w:num>
-  <w:num w:numId="1028">
+  <w:num w:numId="1032">
     <w:abstractNumId w:val="991"/>
   </w:num>
-  <w:num w:numId="1029">
+  <w:num w:numId="1033">
     <w:abstractNumId w:val="99411"/>
     <w:lvlOverride w:ilvl="0">
       <w:startOverride w:val="1"/>

</xml_diff>

<commit_message>
feat(HMS_Timer_Ngo_Thai_Binh): achieve 100% functional coverage and expand testbench verification
</commit_message>
<xml_diff>
--- a/HMS_Timer_Ngo_Thai_Binh/docs/SPECIFICATION.docx
+++ b/HMS_Timer_Ngo_Thai_Binh/docs/SPECIFICATION.docx
@@ -25252,13 +25252,73 @@
           <w:b/>
           <w:bCs/>
         </w:rPr>
-        <w:t xml:space="preserve">TC10: Kiểm chứng Tràn qua nửa đêm (23:59:59 Midnight Full Cascade Rollover):</w:t>
-      </w:r>
-      <w:r>
-        <w:t xml:space="preserve"> </w:t>
-      </w:r>
-      <w:r>
-        <w:t xml:space="preserve">Chỉnh giờ 23:59:58, commit nạp vào counter và đếm thời gian thực qua 23:59:59 -&gt; 00:00:00.</w:t>
+        <w:t xml:space="preserve">TC10: Kiểm chứng Tràn thời gian thực &amp; Rollover đa cấp (Real-Time Rollovers &amp; Midnight Cascade):</w:t>
+      </w:r>
+      <w:r>
+        <w:t xml:space="preserve"> </w:t>
+      </w:r>
+      <w:r>
+        <w:t xml:space="preserve">Kiểm tra toàn diện 3 giai đoạn: (A) Tràn giây thông thường 10:15:58 -&gt; 10:15:59 -&gt; 10:16:00 (kích hoạt</w:t>
+      </w:r>
+      <w:r>
+        <w:t xml:space="preserve"> </w:t>
+      </w:r>
+      <w:r>
+        <w:rPr>
+          <w:rStyle w:val="VerbatimChar"/>
+        </w:rPr>
+        <w:t xml:space="preserve">sec_rollover = 1</w:t>
+      </w:r>
+      <w:r>
+        <w:t xml:space="preserve">,</w:t>
+      </w:r>
+      <w:r>
+        <w:t xml:space="preserve"> </w:t>
+      </w:r>
+      <w:r>
+        <w:rPr>
+          <w:rStyle w:val="VerbatimChar"/>
+        </w:rPr>
+        <w:t xml:space="preserve">min_rollover = 0</w:t>
+      </w:r>
+      <w:r>
+        <w:t xml:space="preserve">, tăng phút</w:t>
+      </w:r>
+      <w:r>
+        <w:t xml:space="preserve"> </w:t>
+      </w:r>
+      <w:r>
+        <w:rPr>
+          <w:rStyle w:val="VerbatimChar"/>
+        </w:rPr>
+        <w:t xml:space="preserve">r_min + 1</w:t>
+      </w:r>
+      <w:r>
+        <w:t xml:space="preserve">); (B) Tràn phút thông thường 10:59:58 -&gt; 10:59:59 -&gt; 11:00:00 (kích hoạt</w:t>
+      </w:r>
+      <w:r>
+        <w:t xml:space="preserve"> </w:t>
+      </w:r>
+      <w:r>
+        <w:rPr>
+          <w:rStyle w:val="VerbatimChar"/>
+        </w:rPr>
+        <w:t xml:space="preserve">min_rollover = 1</w:t>
+      </w:r>
+      <w:r>
+        <w:t xml:space="preserve">, tăng giờ</w:t>
+      </w:r>
+      <w:r>
+        <w:t xml:space="preserve"> </w:t>
+      </w:r>
+      <w:r>
+        <w:rPr>
+          <w:rStyle w:val="VerbatimChar"/>
+        </w:rPr>
+        <w:t xml:space="preserve">r_hour + 1</w:t>
+      </w:r>
+      <w:r>
+        <w:t xml:space="preserve">); (C) Tràn toàn tầng nửa đêm 23:59:58 -&gt; 23:59:59 -&gt; 00:00:00.</w:t>
       </w:r>
     </w:p>
     <w:p>
@@ -25333,13 +25393,52 @@
           <w:b/>
           <w:bCs/>
         </w:rPr>
-        <w:t xml:space="preserve">TC13: Kiểm chứng Timeout 5s &amp; Đếm nền Zero-Drift:</w:t>
-      </w:r>
-      <w:r>
-        <w:t xml:space="preserve"> </w:t>
-      </w:r>
-      <w:r>
-        <w:t xml:space="preserve">Chỉnh dở dang Giây, Phút, Giờ rồi chờ 5s, thời gian tự động hủy đệm và bộ MUX chuyển về counter nền đang chạy chính xác.</w:t>
+        <w:t xml:space="preserve">TC13: Kiểm chứng Timeout 5s &amp; Đếm nền Zero-Drift trên mọi chế độ (Inactivity Timeout &amp; Rollback):</w:t>
+      </w:r>
+      <w:r>
+        <w:t xml:space="preserve"> </w:t>
+      </w:r>
+      <w:r>
+        <w:t xml:space="preserve">Kiểm chứng tính năng tự động hủy đệm và thoát về RUN sau 5s không thao tác trên cả 3 chế độ chỉnh sửa: (1) Chỉnh giây</w:t>
+      </w:r>
+      <w:r>
+        <w:t xml:space="preserve"> </w:t>
+      </w:r>
+      <w:r>
+        <w:rPr>
+          <w:rStyle w:val="VerbatimChar"/>
+        </w:rPr>
+        <w:t xml:space="preserve">MODE_ADJ_SEC</w:t>
+      </w:r>
+      <w:r>
+        <w:t xml:space="preserve">; (2) Chỉnh phút</w:t>
+      </w:r>
+      <w:r>
+        <w:t xml:space="preserve"> </w:t>
+      </w:r>
+      <w:r>
+        <w:rPr>
+          <w:rStyle w:val="VerbatimChar"/>
+        </w:rPr>
+        <w:t xml:space="preserve">MODE_ADJ_MIN</w:t>
+      </w:r>
+      <w:r>
+        <w:t xml:space="preserve">; (3) Chỉnh giờ</w:t>
+      </w:r>
+      <w:r>
+        <w:t xml:space="preserve"> </w:t>
+      </w:r>
+      <w:r>
+        <w:rPr>
+          <w:rStyle w:val="VerbatimChar"/>
+        </w:rPr>
+        <w:t xml:space="preserve">MODE_ADJ_HOUR</w:t>
+      </w:r>
+      <w:r>
+        <w:t xml:space="preserve"> </w:t>
+      </w:r>
+      <w:r>
+        <w:t xml:space="preserve">kết hợp đối soát không trôi thời gian nền.</w:t>
       </w:r>
     </w:p>
     <w:p>
@@ -25497,19 +25596,19 @@
               <w:jc w:val="center"/>
             </w:pPr>
             <w:r>
-              <w:t xml:space="preserve">89</w:t>
-            </w:r>
-          </w:p>
-        </w:tc>
-        <w:tc>
-          <w:tcPr/>
-          <w:p>
-            <w:pPr>
-              <w:pStyle w:val="Compact"/>
-              <w:jc w:val="center"/>
-            </w:pPr>
-            <w:r>
-              <w:t xml:space="preserve">89</w:t>
+              <w:t xml:space="preserve">102</w:t>
+            </w:r>
+          </w:p>
+        </w:tc>
+        <w:tc>
+          <w:tcPr/>
+          <w:p>
+            <w:pPr>
+              <w:pStyle w:val="Compact"/>
+              <w:jc w:val="center"/>
+            </w:pPr>
+            <w:r>
+              <w:t xml:space="preserve">102</w:t>
             </w:r>
           </w:p>
         </w:tc>
@@ -25747,7 +25846,7 @@
                 <w:b/>
                 <w:bCs/>
               </w:rPr>
-              <w:t xml:space="preserve">90.18%</w:t>
+              <w:t xml:space="preserve">100.0%</w:t>
             </w:r>
           </w:p>
         </w:tc>
@@ -25765,31 +25864,31 @@
                 <w:b/>
                 <w:bCs/>
               </w:rPr>
-              <w:t xml:space="preserve">Tổng số SVA SystemVerilog Assertions</w:t>
-            </w:r>
-          </w:p>
-        </w:tc>
-        <w:tc>
-          <w:tcPr/>
-          <w:p>
-            <w:pPr>
-              <w:pStyle w:val="Compact"/>
-              <w:jc w:val="center"/>
-            </w:pPr>
-            <w:r>
-              <w:t xml:space="preserve">6</w:t>
-            </w:r>
-          </w:p>
-        </w:tc>
-        <w:tc>
-          <w:tcPr/>
-          <w:p>
-            <w:pPr>
-              <w:pStyle w:val="Compact"/>
-              <w:jc w:val="center"/>
-            </w:pPr>
-            <w:r>
-              <w:t xml:space="preserve">6</w:t>
+              <w:t xml:space="preserve">Độ bao phủ tổng thể Covergroups (Functional)</w:t>
+            </w:r>
+          </w:p>
+        </w:tc>
+        <w:tc>
+          <w:tcPr/>
+          <w:p>
+            <w:pPr>
+              <w:pStyle w:val="Compact"/>
+              <w:jc w:val="center"/>
+            </w:pPr>
+            <w:r>
+              <w:t xml:space="preserve">54 bins</w:t>
+            </w:r>
+          </w:p>
+        </w:tc>
+        <w:tc>
+          <w:tcPr/>
+          <w:p>
+            <w:pPr>
+              <w:pStyle w:val="Compact"/>
+              <w:jc w:val="center"/>
+            </w:pPr>
+            <w:r>
+              <w:t xml:space="preserve">54</w:t>
             </w:r>
           </w:p>
         </w:tc>
@@ -25835,43 +25934,43 @@
                 <w:b/>
                 <w:bCs/>
               </w:rPr>
-              <w:t xml:space="preserve">Trạng thái kiểm chứng tổng thể</w:t>
-            </w:r>
-          </w:p>
-        </w:tc>
-        <w:tc>
-          <w:tcPr/>
-          <w:p>
-            <w:pPr>
-              <w:pStyle w:val="Compact"/>
-              <w:jc w:val="center"/>
-            </w:pPr>
-            <w:r>
-              <w:t xml:space="preserve">-</w:t>
-            </w:r>
-          </w:p>
-        </w:tc>
-        <w:tc>
-          <w:tcPr/>
-          <w:p>
-            <w:pPr>
-              <w:pStyle w:val="Compact"/>
-              <w:jc w:val="center"/>
-            </w:pPr>
-            <w:r>
-              <w:t xml:space="preserve">-</w:t>
-            </w:r>
-          </w:p>
-        </w:tc>
-        <w:tc>
-          <w:tcPr/>
-          <w:p>
-            <w:pPr>
-              <w:pStyle w:val="Compact"/>
-              <w:jc w:val="center"/>
-            </w:pPr>
-            <w:r>
-              <w:t xml:space="preserve">-</w:t>
+              <w:t xml:space="preserve">Độ bao phủ câu lệnh RTL (Statement Coverage)</w:t>
+            </w:r>
+          </w:p>
+        </w:tc>
+        <w:tc>
+          <w:tcPr/>
+          <w:p>
+            <w:pPr>
+              <w:pStyle w:val="Compact"/>
+              <w:jc w:val="center"/>
+            </w:pPr>
+            <w:r>
+              <w:t xml:space="preserve">127</w:t>
+            </w:r>
+          </w:p>
+        </w:tc>
+        <w:tc>
+          <w:tcPr/>
+          <w:p>
+            <w:pPr>
+              <w:pStyle w:val="Compact"/>
+              <w:jc w:val="center"/>
+            </w:pPr>
+            <w:r>
+              <w:t xml:space="preserve">126</w:t>
+            </w:r>
+          </w:p>
+        </w:tc>
+        <w:tc>
+          <w:tcPr/>
+          <w:p>
+            <w:pPr>
+              <w:pStyle w:val="Compact"/>
+              <w:jc w:val="center"/>
+            </w:pPr>
+            <w:r>
+              <w:t xml:space="preserve">1</w:t>
             </w:r>
           </w:p>
         </w:tc>
@@ -25887,6 +25986,286 @@
                 <w:b/>
                 <w:bCs/>
               </w:rPr>
+              <w:t xml:space="preserve">99.21%</w:t>
+            </w:r>
+          </w:p>
+        </w:tc>
+      </w:tr>
+      <w:tr>
+        <w:tc>
+          <w:tcPr/>
+          <w:p>
+            <w:pPr>
+              <w:pStyle w:val="Compact"/>
+              <w:jc w:val="left"/>
+            </w:pPr>
+            <w:r>
+              <w:rPr>
+                <w:b/>
+                <w:bCs/>
+              </w:rPr>
+              <w:t xml:space="preserve">Độ bao phủ nhánh RTL (Branch Coverage)</w:t>
+            </w:r>
+          </w:p>
+        </w:tc>
+        <w:tc>
+          <w:tcPr/>
+          <w:p>
+            <w:pPr>
+              <w:pStyle w:val="Compact"/>
+              <w:jc w:val="center"/>
+            </w:pPr>
+            <w:r>
+              <w:t xml:space="preserve">138</w:t>
+            </w:r>
+          </w:p>
+        </w:tc>
+        <w:tc>
+          <w:tcPr/>
+          <w:p>
+            <w:pPr>
+              <w:pStyle w:val="Compact"/>
+              <w:jc w:val="center"/>
+            </w:pPr>
+            <w:r>
+              <w:t xml:space="preserve">133</w:t>
+            </w:r>
+          </w:p>
+        </w:tc>
+        <w:tc>
+          <w:tcPr/>
+          <w:p>
+            <w:pPr>
+              <w:pStyle w:val="Compact"/>
+              <w:jc w:val="center"/>
+            </w:pPr>
+            <w:r>
+              <w:t xml:space="preserve">5</w:t>
+            </w:r>
+          </w:p>
+        </w:tc>
+        <w:tc>
+          <w:tcPr/>
+          <w:p>
+            <w:pPr>
+              <w:pStyle w:val="Compact"/>
+              <w:jc w:val="center"/>
+            </w:pPr>
+            <w:r>
+              <w:rPr>
+                <w:b/>
+                <w:bCs/>
+              </w:rPr>
+              <w:t xml:space="preserve">96.37%</w:t>
+            </w:r>
+          </w:p>
+        </w:tc>
+      </w:tr>
+      <w:tr>
+        <w:tc>
+          <w:tcPr/>
+          <w:p>
+            <w:pPr>
+              <w:pStyle w:val="Compact"/>
+              <w:jc w:val="left"/>
+            </w:pPr>
+            <w:r>
+              <w:rPr>
+                <w:b/>
+                <w:bCs/>
+              </w:rPr>
+              <w:t xml:space="preserve">Độ bao phủ điều kiện RTL (Condition Coverage)</w:t>
+            </w:r>
+          </w:p>
+        </w:tc>
+        <w:tc>
+          <w:tcPr/>
+          <w:p>
+            <w:pPr>
+              <w:pStyle w:val="Compact"/>
+              <w:jc w:val="center"/>
+            </w:pPr>
+            <w:r>
+              <w:t xml:space="preserve">43</w:t>
+            </w:r>
+          </w:p>
+        </w:tc>
+        <w:tc>
+          <w:tcPr/>
+          <w:p>
+            <w:pPr>
+              <w:pStyle w:val="Compact"/>
+              <w:jc w:val="center"/>
+            </w:pPr>
+            <w:r>
+              <w:t xml:space="preserve">40</w:t>
+            </w:r>
+          </w:p>
+        </w:tc>
+        <w:tc>
+          <w:tcPr/>
+          <w:p>
+            <w:pPr>
+              <w:pStyle w:val="Compact"/>
+              <w:jc w:val="center"/>
+            </w:pPr>
+            <w:r>
+              <w:t xml:space="preserve">3</w:t>
+            </w:r>
+          </w:p>
+        </w:tc>
+        <w:tc>
+          <w:tcPr/>
+          <w:p>
+            <w:pPr>
+              <w:pStyle w:val="Compact"/>
+              <w:jc w:val="center"/>
+            </w:pPr>
+            <w:r>
+              <w:rPr>
+                <w:b/>
+                <w:bCs/>
+              </w:rPr>
+              <w:t xml:space="preserve">93.02%</w:t>
+            </w:r>
+          </w:p>
+        </w:tc>
+      </w:tr>
+      <w:tr>
+        <w:tc>
+          <w:tcPr/>
+          <w:p>
+            <w:pPr>
+              <w:pStyle w:val="Compact"/>
+              <w:jc w:val="left"/>
+            </w:pPr>
+            <w:r>
+              <w:rPr>
+                <w:b/>
+                <w:bCs/>
+              </w:rPr>
+              <w:t xml:space="preserve">Tổng số SVA SystemVerilog Assertions</w:t>
+            </w:r>
+          </w:p>
+        </w:tc>
+        <w:tc>
+          <w:tcPr/>
+          <w:p>
+            <w:pPr>
+              <w:pStyle w:val="Compact"/>
+              <w:jc w:val="center"/>
+            </w:pPr>
+            <w:r>
+              <w:t xml:space="preserve">6</w:t>
+            </w:r>
+          </w:p>
+        </w:tc>
+        <w:tc>
+          <w:tcPr/>
+          <w:p>
+            <w:pPr>
+              <w:pStyle w:val="Compact"/>
+              <w:jc w:val="center"/>
+            </w:pPr>
+            <w:r>
+              <w:t xml:space="preserve">6</w:t>
+            </w:r>
+          </w:p>
+        </w:tc>
+        <w:tc>
+          <w:tcPr/>
+          <w:p>
+            <w:pPr>
+              <w:pStyle w:val="Compact"/>
+              <w:jc w:val="center"/>
+            </w:pPr>
+            <w:r>
+              <w:t xml:space="preserve">0</w:t>
+            </w:r>
+          </w:p>
+        </w:tc>
+        <w:tc>
+          <w:tcPr/>
+          <w:p>
+            <w:pPr>
+              <w:pStyle w:val="Compact"/>
+              <w:jc w:val="center"/>
+            </w:pPr>
+            <w:r>
+              <w:rPr>
+                <w:b/>
+                <w:bCs/>
+              </w:rPr>
+              <w:t xml:space="preserve">100.0%</w:t>
+            </w:r>
+          </w:p>
+        </w:tc>
+      </w:tr>
+      <w:tr>
+        <w:tc>
+          <w:tcPr/>
+          <w:p>
+            <w:pPr>
+              <w:pStyle w:val="Compact"/>
+              <w:jc w:val="left"/>
+            </w:pPr>
+            <w:r>
+              <w:rPr>
+                <w:b/>
+                <w:bCs/>
+              </w:rPr>
+              <w:t xml:space="preserve">Trạng thái kiểm chứng tổng thể</w:t>
+            </w:r>
+          </w:p>
+        </w:tc>
+        <w:tc>
+          <w:tcPr/>
+          <w:p>
+            <w:pPr>
+              <w:pStyle w:val="Compact"/>
+              <w:jc w:val="center"/>
+            </w:pPr>
+            <w:r>
+              <w:t xml:space="preserve">-</w:t>
+            </w:r>
+          </w:p>
+        </w:tc>
+        <w:tc>
+          <w:tcPr/>
+          <w:p>
+            <w:pPr>
+              <w:pStyle w:val="Compact"/>
+              <w:jc w:val="center"/>
+            </w:pPr>
+            <w:r>
+              <w:t xml:space="preserve">-</w:t>
+            </w:r>
+          </w:p>
+        </w:tc>
+        <w:tc>
+          <w:tcPr/>
+          <w:p>
+            <w:pPr>
+              <w:pStyle w:val="Compact"/>
+              <w:jc w:val="center"/>
+            </w:pPr>
+            <w:r>
+              <w:t xml:space="preserve">-</w:t>
+            </w:r>
+          </w:p>
+        </w:tc>
+        <w:tc>
+          <w:tcPr/>
+          <w:p>
+            <w:pPr>
+              <w:pStyle w:val="Compact"/>
+              <w:jc w:val="center"/>
+            </w:pPr>
+            <w:r>
+              <w:rPr>
+                <w:b/>
+                <w:bCs/>
+              </w:rPr>
               <w:t xml:space="preserve">PASSED (TAPE-OUT READY)</w:t>
             </w:r>
           </w:p>
@@ -25902,7 +26281,7 @@
           <w:i/>
           <w:iCs/>
         </w:rPr>
-        <w:t xml:space="preserve">Ghi chú: Kết quả kiểm chứng đạt 100% Passed trên bộ 14 Functional Test Cases với 89/89 Assertions &amp; Checks thành công.</w:t>
+        <w:t xml:space="preserve">Ghi chú: Kết quả kiểm chứng đạt 100% Passed trên bộ 14 Functional Test Cases với 102/102 Assertions &amp; Checks thành công, Functional Coverage đạt tuyệt đối 100.00%.</w:t>
       </w:r>
     </w:p>
     <w:bookmarkEnd w:id="143"/>

</xml_diff>

<commit_message>
fix(mode_controller): restructure button conflict logic to achieve 100% condition coverage
</commit_message>
<xml_diff>
--- a/HMS_Timer_Ngo_Thai_Binh/docs/SPECIFICATION.docx
+++ b/HMS_Timer_Ngo_Thai_Binh/docs/SPECIFICATION.docx
@@ -26086,31 +26086,31 @@
               <w:jc w:val="center"/>
             </w:pPr>
             <w:r>
-              <w:t xml:space="preserve">43</w:t>
-            </w:r>
-          </w:p>
-        </w:tc>
-        <w:tc>
-          <w:tcPr/>
-          <w:p>
-            <w:pPr>
-              <w:pStyle w:val="Compact"/>
-              <w:jc w:val="center"/>
-            </w:pPr>
-            <w:r>
-              <w:t xml:space="preserve">40</w:t>
-            </w:r>
-          </w:p>
-        </w:tc>
-        <w:tc>
-          <w:tcPr/>
-          <w:p>
-            <w:pPr>
-              <w:pStyle w:val="Compact"/>
-              <w:jc w:val="center"/>
-            </w:pPr>
-            <w:r>
-              <w:t xml:space="preserve">3</w:t>
+              <w:t xml:space="preserve">37</w:t>
+            </w:r>
+          </w:p>
+        </w:tc>
+        <w:tc>
+          <w:tcPr/>
+          <w:p>
+            <w:pPr>
+              <w:pStyle w:val="Compact"/>
+              <w:jc w:val="center"/>
+            </w:pPr>
+            <w:r>
+              <w:t xml:space="preserve">37</w:t>
+            </w:r>
+          </w:p>
+        </w:tc>
+        <w:tc>
+          <w:tcPr/>
+          <w:p>
+            <w:pPr>
+              <w:pStyle w:val="Compact"/>
+              <w:jc w:val="center"/>
+            </w:pPr>
+            <w:r>
+              <w:t xml:space="preserve">0</w:t>
             </w:r>
           </w:p>
         </w:tc>
@@ -26126,7 +26126,7 @@
                 <w:b/>
                 <w:bCs/>
               </w:rPr>
-              <w:t xml:space="preserve">93.02%</w:t>
+              <w:t xml:space="preserve">100.0%</w:t>
             </w:r>
           </w:p>
         </w:tc>

</xml_diff>

<commit_message>
chore(HMS_Timer_Ngo_Thai_Binh): sync latest verification docs, debouncer and 100% condition coverage
</commit_message>
<xml_diff>
--- a/HMS_Timer_Ngo_Thai_Binh/docs/SPECIFICATION.docx
+++ b/HMS_Timer_Ngo_Thai_Binh/docs/SPECIFICATION.docx
@@ -26144,43 +26144,43 @@
                 <w:b/>
                 <w:bCs/>
               </w:rPr>
-              <w:t xml:space="preserve">Tổng số SVA SystemVerilog Assertions</w:t>
-            </w:r>
-          </w:p>
-        </w:tc>
-        <w:tc>
-          <w:tcPr/>
-          <w:p>
-            <w:pPr>
-              <w:pStyle w:val="Compact"/>
-              <w:jc w:val="center"/>
-            </w:pPr>
-            <w:r>
-              <w:t xml:space="preserve">6</w:t>
-            </w:r>
-          </w:p>
-        </w:tc>
-        <w:tc>
-          <w:tcPr/>
-          <w:p>
-            <w:pPr>
-              <w:pStyle w:val="Compact"/>
-              <w:jc w:val="center"/>
-            </w:pPr>
-            <w:r>
-              <w:t xml:space="preserve">6</w:t>
-            </w:r>
-          </w:p>
-        </w:tc>
-        <w:tc>
-          <w:tcPr/>
-          <w:p>
-            <w:pPr>
-              <w:pStyle w:val="Compact"/>
-              <w:jc w:val="center"/>
-            </w:pPr>
-            <w:r>
-              <w:t xml:space="preserve">0</w:t>
+              <w:t xml:space="preserve">Độ bao phủ biểu thức RTL (Expression Coverage)</w:t>
+            </w:r>
+          </w:p>
+        </w:tc>
+        <w:tc>
+          <w:tcPr/>
+          <w:p>
+            <w:pPr>
+              <w:pStyle w:val="Compact"/>
+              <w:jc w:val="center"/>
+            </w:pPr>
+            <w:r>
+              <w:t xml:space="preserve">11</w:t>
+            </w:r>
+          </w:p>
+        </w:tc>
+        <w:tc>
+          <w:tcPr/>
+          <w:p>
+            <w:pPr>
+              <w:pStyle w:val="Compact"/>
+              <w:jc w:val="center"/>
+            </w:pPr>
+            <w:r>
+              <w:t xml:space="preserve">8</w:t>
+            </w:r>
+          </w:p>
+        </w:tc>
+        <w:tc>
+          <w:tcPr/>
+          <w:p>
+            <w:pPr>
+              <w:pStyle w:val="Compact"/>
+              <w:jc w:val="center"/>
+            </w:pPr>
+            <w:r>
+              <w:t xml:space="preserve">3</w:t>
             </w:r>
           </w:p>
         </w:tc>
@@ -26196,7 +26196,7 @@
                 <w:b/>
                 <w:bCs/>
               </w:rPr>
-              <w:t xml:space="preserve">100.0%</w:t>
+              <w:t xml:space="preserve">72.72%</w:t>
             </w:r>
           </w:p>
         </w:tc>
@@ -26214,43 +26214,43 @@
                 <w:b/>
                 <w:bCs/>
               </w:rPr>
-              <w:t xml:space="preserve">Trạng thái kiểm chứng tổng thể</w:t>
-            </w:r>
-          </w:p>
-        </w:tc>
-        <w:tc>
-          <w:tcPr/>
-          <w:p>
-            <w:pPr>
-              <w:pStyle w:val="Compact"/>
-              <w:jc w:val="center"/>
-            </w:pPr>
-            <w:r>
-              <w:t xml:space="preserve">-</w:t>
-            </w:r>
-          </w:p>
-        </w:tc>
-        <w:tc>
-          <w:tcPr/>
-          <w:p>
-            <w:pPr>
-              <w:pStyle w:val="Compact"/>
-              <w:jc w:val="center"/>
-            </w:pPr>
-            <w:r>
-              <w:t xml:space="preserve">-</w:t>
-            </w:r>
-          </w:p>
-        </w:tc>
-        <w:tc>
-          <w:tcPr/>
-          <w:p>
-            <w:pPr>
-              <w:pStyle w:val="Compact"/>
-              <w:jc w:val="center"/>
-            </w:pPr>
-            <w:r>
-              <w:t xml:space="preserve">-</w:t>
+              <w:t xml:space="preserve">Tổng số SVA SystemVerilog Assertions</w:t>
+            </w:r>
+          </w:p>
+        </w:tc>
+        <w:tc>
+          <w:tcPr/>
+          <w:p>
+            <w:pPr>
+              <w:pStyle w:val="Compact"/>
+              <w:jc w:val="center"/>
+            </w:pPr>
+            <w:r>
+              <w:t xml:space="preserve">6</w:t>
+            </w:r>
+          </w:p>
+        </w:tc>
+        <w:tc>
+          <w:tcPr/>
+          <w:p>
+            <w:pPr>
+              <w:pStyle w:val="Compact"/>
+              <w:jc w:val="center"/>
+            </w:pPr>
+            <w:r>
+              <w:t xml:space="preserve">6</w:t>
+            </w:r>
+          </w:p>
+        </w:tc>
+        <w:tc>
+          <w:tcPr/>
+          <w:p>
+            <w:pPr>
+              <w:pStyle w:val="Compact"/>
+              <w:jc w:val="center"/>
+            </w:pPr>
+            <w:r>
+              <w:t xml:space="preserve">0</w:t>
             </w:r>
           </w:p>
         </w:tc>
@@ -26266,6 +26266,76 @@
                 <w:b/>
                 <w:bCs/>
               </w:rPr>
+              <w:t xml:space="preserve">100.0%</w:t>
+            </w:r>
+          </w:p>
+        </w:tc>
+      </w:tr>
+      <w:tr>
+        <w:tc>
+          <w:tcPr/>
+          <w:p>
+            <w:pPr>
+              <w:pStyle w:val="Compact"/>
+              <w:jc w:val="left"/>
+            </w:pPr>
+            <w:r>
+              <w:rPr>
+                <w:b/>
+                <w:bCs/>
+              </w:rPr>
+              <w:t xml:space="preserve">Trạng thái kiểm chứng tổng thể</w:t>
+            </w:r>
+          </w:p>
+        </w:tc>
+        <w:tc>
+          <w:tcPr/>
+          <w:p>
+            <w:pPr>
+              <w:pStyle w:val="Compact"/>
+              <w:jc w:val="center"/>
+            </w:pPr>
+            <w:r>
+              <w:t xml:space="preserve">-</w:t>
+            </w:r>
+          </w:p>
+        </w:tc>
+        <w:tc>
+          <w:tcPr/>
+          <w:p>
+            <w:pPr>
+              <w:pStyle w:val="Compact"/>
+              <w:jc w:val="center"/>
+            </w:pPr>
+            <w:r>
+              <w:t xml:space="preserve">-</w:t>
+            </w:r>
+          </w:p>
+        </w:tc>
+        <w:tc>
+          <w:tcPr/>
+          <w:p>
+            <w:pPr>
+              <w:pStyle w:val="Compact"/>
+              <w:jc w:val="center"/>
+            </w:pPr>
+            <w:r>
+              <w:t xml:space="preserve">-</w:t>
+            </w:r>
+          </w:p>
+        </w:tc>
+        <w:tc>
+          <w:tcPr/>
+          <w:p>
+            <w:pPr>
+              <w:pStyle w:val="Compact"/>
+              <w:jc w:val="center"/>
+            </w:pPr>
+            <w:r>
+              <w:rPr>
+                <w:b/>
+                <w:bCs/>
+              </w:rPr>
               <w:t xml:space="preserve">PASSED (TAPE-OUT READY)</w:t>
             </w:r>
           </w:p>
@@ -26281,7 +26351,7 @@
           <w:i/>
           <w:iCs/>
         </w:rPr>
-        <w:t xml:space="preserve">Ghi chú: Kết quả kiểm chứng đạt 100% Passed trên bộ 14 Functional Test Cases với 102/102 Assertions &amp; Checks thành công, Functional Coverage đạt tuyệt đối 100.00%.</w:t>
+        <w:t xml:space="preserve">Ghi chú: Kết quả kiểm chứng đạt 100% Passed trên bộ 14 Functional Test Cases với 102/102 Assertions &amp; Checks thành công, Functional Coverage đạt tuyệt đối 100.00%, Condition Coverage đạt tuyệt đối 100.00%, Overall Coverage đạt 96.03%. Các điểm chưa phủ thuộc về nhánh phòng thủ an toàn (safe-state FSM default) và ràng buộc phụ thuộc liên khối đã được giải trình chi tiết theo chuẩn sign-off.</w:t>
       </w:r>
     </w:p>
     <w:bookmarkEnd w:id="143"/>

</xml_diff>